<commit_message>
Update Learn Card Buttons, Popup Menu for card set, update document
</commit_message>
<xml_diff>
--- a/Document/Phiếu giao đề tài_K16_Nguyễn Trung Nghĩa_2021601003.docx
+++ b/Document/Phiếu giao đề tài_K16_Nguyễn Trung Nghĩa_2021601003.docx
@@ -1,6 +1,6 @@
 
 <file path=word/document.xml><?xml version="1.0" encoding="utf-8"?>
-<w:document xmlns:wpc="http://schemas.microsoft.com/office/word/2010/wordprocessingCanvas" xmlns:cx="http://schemas.microsoft.com/office/drawing/2014/chartex" xmlns:cx1="http://schemas.microsoft.com/office/drawing/2015/9/8/chartex" xmlns:cx2="http://schemas.microsoft.com/office/drawing/2015/10/21/chartex" xmlns:cx3="http://schemas.microsoft.com/office/drawing/2016/5/9/chartex" xmlns:cx4="http://schemas.microsoft.com/office/drawing/2016/5/10/chartex" xmlns:cx5="http://schemas.microsoft.com/office/drawing/2016/5/11/chartex" xmlns:cx6="http://schemas.microsoft.com/office/drawing/2016/5/12/chartex" xmlns:cx7="http://schemas.microsoft.com/office/drawing/2016/5/13/chartex" xmlns:cx8="http://schemas.microsoft.com/office/drawing/2016/5/14/chartex" xmlns:mc="http://schemas.openxmlformats.org/markup-compatibility/2006" xmlns:aink="http://schemas.microsoft.com/office/drawing/2016/ink" xmlns:am3d="http://schemas.microsoft.com/office/drawing/2017/model3d" xmlns:o="urn:schemas-microsoft-com:office:office" xmlns:oel="http://schemas.microsoft.com/office/2019/extlst" xmlns:r="http://schemas.openxmlformats.org/officeDocument/2006/relationships" xmlns:m="http://schemas.openxmlformats.org/officeDocument/2006/math" xmlns:v="urn:schemas-microsoft-com:vml" xmlns:wp14="http://schemas.microsoft.com/office/word/2010/wordprocessingDrawing" xmlns:wp="http://schemas.openxmlformats.org/drawingml/2006/wordprocessingDrawing" xmlns:w10="urn:schemas-microsoft-com:office:word" xmlns:w="http://schemas.openxmlformats.org/wordprocessingml/2006/main" xmlns:w14="http://schemas.microsoft.com/office/word/2010/wordml" xmlns:w15="http://schemas.microsoft.com/office/word/2012/wordml" xmlns:w16cex="http://schemas.microsoft.com/office/word/2018/wordml/cex" xmlns:w16cid="http://schemas.microsoft.com/office/word/2016/wordml/cid" xmlns:w16="http://schemas.microsoft.com/office/word/2018/wordml" xmlns:w16du="http://schemas.microsoft.com/office/word/2023/wordml/word16du" xmlns:w16sdtdh="http://schemas.microsoft.com/office/word/2020/wordml/sdtdatahash" xmlns:w16sdtfl="http://schemas.microsoft.com/office/word/2024/wordml/sdtformatlock" xmlns:w16se="http://schemas.microsoft.com/office/word/2015/wordml/symex" xmlns:wpg="http://schemas.microsoft.com/office/word/2010/wordprocessingGroup" xmlns:wpi="http://schemas.microsoft.com/office/word/2010/wordprocessingInk" xmlns:wne="http://schemas.microsoft.com/office/word/2006/wordml" xmlns:wps="http://schemas.microsoft.com/office/word/2010/wordprocessingShape" mc:Ignorable="w14 w15 w16se w16cid w16 w16cex w16sdtdh w16sdtfl w16du wp14">
+<w:document xmlns:wpc="http://schemas.microsoft.com/office/word/2010/wordprocessingCanvas" xmlns:mc="http://schemas.openxmlformats.org/markup-compatibility/2006" xmlns:o="urn:schemas-microsoft-com:office:office" xmlns:r="http://schemas.openxmlformats.org/officeDocument/2006/relationships" xmlns:m="http://schemas.openxmlformats.org/officeDocument/2006/math" xmlns:v="urn:schemas-microsoft-com:vml" xmlns:wp14="http://schemas.microsoft.com/office/word/2010/wordprocessingDrawing" xmlns:wp="http://schemas.openxmlformats.org/drawingml/2006/wordprocessingDrawing" xmlns:w10="urn:schemas-microsoft-com:office:word" xmlns:w="http://schemas.openxmlformats.org/wordprocessingml/2006/main" xmlns:w14="http://schemas.microsoft.com/office/word/2010/wordml" xmlns:w15="http://schemas.microsoft.com/office/word/2012/wordml" xmlns:wpg="http://schemas.microsoft.com/office/word/2010/wordprocessingGroup" xmlns:wpi="http://schemas.microsoft.com/office/word/2010/wordprocessingInk" xmlns:wne="http://schemas.microsoft.com/office/word/2006/wordml" xmlns:wps="http://schemas.microsoft.com/office/word/2010/wordprocessingShape" mc:Ignorable="w14 w15 wp14">
   <w:body>
     <w:tbl>
       <w:tblPr>
@@ -142,7 +142,7 @@
                     </wp:anchor>
                   </w:drawing>
                 </mc:Choice>
-                <mc:Fallback>
+                <mc:Fallback xmlns:w16se="http://schemas.microsoft.com/office/word/2015/wordml/symex" xmlns:w16sdtfl="http://schemas.microsoft.com/office/word/2024/wordml/sdtformatlock" xmlns:w16sdtdh="http://schemas.microsoft.com/office/word/2020/wordml/sdtdatahash" xmlns:w16du="http://schemas.microsoft.com/office/word/2023/wordml/word16du" xmlns:w16="http://schemas.microsoft.com/office/word/2018/wordml" xmlns:w16cid="http://schemas.microsoft.com/office/word/2016/wordml/cid" xmlns:w16cex="http://schemas.microsoft.com/office/word/2018/wordml/cex" xmlns:oel="http://schemas.microsoft.com/office/2019/extlst" xmlns:am3d="http://schemas.microsoft.com/office/drawing/2017/model3d" xmlns:aink="http://schemas.microsoft.com/office/drawing/2016/ink" xmlns:cx8="http://schemas.microsoft.com/office/drawing/2016/5/14/chartex" xmlns:cx7="http://schemas.microsoft.com/office/drawing/2016/5/13/chartex" xmlns:cx6="http://schemas.microsoft.com/office/drawing/2016/5/12/chartex" xmlns:cx5="http://schemas.microsoft.com/office/drawing/2016/5/11/chartex" xmlns:cx4="http://schemas.microsoft.com/office/drawing/2016/5/10/chartex" xmlns:cx3="http://schemas.microsoft.com/office/drawing/2016/5/9/chartex" xmlns:cx2="http://schemas.microsoft.com/office/drawing/2015/10/21/chartex" xmlns:cx1="http://schemas.microsoft.com/office/drawing/2015/9/8/chartex" xmlns:cx="http://schemas.microsoft.com/office/drawing/2014/chartex">
                   <w:pict>
                     <v:line w14:anchorId="692D4AB2" id="Straight Connector 5" o:spid="_x0000_s1026" style="position:absolute;z-index:251659264;visibility:visible;mso-wrap-style:square;mso-width-percent:0;mso-height-percent:0;mso-wrap-distance-left:9pt;mso-wrap-distance-top:-3e-5mm;mso-wrap-distance-right:9pt;mso-wrap-distance-bottom:-3e-5mm;mso-position-horizontal:absolute;mso-position-horizontal-relative:text;mso-position-vertical:absolute;mso-position-vertical-relative:text;mso-width-percent:0;mso-height-percent:0;mso-width-relative:page;mso-height-relative:page" from="50.75pt,1.7pt" to="180.65pt,1.7pt" o:gfxdata="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"/>
                   </w:pict>
@@ -215,6 +215,7 @@
                 <w:szCs w:val="28"/>
               </w:rPr>
             </w:pPr>
+            <w:proofErr w:type="spellStart"/>
             <w:r>
               <w:rPr>
                 <w:rFonts w:ascii="Times New Roman" w:hAnsi="Times New Roman"/>
@@ -223,8 +224,97 @@
                 <w:sz w:val="28"/>
                 <w:szCs w:val="28"/>
               </w:rPr>
-              <w:t>Độc lập - Tự do - Hạnh phúc</w:t>
-            </w:r>
+              <w:t>Độc</w:t>
+            </w:r>
+            <w:proofErr w:type="spellEnd"/>
+            <w:r>
+              <w:rPr>
+                <w:rFonts w:ascii="Times New Roman" w:hAnsi="Times New Roman"/>
+                <w:b/>
+                <w:bCs/>
+                <w:sz w:val="28"/>
+                <w:szCs w:val="28"/>
+              </w:rPr>
+              <w:t xml:space="preserve"> </w:t>
+            </w:r>
+            <w:proofErr w:type="spellStart"/>
+            <w:r>
+              <w:rPr>
+                <w:rFonts w:ascii="Times New Roman" w:hAnsi="Times New Roman"/>
+                <w:b/>
+                <w:bCs/>
+                <w:sz w:val="28"/>
+                <w:szCs w:val="28"/>
+              </w:rPr>
+              <w:t>lập</w:t>
+            </w:r>
+            <w:proofErr w:type="spellEnd"/>
+            <w:r>
+              <w:rPr>
+                <w:rFonts w:ascii="Times New Roman" w:hAnsi="Times New Roman"/>
+                <w:b/>
+                <w:bCs/>
+                <w:sz w:val="28"/>
+                <w:szCs w:val="28"/>
+              </w:rPr>
+              <w:t xml:space="preserve"> - </w:t>
+            </w:r>
+            <w:proofErr w:type="spellStart"/>
+            <w:r>
+              <w:rPr>
+                <w:rFonts w:ascii="Times New Roman" w:hAnsi="Times New Roman"/>
+                <w:b/>
+                <w:bCs/>
+                <w:sz w:val="28"/>
+                <w:szCs w:val="28"/>
+              </w:rPr>
+              <w:t>Tự</w:t>
+            </w:r>
+            <w:proofErr w:type="spellEnd"/>
+            <w:r>
+              <w:rPr>
+                <w:rFonts w:ascii="Times New Roman" w:hAnsi="Times New Roman"/>
+                <w:b/>
+                <w:bCs/>
+                <w:sz w:val="28"/>
+                <w:szCs w:val="28"/>
+              </w:rPr>
+              <w:t xml:space="preserve"> do - </w:t>
+            </w:r>
+            <w:proofErr w:type="spellStart"/>
+            <w:r>
+              <w:rPr>
+                <w:rFonts w:ascii="Times New Roman" w:hAnsi="Times New Roman"/>
+                <w:b/>
+                <w:bCs/>
+                <w:sz w:val="28"/>
+                <w:szCs w:val="28"/>
+              </w:rPr>
+              <w:t>Hạnh</w:t>
+            </w:r>
+            <w:proofErr w:type="spellEnd"/>
+            <w:r>
+              <w:rPr>
+                <w:rFonts w:ascii="Times New Roman" w:hAnsi="Times New Roman"/>
+                <w:b/>
+                <w:bCs/>
+                <w:sz w:val="28"/>
+                <w:szCs w:val="28"/>
+              </w:rPr>
+              <w:t xml:space="preserve"> </w:t>
+            </w:r>
+            <w:proofErr w:type="spellStart"/>
+            <w:r>
+              <w:rPr>
+                <w:rFonts w:ascii="Times New Roman" w:hAnsi="Times New Roman"/>
+                <w:b/>
+                <w:bCs/>
+                <w:sz w:val="28"/>
+                <w:szCs w:val="28"/>
+              </w:rPr>
+              <w:t>phúc</w:t>
+            </w:r>
+            <w:proofErr w:type="spellEnd"/>
           </w:p>
           <w:p>
             <w:pPr>
@@ -302,7 +392,7 @@
                     </wp:anchor>
                   </w:drawing>
                 </mc:Choice>
-                <mc:Fallback>
+                <mc:Fallback xmlns:w16se="http://schemas.microsoft.com/office/word/2015/wordml/symex" xmlns:w16sdtfl="http://schemas.microsoft.com/office/word/2024/wordml/sdtformatlock" xmlns:w16sdtdh="http://schemas.microsoft.com/office/word/2020/wordml/sdtdatahash" xmlns:w16du="http://schemas.microsoft.com/office/word/2023/wordml/word16du" xmlns:w16="http://schemas.microsoft.com/office/word/2018/wordml" xmlns:w16cid="http://schemas.microsoft.com/office/word/2016/wordml/cid" xmlns:w16cex="http://schemas.microsoft.com/office/word/2018/wordml/cex" xmlns:oel="http://schemas.microsoft.com/office/2019/extlst" xmlns:am3d="http://schemas.microsoft.com/office/drawing/2017/model3d" xmlns:aink="http://schemas.microsoft.com/office/drawing/2016/ink" xmlns:cx8="http://schemas.microsoft.com/office/drawing/2016/5/14/chartex" xmlns:cx7="http://schemas.microsoft.com/office/drawing/2016/5/13/chartex" xmlns:cx6="http://schemas.microsoft.com/office/drawing/2016/5/12/chartex" xmlns:cx5="http://schemas.microsoft.com/office/drawing/2016/5/11/chartex" xmlns:cx4="http://schemas.microsoft.com/office/drawing/2016/5/10/chartex" xmlns:cx3="http://schemas.microsoft.com/office/drawing/2016/5/9/chartex" xmlns:cx2="http://schemas.microsoft.com/office/drawing/2015/10/21/chartex" xmlns:cx1="http://schemas.microsoft.com/office/drawing/2015/9/8/chartex" xmlns:cx="http://schemas.microsoft.com/office/drawing/2014/chartex">
                   <w:pict>
                     <v:shapetype w14:anchorId="4E45F977" id="_x0000_t32" coordsize="21600,21600" o:spt="32" o:oned="t" path="m,l21600,21600e" filled="f">
                       <v:path arrowok="t" fillok="f" o:connecttype="none"/>
@@ -344,7 +434,27 @@
           <w:sz w:val="28"/>
           <w:szCs w:val="28"/>
         </w:rPr>
-        <w:t>PHIẾU GIAO ĐỀ TÀI ĐỒ ÁN TỐT NGHIỆP</w:t>
+        <w:t xml:space="preserve">PHIẾU GIAO ĐỀ TÀI ĐỒ </w:t>
+      </w:r>
+      <w:proofErr w:type="gramStart"/>
+      <w:r>
+        <w:rPr>
+          <w:rFonts w:ascii="Times New Roman" w:eastAsia="Times New Roman" w:hAnsi="Times New Roman"/>
+          <w:b/>
+          <w:sz w:val="28"/>
+          <w:szCs w:val="28"/>
+        </w:rPr>
+        <w:t>ÁN</w:t>
+      </w:r>
+      <w:proofErr w:type="gramEnd"/>
+      <w:r>
+        <w:rPr>
+          <w:rFonts w:ascii="Times New Roman" w:eastAsia="Times New Roman" w:hAnsi="Times New Roman"/>
+          <w:b/>
+          <w:sz w:val="28"/>
+          <w:szCs w:val="28"/>
+        </w:rPr>
+        <w:t xml:space="preserve"> TỐT NGHIỆP</w:t>
       </w:r>
     </w:p>
     <w:p>
@@ -361,37 +471,149 @@
           <w:szCs w:val="28"/>
         </w:rPr>
       </w:pPr>
-      <w:r>
-        <w:rPr>
-          <w:rFonts w:ascii="Times New Roman" w:eastAsia="Times New Roman" w:hAnsi="Times New Roman"/>
-          <w:sz w:val="28"/>
-          <w:szCs w:val="28"/>
-        </w:rPr>
-        <w:t xml:space="preserve">Họ tên sinh viên: </w:t>
-      </w:r>
-      <w:r>
-        <w:rPr>
-          <w:rFonts w:ascii="Times New Roman" w:eastAsia="Times New Roman" w:hAnsi="Times New Roman"/>
-          <w:sz w:val="28"/>
-          <w:szCs w:val="28"/>
-        </w:rPr>
-        <w:t xml:space="preserve">Nguyễn </w:t>
-      </w:r>
-      <w:r>
-        <w:rPr>
-          <w:rFonts w:ascii="Times New Roman" w:eastAsia="Times New Roman" w:hAnsi="Times New Roman"/>
-          <w:sz w:val="28"/>
-          <w:szCs w:val="28"/>
-        </w:rPr>
-        <w:t xml:space="preserve">Trung Nghĩa. </w:t>
-      </w:r>
-      <w:r>
-        <w:rPr>
-          <w:rFonts w:ascii="Times New Roman" w:eastAsia="Times New Roman" w:hAnsi="Times New Roman"/>
-          <w:sz w:val="28"/>
-          <w:szCs w:val="28"/>
-        </w:rPr>
-        <w:t>Mã SV:</w:t>
+      <w:proofErr w:type="spellStart"/>
+      <w:r>
+        <w:rPr>
+          <w:rFonts w:ascii="Times New Roman" w:eastAsia="Times New Roman" w:hAnsi="Times New Roman"/>
+          <w:sz w:val="28"/>
+          <w:szCs w:val="28"/>
+        </w:rPr>
+        <w:t>Họ</w:t>
+      </w:r>
+      <w:proofErr w:type="spellEnd"/>
+      <w:r>
+        <w:rPr>
+          <w:rFonts w:ascii="Times New Roman" w:eastAsia="Times New Roman" w:hAnsi="Times New Roman"/>
+          <w:sz w:val="28"/>
+          <w:szCs w:val="28"/>
+        </w:rPr>
+        <w:t xml:space="preserve"> </w:t>
+      </w:r>
+      <w:proofErr w:type="spellStart"/>
+      <w:r>
+        <w:rPr>
+          <w:rFonts w:ascii="Times New Roman" w:eastAsia="Times New Roman" w:hAnsi="Times New Roman"/>
+          <w:sz w:val="28"/>
+          <w:szCs w:val="28"/>
+        </w:rPr>
+        <w:t>tên</w:t>
+      </w:r>
+      <w:proofErr w:type="spellEnd"/>
+      <w:r>
+        <w:rPr>
+          <w:rFonts w:ascii="Times New Roman" w:eastAsia="Times New Roman" w:hAnsi="Times New Roman"/>
+          <w:sz w:val="28"/>
+          <w:szCs w:val="28"/>
+        </w:rPr>
+        <w:t xml:space="preserve"> </w:t>
+      </w:r>
+      <w:proofErr w:type="spellStart"/>
+      <w:r>
+        <w:rPr>
+          <w:rFonts w:ascii="Times New Roman" w:eastAsia="Times New Roman" w:hAnsi="Times New Roman"/>
+          <w:sz w:val="28"/>
+          <w:szCs w:val="28"/>
+        </w:rPr>
+        <w:t>sinh</w:t>
+      </w:r>
+      <w:proofErr w:type="spellEnd"/>
+      <w:r>
+        <w:rPr>
+          <w:rFonts w:ascii="Times New Roman" w:eastAsia="Times New Roman" w:hAnsi="Times New Roman"/>
+          <w:sz w:val="28"/>
+          <w:szCs w:val="28"/>
+        </w:rPr>
+        <w:t xml:space="preserve"> </w:t>
+      </w:r>
+      <w:proofErr w:type="spellStart"/>
+      <w:r>
+        <w:rPr>
+          <w:rFonts w:ascii="Times New Roman" w:eastAsia="Times New Roman" w:hAnsi="Times New Roman"/>
+          <w:sz w:val="28"/>
+          <w:szCs w:val="28"/>
+        </w:rPr>
+        <w:t>viên</w:t>
+      </w:r>
+      <w:proofErr w:type="spellEnd"/>
+      <w:r>
+        <w:rPr>
+          <w:rFonts w:ascii="Times New Roman" w:eastAsia="Times New Roman" w:hAnsi="Times New Roman"/>
+          <w:sz w:val="28"/>
+          <w:szCs w:val="28"/>
+        </w:rPr>
+        <w:t xml:space="preserve">: </w:t>
+      </w:r>
+      <w:proofErr w:type="spellStart"/>
+      <w:r>
+        <w:rPr>
+          <w:rFonts w:ascii="Times New Roman" w:eastAsia="Times New Roman" w:hAnsi="Times New Roman"/>
+          <w:sz w:val="28"/>
+          <w:szCs w:val="28"/>
+        </w:rPr>
+        <w:t>Nguyễn</w:t>
+      </w:r>
+      <w:proofErr w:type="spellEnd"/>
+      <w:r>
+        <w:rPr>
+          <w:rFonts w:ascii="Times New Roman" w:eastAsia="Times New Roman" w:hAnsi="Times New Roman"/>
+          <w:sz w:val="28"/>
+          <w:szCs w:val="28"/>
+        </w:rPr>
+        <w:t xml:space="preserve"> </w:t>
+      </w:r>
+      <w:proofErr w:type="spellStart"/>
+      <w:r>
+        <w:rPr>
+          <w:rFonts w:ascii="Times New Roman" w:eastAsia="Times New Roman" w:hAnsi="Times New Roman"/>
+          <w:sz w:val="28"/>
+          <w:szCs w:val="28"/>
+        </w:rPr>
+        <w:t>Trung</w:t>
+      </w:r>
+      <w:proofErr w:type="spellEnd"/>
+      <w:r>
+        <w:rPr>
+          <w:rFonts w:ascii="Times New Roman" w:eastAsia="Times New Roman" w:hAnsi="Times New Roman"/>
+          <w:sz w:val="28"/>
+          <w:szCs w:val="28"/>
+        </w:rPr>
+        <w:t xml:space="preserve"> </w:t>
+      </w:r>
+      <w:proofErr w:type="spellStart"/>
+      <w:r>
+        <w:rPr>
+          <w:rFonts w:ascii="Times New Roman" w:eastAsia="Times New Roman" w:hAnsi="Times New Roman"/>
+          <w:sz w:val="28"/>
+          <w:szCs w:val="28"/>
+        </w:rPr>
+        <w:t>Nghĩa</w:t>
+      </w:r>
+      <w:proofErr w:type="spellEnd"/>
+      <w:r>
+        <w:rPr>
+          <w:rFonts w:ascii="Times New Roman" w:eastAsia="Times New Roman" w:hAnsi="Times New Roman"/>
+          <w:sz w:val="28"/>
+          <w:szCs w:val="28"/>
+        </w:rPr>
+        <w:t xml:space="preserve">. </w:t>
+      </w:r>
+      <w:proofErr w:type="spellStart"/>
+      <w:r>
+        <w:rPr>
+          <w:rFonts w:ascii="Times New Roman" w:eastAsia="Times New Roman" w:hAnsi="Times New Roman"/>
+          <w:sz w:val="28"/>
+          <w:szCs w:val="28"/>
+        </w:rPr>
+        <w:t>Mã</w:t>
+      </w:r>
+      <w:proofErr w:type="spellEnd"/>
+      <w:r>
+        <w:rPr>
+          <w:rFonts w:ascii="Times New Roman" w:eastAsia="Times New Roman" w:hAnsi="Times New Roman"/>
+          <w:sz w:val="28"/>
+          <w:szCs w:val="28"/>
+        </w:rPr>
+        <w:t xml:space="preserve"> SV:</w:t>
       </w:r>
       <w:r>
         <w:rPr>
@@ -433,13 +655,23 @@
           <w:szCs w:val="28"/>
         </w:rPr>
       </w:pPr>
-      <w:r>
-        <w:rPr>
-          <w:rFonts w:ascii="Times New Roman" w:eastAsia="Times New Roman" w:hAnsi="Times New Roman"/>
-          <w:sz w:val="28"/>
-          <w:szCs w:val="28"/>
-        </w:rPr>
-        <w:t xml:space="preserve">Lớp: </w:t>
+      <w:proofErr w:type="spellStart"/>
+      <w:r>
+        <w:rPr>
+          <w:rFonts w:ascii="Times New Roman" w:eastAsia="Times New Roman" w:hAnsi="Times New Roman"/>
+          <w:sz w:val="28"/>
+          <w:szCs w:val="28"/>
+        </w:rPr>
+        <w:t>Lớp</w:t>
+      </w:r>
+      <w:proofErr w:type="spellEnd"/>
+      <w:r>
+        <w:rPr>
+          <w:rFonts w:ascii="Times New Roman" w:eastAsia="Times New Roman" w:hAnsi="Times New Roman"/>
+          <w:sz w:val="28"/>
+          <w:szCs w:val="28"/>
+        </w:rPr>
+        <w:t xml:space="preserve">: </w:t>
       </w:r>
       <w:r>
         <w:rPr>
@@ -457,13 +689,23 @@
         </w:rPr>
         <w:tab/>
       </w:r>
-      <w:r>
-        <w:rPr>
-          <w:rFonts w:ascii="Times New Roman" w:eastAsia="Times New Roman" w:hAnsi="Times New Roman"/>
-          <w:sz w:val="28"/>
-          <w:szCs w:val="28"/>
-        </w:rPr>
-        <w:t xml:space="preserve">Ngành: </w:t>
+      <w:proofErr w:type="spellStart"/>
+      <w:r>
+        <w:rPr>
+          <w:rFonts w:ascii="Times New Roman" w:eastAsia="Times New Roman" w:hAnsi="Times New Roman"/>
+          <w:sz w:val="28"/>
+          <w:szCs w:val="28"/>
+        </w:rPr>
+        <w:t>Ngành</w:t>
+      </w:r>
+      <w:proofErr w:type="spellEnd"/>
+      <w:r>
+        <w:rPr>
+          <w:rFonts w:ascii="Times New Roman" w:eastAsia="Times New Roman" w:hAnsi="Times New Roman"/>
+          <w:sz w:val="28"/>
+          <w:szCs w:val="28"/>
+        </w:rPr>
+        <w:t xml:space="preserve">: </w:t>
       </w:r>
       <w:r>
         <w:rPr>
@@ -481,13 +723,23 @@
         </w:rPr>
         <w:tab/>
       </w:r>
-      <w:r>
-        <w:rPr>
-          <w:rFonts w:ascii="Times New Roman" w:eastAsia="Times New Roman" w:hAnsi="Times New Roman"/>
-          <w:sz w:val="28"/>
-          <w:szCs w:val="28"/>
-        </w:rPr>
-        <w:t>Khóa:</w:t>
+      <w:proofErr w:type="spellStart"/>
+      <w:r>
+        <w:rPr>
+          <w:rFonts w:ascii="Times New Roman" w:eastAsia="Times New Roman" w:hAnsi="Times New Roman"/>
+          <w:sz w:val="28"/>
+          <w:szCs w:val="28"/>
+        </w:rPr>
+        <w:t>Khóa</w:t>
+      </w:r>
+      <w:proofErr w:type="spellEnd"/>
+      <w:r>
+        <w:rPr>
+          <w:rFonts w:ascii="Times New Roman" w:eastAsia="Times New Roman" w:hAnsi="Times New Roman"/>
+          <w:sz w:val="28"/>
+          <w:szCs w:val="28"/>
+        </w:rPr>
+        <w:t>:</w:t>
       </w:r>
       <w:r>
         <w:rPr>
@@ -528,6 +780,7 @@
           <w:szCs w:val="28"/>
         </w:rPr>
       </w:pPr>
+      <w:proofErr w:type="spellStart"/>
       <w:r>
         <w:rPr>
           <w:rFonts w:ascii="Times New Roman" w:eastAsia="Times New Roman" w:hAnsi="Times New Roman"/>
@@ -535,7 +788,57 @@
           <w:sz w:val="28"/>
           <w:szCs w:val="28"/>
         </w:rPr>
-        <w:t>Tên đề tài:</w:t>
+        <w:t>Tên</w:t>
+      </w:r>
+      <w:proofErr w:type="spellEnd"/>
+      <w:r>
+        <w:rPr>
+          <w:rFonts w:ascii="Times New Roman" w:eastAsia="Times New Roman" w:hAnsi="Times New Roman"/>
+          <w:b/>
+          <w:sz w:val="28"/>
+          <w:szCs w:val="28"/>
+        </w:rPr>
+        <w:t xml:space="preserve"> </w:t>
+      </w:r>
+      <w:proofErr w:type="spellStart"/>
+      <w:r>
+        <w:rPr>
+          <w:rFonts w:ascii="Times New Roman" w:eastAsia="Times New Roman" w:hAnsi="Times New Roman"/>
+          <w:b/>
+          <w:sz w:val="28"/>
+          <w:szCs w:val="28"/>
+        </w:rPr>
+        <w:t>đề</w:t>
+      </w:r>
+      <w:proofErr w:type="spellEnd"/>
+      <w:r>
+        <w:rPr>
+          <w:rFonts w:ascii="Times New Roman" w:eastAsia="Times New Roman" w:hAnsi="Times New Roman"/>
+          <w:b/>
+          <w:sz w:val="28"/>
+          <w:szCs w:val="28"/>
+        </w:rPr>
+        <w:t xml:space="preserve"> </w:t>
+      </w:r>
+      <w:proofErr w:type="spellStart"/>
+      <w:r>
+        <w:rPr>
+          <w:rFonts w:ascii="Times New Roman" w:eastAsia="Times New Roman" w:hAnsi="Times New Roman"/>
+          <w:b/>
+          <w:sz w:val="28"/>
+          <w:szCs w:val="28"/>
+        </w:rPr>
+        <w:t>tài</w:t>
+      </w:r>
+      <w:proofErr w:type="spellEnd"/>
+      <w:r>
+        <w:rPr>
+          <w:rFonts w:ascii="Times New Roman" w:eastAsia="Times New Roman" w:hAnsi="Times New Roman"/>
+          <w:b/>
+          <w:sz w:val="28"/>
+          <w:szCs w:val="28"/>
+        </w:rPr>
+        <w:t>:</w:t>
       </w:r>
       <w:r>
         <w:rPr>
@@ -557,6 +860,7 @@
         </w:rPr>
         <w:t> </w:t>
       </w:r>
+      <w:proofErr w:type="spellStart"/>
       <w:r>
         <w:rPr>
           <w:rFonts w:ascii="Times New Roman" w:hAnsi="Times New Roman"/>
@@ -565,16 +869,193 @@
           <w:sz w:val="28"/>
           <w:szCs w:val="28"/>
         </w:rPr>
-        <w:t xml:space="preserve">Xây dựng ứng dụng Android học Tiếng Anh bằng English Flashcard  </w:t>
-      </w:r>
+        <w:t>Xây</w:t>
+      </w:r>
+      <w:proofErr w:type="spellEnd"/>
       <w:r>
         <w:rPr>
           <w:rFonts w:ascii="Times New Roman" w:hAnsi="Times New Roman"/>
+          <w:b/>
+          <w:bCs/>
+          <w:sz w:val="28"/>
+          <w:szCs w:val="28"/>
+        </w:rPr>
+        <w:t xml:space="preserve"> </w:t>
+      </w:r>
+      <w:proofErr w:type="spellStart"/>
+      <w:r>
+        <w:rPr>
+          <w:rFonts w:ascii="Times New Roman" w:hAnsi="Times New Roman"/>
+          <w:b/>
+          <w:bCs/>
+          <w:sz w:val="28"/>
+          <w:szCs w:val="28"/>
+        </w:rPr>
+        <w:t>dựng</w:t>
+      </w:r>
+      <w:proofErr w:type="spellEnd"/>
+      <w:r>
+        <w:rPr>
+          <w:rFonts w:ascii="Times New Roman" w:hAnsi="Times New Roman"/>
+          <w:b/>
+          <w:bCs/>
+          <w:sz w:val="28"/>
+          <w:szCs w:val="28"/>
+        </w:rPr>
+        <w:t xml:space="preserve"> </w:t>
+      </w:r>
+      <w:proofErr w:type="spellStart"/>
+      <w:r>
+        <w:rPr>
+          <w:rFonts w:ascii="Times New Roman" w:hAnsi="Times New Roman"/>
+          <w:b/>
+          <w:bCs/>
+          <w:sz w:val="28"/>
+          <w:szCs w:val="28"/>
+        </w:rPr>
+        <w:t>ứng</w:t>
+      </w:r>
+      <w:proofErr w:type="spellEnd"/>
+      <w:r>
+        <w:rPr>
+          <w:rFonts w:ascii="Times New Roman" w:hAnsi="Times New Roman"/>
+          <w:b/>
+          <w:bCs/>
+          <w:sz w:val="28"/>
+          <w:szCs w:val="28"/>
+        </w:rPr>
+        <w:t xml:space="preserve"> </w:t>
+      </w:r>
+      <w:proofErr w:type="spellStart"/>
+      <w:r>
+        <w:rPr>
+          <w:rFonts w:ascii="Times New Roman" w:hAnsi="Times New Roman"/>
+          <w:b/>
+          <w:bCs/>
+          <w:sz w:val="28"/>
+          <w:szCs w:val="28"/>
+        </w:rPr>
+        <w:t>dụng</w:t>
+      </w:r>
+      <w:proofErr w:type="spellEnd"/>
+      <w:r>
+        <w:rPr>
+          <w:rFonts w:ascii="Times New Roman" w:hAnsi="Times New Roman"/>
+          <w:b/>
+          <w:bCs/>
+          <w:sz w:val="28"/>
+          <w:szCs w:val="28"/>
+        </w:rPr>
+        <w:t xml:space="preserve"> Android </w:t>
+      </w:r>
+      <w:proofErr w:type="spellStart"/>
+      <w:r>
+        <w:rPr>
+          <w:rFonts w:ascii="Times New Roman" w:hAnsi="Times New Roman"/>
+          <w:b/>
+          <w:bCs/>
+          <w:sz w:val="28"/>
+          <w:szCs w:val="28"/>
+        </w:rPr>
+        <w:t>học</w:t>
+      </w:r>
+      <w:proofErr w:type="spellEnd"/>
+      <w:r>
+        <w:rPr>
+          <w:rFonts w:ascii="Times New Roman" w:hAnsi="Times New Roman"/>
+          <w:b/>
+          <w:bCs/>
+          <w:sz w:val="28"/>
+          <w:szCs w:val="28"/>
+        </w:rPr>
+        <w:t xml:space="preserve"> </w:t>
+      </w:r>
+      <w:proofErr w:type="spellStart"/>
+      <w:r>
+        <w:rPr>
+          <w:rFonts w:ascii="Times New Roman" w:hAnsi="Times New Roman"/>
+          <w:b/>
+          <w:bCs/>
+          <w:sz w:val="28"/>
+          <w:szCs w:val="28"/>
+        </w:rPr>
+        <w:t>Tiếng</w:t>
+      </w:r>
+      <w:proofErr w:type="spellEnd"/>
+      <w:r>
+        <w:rPr>
+          <w:rFonts w:ascii="Times New Roman" w:hAnsi="Times New Roman"/>
+          <w:b/>
+          <w:bCs/>
+          <w:sz w:val="28"/>
+          <w:szCs w:val="28"/>
+        </w:rPr>
+        <w:t xml:space="preserve"> </w:t>
+      </w:r>
+      <w:proofErr w:type="spellStart"/>
+      <w:r>
+        <w:rPr>
+          <w:rFonts w:ascii="Times New Roman" w:hAnsi="Times New Roman"/>
+          <w:b/>
+          <w:bCs/>
+          <w:sz w:val="28"/>
+          <w:szCs w:val="28"/>
+        </w:rPr>
+        <w:t>Anh</w:t>
+      </w:r>
+      <w:proofErr w:type="spellEnd"/>
+      <w:r>
+        <w:rPr>
+          <w:rFonts w:ascii="Times New Roman" w:hAnsi="Times New Roman"/>
+          <w:b/>
+          <w:bCs/>
+          <w:sz w:val="28"/>
+          <w:szCs w:val="28"/>
+        </w:rPr>
+        <w:t xml:space="preserve"> </w:t>
+      </w:r>
+      <w:proofErr w:type="spellStart"/>
+      <w:r>
+        <w:rPr>
+          <w:rFonts w:ascii="Times New Roman" w:hAnsi="Times New Roman"/>
+          <w:b/>
+          <w:bCs/>
+          <w:sz w:val="28"/>
+          <w:szCs w:val="28"/>
+        </w:rPr>
+        <w:t>bằng</w:t>
+      </w:r>
+      <w:proofErr w:type="spellEnd"/>
+      <w:r>
+        <w:rPr>
+          <w:rFonts w:ascii="Times New Roman" w:hAnsi="Times New Roman"/>
+          <w:b/>
+          <w:bCs/>
+          <w:sz w:val="28"/>
+          <w:szCs w:val="28"/>
+        </w:rPr>
+        <w:t xml:space="preserve"> English </w:t>
+      </w:r>
+      <w:proofErr w:type="gramStart"/>
+      <w:r>
+        <w:rPr>
+          <w:rFonts w:ascii="Times New Roman" w:hAnsi="Times New Roman"/>
+          <w:b/>
+          <w:bCs/>
+          <w:sz w:val="28"/>
+          <w:szCs w:val="28"/>
+        </w:rPr>
+        <w:t xml:space="preserve">Flashcard  </w:t>
+      </w:r>
+      <w:r>
+        <w:rPr>
+          <w:rFonts w:ascii="Times New Roman" w:hAnsi="Times New Roman"/>
           <w:sz w:val="28"/>
           <w:szCs w:val="28"/>
         </w:rPr>
         <w:t>.</w:t>
       </w:r>
+      <w:proofErr w:type="gramEnd"/>
     </w:p>
     <w:p>
       <w:pPr>
@@ -587,6 +1068,7 @@
           <w:szCs w:val="28"/>
         </w:rPr>
       </w:pPr>
+      <w:proofErr w:type="spellStart"/>
       <w:r>
         <w:rPr>
           <w:rFonts w:ascii="Times New Roman" w:eastAsia="Times New Roman" w:hAnsi="Times New Roman"/>
@@ -594,8 +1076,69 @@
           <w:sz w:val="28"/>
           <w:szCs w:val="28"/>
         </w:rPr>
-        <w:t>Mục tiêu đề tài</w:t>
-      </w:r>
+        <w:t>Mục</w:t>
+      </w:r>
+      <w:proofErr w:type="spellEnd"/>
+      <w:r>
+        <w:rPr>
+          <w:rFonts w:ascii="Times New Roman" w:eastAsia="Times New Roman" w:hAnsi="Times New Roman"/>
+          <w:b/>
+          <w:sz w:val="28"/>
+          <w:szCs w:val="28"/>
+        </w:rPr>
+        <w:t xml:space="preserve"> </w:t>
+      </w:r>
+      <w:proofErr w:type="spellStart"/>
+      <w:r>
+        <w:rPr>
+          <w:rFonts w:ascii="Times New Roman" w:eastAsia="Times New Roman" w:hAnsi="Times New Roman"/>
+          <w:b/>
+          <w:sz w:val="28"/>
+          <w:szCs w:val="28"/>
+        </w:rPr>
+        <w:t>tiêu</w:t>
+      </w:r>
+      <w:proofErr w:type="spellEnd"/>
+      <w:r>
+        <w:rPr>
+          <w:rFonts w:ascii="Times New Roman" w:eastAsia="Times New Roman" w:hAnsi="Times New Roman"/>
+          <w:b/>
+          <w:sz w:val="28"/>
+          <w:szCs w:val="28"/>
+        </w:rPr>
+        <w:t xml:space="preserve"> </w:t>
+      </w:r>
+      <w:proofErr w:type="spellStart"/>
+      <w:r>
+        <w:rPr>
+          <w:rFonts w:ascii="Times New Roman" w:eastAsia="Times New Roman" w:hAnsi="Times New Roman"/>
+          <w:b/>
+          <w:sz w:val="28"/>
+          <w:szCs w:val="28"/>
+        </w:rPr>
+        <w:t>đề</w:t>
+      </w:r>
+      <w:proofErr w:type="spellEnd"/>
+      <w:r>
+        <w:rPr>
+          <w:rFonts w:ascii="Times New Roman" w:eastAsia="Times New Roman" w:hAnsi="Times New Roman"/>
+          <w:b/>
+          <w:sz w:val="28"/>
+          <w:szCs w:val="28"/>
+        </w:rPr>
+        <w:t xml:space="preserve"> </w:t>
+      </w:r>
+      <w:proofErr w:type="spellStart"/>
+      <w:r>
+        <w:rPr>
+          <w:rFonts w:ascii="Times New Roman" w:eastAsia="Times New Roman" w:hAnsi="Times New Roman"/>
+          <w:b/>
+          <w:sz w:val="28"/>
+          <w:szCs w:val="28"/>
+        </w:rPr>
+        <w:t>tài</w:t>
+      </w:r>
+      <w:proofErr w:type="spellEnd"/>
       <w:r>
         <w:rPr>
           <w:rFonts w:ascii="Times New Roman" w:eastAsia="Times New Roman" w:hAnsi="Times New Roman"/>
@@ -712,6 +1255,7 @@
           <w:szCs w:val="28"/>
         </w:rPr>
       </w:pPr>
+      <w:proofErr w:type="spellStart"/>
       <w:r>
         <w:rPr>
           <w:rFonts w:ascii="Times New Roman" w:eastAsia="Times New Roman" w:hAnsi="Times New Roman"/>
@@ -719,8 +1263,69 @@
           <w:sz w:val="28"/>
           <w:szCs w:val="28"/>
         </w:rPr>
-        <w:t>Kết quả dự kiến</w:t>
-      </w:r>
+        <w:t>Kết</w:t>
+      </w:r>
+      <w:proofErr w:type="spellEnd"/>
+      <w:r>
+        <w:rPr>
+          <w:rFonts w:ascii="Times New Roman" w:eastAsia="Times New Roman" w:hAnsi="Times New Roman"/>
+          <w:b/>
+          <w:sz w:val="28"/>
+          <w:szCs w:val="28"/>
+        </w:rPr>
+        <w:t xml:space="preserve"> </w:t>
+      </w:r>
+      <w:proofErr w:type="spellStart"/>
+      <w:r>
+        <w:rPr>
+          <w:rFonts w:ascii="Times New Roman" w:eastAsia="Times New Roman" w:hAnsi="Times New Roman"/>
+          <w:b/>
+          <w:sz w:val="28"/>
+          <w:szCs w:val="28"/>
+        </w:rPr>
+        <w:t>quả</w:t>
+      </w:r>
+      <w:proofErr w:type="spellEnd"/>
+      <w:r>
+        <w:rPr>
+          <w:rFonts w:ascii="Times New Roman" w:eastAsia="Times New Roman" w:hAnsi="Times New Roman"/>
+          <w:b/>
+          <w:sz w:val="28"/>
+          <w:szCs w:val="28"/>
+        </w:rPr>
+        <w:t xml:space="preserve"> </w:t>
+      </w:r>
+      <w:proofErr w:type="spellStart"/>
+      <w:r>
+        <w:rPr>
+          <w:rFonts w:ascii="Times New Roman" w:eastAsia="Times New Roman" w:hAnsi="Times New Roman"/>
+          <w:b/>
+          <w:sz w:val="28"/>
+          <w:szCs w:val="28"/>
+        </w:rPr>
+        <w:t>dự</w:t>
+      </w:r>
+      <w:proofErr w:type="spellEnd"/>
+      <w:r>
+        <w:rPr>
+          <w:rFonts w:ascii="Times New Roman" w:eastAsia="Times New Roman" w:hAnsi="Times New Roman"/>
+          <w:b/>
+          <w:sz w:val="28"/>
+          <w:szCs w:val="28"/>
+        </w:rPr>
+        <w:t xml:space="preserve"> </w:t>
+      </w:r>
+      <w:proofErr w:type="spellStart"/>
+      <w:r>
+        <w:rPr>
+          <w:rFonts w:ascii="Times New Roman" w:eastAsia="Times New Roman" w:hAnsi="Times New Roman"/>
+          <w:b/>
+          <w:sz w:val="28"/>
+          <w:szCs w:val="28"/>
+        </w:rPr>
+        <w:t>kiến</w:t>
+      </w:r>
+      <w:proofErr w:type="spellEnd"/>
     </w:p>
     <w:p>
       <w:pPr>
@@ -840,13 +1445,95 @@
         </w:tabs>
         <w:spacing w:before="120" w:after="240" w:line="240" w:lineRule="auto"/>
       </w:pPr>
-      <w:r>
-        <w:rPr>
-          <w:rFonts w:ascii="Times New Roman" w:eastAsia="Times New Roman" w:hAnsi="Times New Roman"/>
-          <w:sz w:val="28"/>
-          <w:szCs w:val="28"/>
-        </w:rPr>
-        <w:t xml:space="preserve">Thời gian thực hiện: từ </w:t>
+      <w:proofErr w:type="spellStart"/>
+      <w:r>
+        <w:rPr>
+          <w:rFonts w:ascii="Times New Roman" w:eastAsia="Times New Roman" w:hAnsi="Times New Roman"/>
+          <w:sz w:val="28"/>
+          <w:szCs w:val="28"/>
+        </w:rPr>
+        <w:t>Thời</w:t>
+      </w:r>
+      <w:proofErr w:type="spellEnd"/>
+      <w:r>
+        <w:rPr>
+          <w:rFonts w:ascii="Times New Roman" w:eastAsia="Times New Roman" w:hAnsi="Times New Roman"/>
+          <w:sz w:val="28"/>
+          <w:szCs w:val="28"/>
+        </w:rPr>
+        <w:t xml:space="preserve"> </w:t>
+      </w:r>
+      <w:proofErr w:type="spellStart"/>
+      <w:r>
+        <w:rPr>
+          <w:rFonts w:ascii="Times New Roman" w:eastAsia="Times New Roman" w:hAnsi="Times New Roman"/>
+          <w:sz w:val="28"/>
+          <w:szCs w:val="28"/>
+        </w:rPr>
+        <w:t>gian</w:t>
+      </w:r>
+      <w:proofErr w:type="spellEnd"/>
+      <w:r>
+        <w:rPr>
+          <w:rFonts w:ascii="Times New Roman" w:eastAsia="Times New Roman" w:hAnsi="Times New Roman"/>
+          <w:sz w:val="28"/>
+          <w:szCs w:val="28"/>
+        </w:rPr>
+        <w:t xml:space="preserve"> </w:t>
+      </w:r>
+      <w:proofErr w:type="spellStart"/>
+      <w:r>
+        <w:rPr>
+          <w:rFonts w:ascii="Times New Roman" w:eastAsia="Times New Roman" w:hAnsi="Times New Roman"/>
+          <w:sz w:val="28"/>
+          <w:szCs w:val="28"/>
+        </w:rPr>
+        <w:t>thực</w:t>
+      </w:r>
+      <w:proofErr w:type="spellEnd"/>
+      <w:r>
+        <w:rPr>
+          <w:rFonts w:ascii="Times New Roman" w:eastAsia="Times New Roman" w:hAnsi="Times New Roman"/>
+          <w:sz w:val="28"/>
+          <w:szCs w:val="28"/>
+        </w:rPr>
+        <w:t xml:space="preserve"> </w:t>
+      </w:r>
+      <w:proofErr w:type="spellStart"/>
+      <w:r>
+        <w:rPr>
+          <w:rFonts w:ascii="Times New Roman" w:eastAsia="Times New Roman" w:hAnsi="Times New Roman"/>
+          <w:sz w:val="28"/>
+          <w:szCs w:val="28"/>
+        </w:rPr>
+        <w:t>hiện</w:t>
+      </w:r>
+      <w:proofErr w:type="spellEnd"/>
+      <w:r>
+        <w:rPr>
+          <w:rFonts w:ascii="Times New Roman" w:eastAsia="Times New Roman" w:hAnsi="Times New Roman"/>
+          <w:sz w:val="28"/>
+          <w:szCs w:val="28"/>
+        </w:rPr>
+        <w:t xml:space="preserve">: </w:t>
+      </w:r>
+      <w:proofErr w:type="spellStart"/>
+      <w:r>
+        <w:rPr>
+          <w:rFonts w:ascii="Times New Roman" w:eastAsia="Times New Roman" w:hAnsi="Times New Roman"/>
+          <w:sz w:val="28"/>
+          <w:szCs w:val="28"/>
+        </w:rPr>
+        <w:t>từ</w:t>
+      </w:r>
+      <w:proofErr w:type="spellEnd"/>
+      <w:r>
+        <w:rPr>
+          <w:rFonts w:ascii="Times New Roman" w:eastAsia="Times New Roman" w:hAnsi="Times New Roman"/>
+          <w:sz w:val="28"/>
+          <w:szCs w:val="28"/>
+        </w:rPr>
+        <w:t xml:space="preserve"> </w:t>
       </w:r>
       <w:r>
         <w:rPr>
@@ -894,7 +1581,25 @@
           <w:sz w:val="28"/>
           <w:szCs w:val="28"/>
         </w:rPr>
-        <w:t xml:space="preserve"> đến </w:t>
+        <w:t xml:space="preserve"> </w:t>
+      </w:r>
+      <w:proofErr w:type="spellStart"/>
+      <w:r>
+        <w:rPr>
+          <w:rFonts w:ascii="Times New Roman" w:eastAsia="Times New Roman" w:hAnsi="Times New Roman"/>
+          <w:sz w:val="28"/>
+          <w:szCs w:val="28"/>
+        </w:rPr>
+        <w:t>đến</w:t>
+      </w:r>
+      <w:proofErr w:type="spellEnd"/>
+      <w:r>
+        <w:rPr>
+          <w:rFonts w:ascii="Times New Roman" w:eastAsia="Times New Roman" w:hAnsi="Times New Roman"/>
+          <w:sz w:val="28"/>
+          <w:szCs w:val="28"/>
+        </w:rPr>
+        <w:t xml:space="preserve"> </w:t>
       </w:r>
       <w:r>
         <w:rPr>
@@ -1058,6 +1763,7 @@
               </w:rPr>
               <w:t xml:space="preserve">TS. </w:t>
             </w:r>
+            <w:proofErr w:type="spellStart"/>
             <w:r>
               <w:rPr>
                 <w:rFonts w:ascii="Times New Roman" w:eastAsia="Times New Roman" w:hAnsi="Times New Roman"/>
@@ -1067,8 +1773,57 @@
                 <w:sz w:val="28"/>
                 <w:szCs w:val="28"/>
               </w:rPr>
-              <w:t>Trần Đăng Hưng</w:t>
-            </w:r>
+              <w:t>Trần</w:t>
+            </w:r>
+            <w:proofErr w:type="spellEnd"/>
+            <w:r>
+              <w:rPr>
+                <w:rFonts w:ascii="Times New Roman" w:eastAsia="Times New Roman" w:hAnsi="Times New Roman"/>
+                <w:b/>
+                <w:bCs/>
+                <w:color w:val="000000"/>
+                <w:sz w:val="28"/>
+                <w:szCs w:val="28"/>
+              </w:rPr>
+              <w:t xml:space="preserve"> </w:t>
+            </w:r>
+            <w:proofErr w:type="spellStart"/>
+            <w:r>
+              <w:rPr>
+                <w:rFonts w:ascii="Times New Roman" w:eastAsia="Times New Roman" w:hAnsi="Times New Roman"/>
+                <w:b/>
+                <w:bCs/>
+                <w:color w:val="000000"/>
+                <w:sz w:val="28"/>
+                <w:szCs w:val="28"/>
+              </w:rPr>
+              <w:t>Đăng</w:t>
+            </w:r>
+            <w:proofErr w:type="spellEnd"/>
+            <w:r>
+              <w:rPr>
+                <w:rFonts w:ascii="Times New Roman" w:eastAsia="Times New Roman" w:hAnsi="Times New Roman"/>
+                <w:b/>
+                <w:bCs/>
+                <w:color w:val="000000"/>
+                <w:sz w:val="28"/>
+                <w:szCs w:val="28"/>
+              </w:rPr>
+              <w:t xml:space="preserve"> </w:t>
+            </w:r>
+            <w:proofErr w:type="spellStart"/>
+            <w:r>
+              <w:rPr>
+                <w:rFonts w:ascii="Times New Roman" w:eastAsia="Times New Roman" w:hAnsi="Times New Roman"/>
+                <w:b/>
+                <w:bCs/>
+                <w:color w:val="000000"/>
+                <w:sz w:val="28"/>
+                <w:szCs w:val="28"/>
+              </w:rPr>
+              <w:t>Hưng</w:t>
+            </w:r>
+            <w:proofErr w:type="spellEnd"/>
           </w:p>
           <w:p>
             <w:pPr>
@@ -1189,12 +1944,2598 @@
                 <w:sz w:val="28"/>
                 <w:szCs w:val="28"/>
               </w:rPr>
-              <w:t>TS. Đặng Trọng Hợp</w:t>
-            </w:r>
+              <w:t xml:space="preserve">TS. </w:t>
+            </w:r>
+            <w:proofErr w:type="spellStart"/>
+            <w:r>
+              <w:rPr>
+                <w:rFonts w:ascii="Times New Roman" w:eastAsia="Times New Roman" w:hAnsi="Times New Roman"/>
+                <w:b/>
+                <w:sz w:val="28"/>
+                <w:szCs w:val="28"/>
+              </w:rPr>
+              <w:t>Đặng</w:t>
+            </w:r>
+            <w:proofErr w:type="spellEnd"/>
+            <w:r>
+              <w:rPr>
+                <w:rFonts w:ascii="Times New Roman" w:eastAsia="Times New Roman" w:hAnsi="Times New Roman"/>
+                <w:b/>
+                <w:sz w:val="28"/>
+                <w:szCs w:val="28"/>
+              </w:rPr>
+              <w:t xml:space="preserve"> </w:t>
+            </w:r>
+            <w:proofErr w:type="spellStart"/>
+            <w:r>
+              <w:rPr>
+                <w:rFonts w:ascii="Times New Roman" w:eastAsia="Times New Roman" w:hAnsi="Times New Roman"/>
+                <w:b/>
+                <w:sz w:val="28"/>
+                <w:szCs w:val="28"/>
+              </w:rPr>
+              <w:t>Trọng</w:t>
+            </w:r>
+            <w:proofErr w:type="spellEnd"/>
+            <w:r>
+              <w:rPr>
+                <w:rFonts w:ascii="Times New Roman" w:eastAsia="Times New Roman" w:hAnsi="Times New Roman"/>
+                <w:b/>
+                <w:sz w:val="28"/>
+                <w:szCs w:val="28"/>
+              </w:rPr>
+              <w:t xml:space="preserve"> </w:t>
+            </w:r>
+            <w:proofErr w:type="spellStart"/>
+            <w:r>
+              <w:rPr>
+                <w:rFonts w:ascii="Times New Roman" w:eastAsia="Times New Roman" w:hAnsi="Times New Roman"/>
+                <w:b/>
+                <w:sz w:val="28"/>
+                <w:szCs w:val="28"/>
+              </w:rPr>
+              <w:t>Hợp</w:t>
+            </w:r>
+            <w:proofErr w:type="spellEnd"/>
           </w:p>
         </w:tc>
       </w:tr>
     </w:tbl>
+    <w:p/>
+    <w:p/>
+    <w:p/>
+    <w:p>
+      <w:pPr>
+        <w:jc w:val="center"/>
+        <w:rPr>
+          <w:rFonts w:ascii="Times New Roman" w:hAnsi="Times New Roman"/>
+          <w:sz w:val="40"/>
+          <w:szCs w:val="40"/>
+        </w:rPr>
+      </w:pPr>
+      <w:proofErr w:type="spellStart"/>
+      <w:r>
+        <w:rPr>
+          <w:rFonts w:ascii="Times New Roman" w:hAnsi="Times New Roman"/>
+          <w:sz w:val="40"/>
+          <w:szCs w:val="40"/>
+        </w:rPr>
+        <w:lastRenderedPageBreak/>
+        <w:t>Báo</w:t>
+      </w:r>
+      <w:proofErr w:type="spellEnd"/>
+      <w:r>
+        <w:rPr>
+          <w:rFonts w:ascii="Times New Roman" w:hAnsi="Times New Roman"/>
+          <w:sz w:val="40"/>
+          <w:szCs w:val="40"/>
+        </w:rPr>
+        <w:t xml:space="preserve"> </w:t>
+      </w:r>
+      <w:proofErr w:type="spellStart"/>
+      <w:r>
+        <w:rPr>
+          <w:rFonts w:ascii="Times New Roman" w:hAnsi="Times New Roman"/>
+          <w:sz w:val="40"/>
+          <w:szCs w:val="40"/>
+        </w:rPr>
+        <w:t>Cáo</w:t>
+      </w:r>
+      <w:proofErr w:type="spellEnd"/>
+      <w:r>
+        <w:rPr>
+          <w:rFonts w:ascii="Times New Roman" w:hAnsi="Times New Roman"/>
+          <w:sz w:val="40"/>
+          <w:szCs w:val="40"/>
+        </w:rPr>
+        <w:t xml:space="preserve"> </w:t>
+      </w:r>
+      <w:proofErr w:type="spellStart"/>
+      <w:r>
+        <w:rPr>
+          <w:rFonts w:ascii="Times New Roman" w:hAnsi="Times New Roman"/>
+          <w:sz w:val="40"/>
+          <w:szCs w:val="40"/>
+        </w:rPr>
+        <w:t>Tiến</w:t>
+      </w:r>
+      <w:proofErr w:type="spellEnd"/>
+      <w:r>
+        <w:rPr>
+          <w:rFonts w:ascii="Times New Roman" w:hAnsi="Times New Roman"/>
+          <w:sz w:val="40"/>
+          <w:szCs w:val="40"/>
+        </w:rPr>
+        <w:t xml:space="preserve"> </w:t>
+      </w:r>
+      <w:proofErr w:type="spellStart"/>
+      <w:r>
+        <w:rPr>
+          <w:rFonts w:ascii="Times New Roman" w:hAnsi="Times New Roman"/>
+          <w:sz w:val="40"/>
+          <w:szCs w:val="40"/>
+        </w:rPr>
+        <w:t>Độ</w:t>
+      </w:r>
+      <w:proofErr w:type="spellEnd"/>
+      <w:r>
+        <w:rPr>
+          <w:rFonts w:ascii="Times New Roman" w:hAnsi="Times New Roman"/>
+          <w:sz w:val="40"/>
+          <w:szCs w:val="40"/>
+        </w:rPr>
+        <w:t xml:space="preserve"> Theo </w:t>
+      </w:r>
+      <w:proofErr w:type="spellStart"/>
+      <w:r>
+        <w:rPr>
+          <w:rFonts w:ascii="Times New Roman" w:hAnsi="Times New Roman"/>
+          <w:sz w:val="40"/>
+          <w:szCs w:val="40"/>
+        </w:rPr>
+        <w:t>Tuần</w:t>
+      </w:r>
+      <w:proofErr w:type="spellEnd"/>
+    </w:p>
+    <w:tbl>
+      <w:tblPr>
+        <w:tblStyle w:val="TableGrid"/>
+        <w:tblW w:w="9265" w:type="dxa"/>
+        <w:tblLook w:val="04A0" w:firstRow="1" w:lastRow="0" w:firstColumn="1" w:lastColumn="0" w:noHBand="0" w:noVBand="1"/>
+      </w:tblPr>
+      <w:tblGrid>
+        <w:gridCol w:w="2265"/>
+        <w:gridCol w:w="4300"/>
+        <w:gridCol w:w="2700"/>
+      </w:tblGrid>
+      <w:tr>
+        <w:tc>
+          <w:tcPr>
+            <w:tcW w:w="2265" w:type="dxa"/>
+          </w:tcPr>
+          <w:p>
+            <w:pPr>
+              <w:jc w:val="center"/>
+              <w:rPr>
+                <w:rFonts w:ascii="Times New Roman" w:hAnsi="Times New Roman"/>
+                <w:b/>
+                <w:sz w:val="28"/>
+                <w:szCs w:val="28"/>
+              </w:rPr>
+            </w:pPr>
+            <w:proofErr w:type="spellStart"/>
+            <w:r>
+              <w:rPr>
+                <w:rFonts w:ascii="Times New Roman" w:hAnsi="Times New Roman"/>
+                <w:b/>
+                <w:sz w:val="28"/>
+                <w:szCs w:val="28"/>
+              </w:rPr>
+              <w:t>Tuần</w:t>
+            </w:r>
+            <w:proofErr w:type="spellEnd"/>
+          </w:p>
+        </w:tc>
+        <w:tc>
+          <w:tcPr>
+            <w:tcW w:w="4300" w:type="dxa"/>
+          </w:tcPr>
+          <w:p>
+            <w:pPr>
+              <w:jc w:val="center"/>
+              <w:rPr>
+                <w:rFonts w:ascii="Times New Roman" w:hAnsi="Times New Roman"/>
+                <w:b/>
+                <w:sz w:val="28"/>
+                <w:szCs w:val="28"/>
+              </w:rPr>
+            </w:pPr>
+            <w:proofErr w:type="spellStart"/>
+            <w:r>
+              <w:rPr>
+                <w:rFonts w:ascii="Times New Roman" w:hAnsi="Times New Roman"/>
+                <w:b/>
+                <w:sz w:val="28"/>
+                <w:szCs w:val="28"/>
+              </w:rPr>
+              <w:t>Nội</w:t>
+            </w:r>
+            <w:proofErr w:type="spellEnd"/>
+            <w:r>
+              <w:rPr>
+                <w:rFonts w:ascii="Times New Roman" w:hAnsi="Times New Roman"/>
+                <w:b/>
+                <w:sz w:val="28"/>
+                <w:szCs w:val="28"/>
+              </w:rPr>
+              <w:t xml:space="preserve"> dung </w:t>
+            </w:r>
+            <w:proofErr w:type="spellStart"/>
+            <w:r>
+              <w:rPr>
+                <w:rFonts w:ascii="Times New Roman" w:hAnsi="Times New Roman"/>
+                <w:b/>
+                <w:sz w:val="28"/>
+                <w:szCs w:val="28"/>
+              </w:rPr>
+              <w:t>công</w:t>
+            </w:r>
+            <w:proofErr w:type="spellEnd"/>
+            <w:r>
+              <w:rPr>
+                <w:rFonts w:ascii="Times New Roman" w:hAnsi="Times New Roman"/>
+                <w:b/>
+                <w:sz w:val="28"/>
+                <w:szCs w:val="28"/>
+              </w:rPr>
+              <w:t xml:space="preserve"> </w:t>
+            </w:r>
+            <w:proofErr w:type="spellStart"/>
+            <w:r>
+              <w:rPr>
+                <w:rFonts w:ascii="Times New Roman" w:hAnsi="Times New Roman"/>
+                <w:b/>
+                <w:sz w:val="28"/>
+                <w:szCs w:val="28"/>
+              </w:rPr>
+              <w:t>việc</w:t>
+            </w:r>
+            <w:proofErr w:type="spellEnd"/>
+          </w:p>
+        </w:tc>
+        <w:tc>
+          <w:tcPr>
+            <w:tcW w:w="2700" w:type="dxa"/>
+          </w:tcPr>
+          <w:p>
+            <w:pPr>
+              <w:jc w:val="center"/>
+              <w:rPr>
+                <w:rFonts w:ascii="Times New Roman" w:hAnsi="Times New Roman"/>
+                <w:b/>
+                <w:sz w:val="28"/>
+                <w:szCs w:val="28"/>
+              </w:rPr>
+            </w:pPr>
+            <w:proofErr w:type="spellStart"/>
+            <w:r>
+              <w:rPr>
+                <w:rFonts w:ascii="Times New Roman" w:hAnsi="Times New Roman"/>
+                <w:b/>
+                <w:sz w:val="28"/>
+                <w:szCs w:val="28"/>
+              </w:rPr>
+              <w:t>Kết</w:t>
+            </w:r>
+            <w:proofErr w:type="spellEnd"/>
+            <w:r>
+              <w:rPr>
+                <w:rFonts w:ascii="Times New Roman" w:hAnsi="Times New Roman"/>
+                <w:b/>
+                <w:sz w:val="28"/>
+                <w:szCs w:val="28"/>
+              </w:rPr>
+              <w:t xml:space="preserve"> </w:t>
+            </w:r>
+            <w:proofErr w:type="spellStart"/>
+            <w:r>
+              <w:rPr>
+                <w:rFonts w:ascii="Times New Roman" w:hAnsi="Times New Roman"/>
+                <w:b/>
+                <w:sz w:val="28"/>
+                <w:szCs w:val="28"/>
+              </w:rPr>
+              <w:t>quả</w:t>
+            </w:r>
+            <w:proofErr w:type="spellEnd"/>
+            <w:r>
+              <w:rPr>
+                <w:rFonts w:ascii="Times New Roman" w:hAnsi="Times New Roman"/>
+                <w:b/>
+                <w:sz w:val="28"/>
+                <w:szCs w:val="28"/>
+              </w:rPr>
+              <w:t xml:space="preserve"> </w:t>
+            </w:r>
+            <w:proofErr w:type="spellStart"/>
+            <w:r>
+              <w:rPr>
+                <w:rFonts w:ascii="Times New Roman" w:hAnsi="Times New Roman"/>
+                <w:b/>
+                <w:sz w:val="28"/>
+                <w:szCs w:val="28"/>
+              </w:rPr>
+              <w:t>công</w:t>
+            </w:r>
+            <w:proofErr w:type="spellEnd"/>
+            <w:r>
+              <w:rPr>
+                <w:rFonts w:ascii="Times New Roman" w:hAnsi="Times New Roman"/>
+                <w:b/>
+                <w:sz w:val="28"/>
+                <w:szCs w:val="28"/>
+              </w:rPr>
+              <w:t xml:space="preserve"> </w:t>
+            </w:r>
+            <w:proofErr w:type="spellStart"/>
+            <w:r>
+              <w:rPr>
+                <w:rFonts w:ascii="Times New Roman" w:hAnsi="Times New Roman"/>
+                <w:b/>
+                <w:sz w:val="28"/>
+                <w:szCs w:val="28"/>
+              </w:rPr>
+              <w:t>việc</w:t>
+            </w:r>
+            <w:proofErr w:type="spellEnd"/>
+          </w:p>
+        </w:tc>
+      </w:tr>
+      <w:tr>
+        <w:tc>
+          <w:tcPr>
+            <w:tcW w:w="2265" w:type="dxa"/>
+          </w:tcPr>
+          <w:p>
+            <w:pPr>
+              <w:rPr>
+                <w:rFonts w:ascii="Times New Roman" w:hAnsi="Times New Roman"/>
+                <w:sz w:val="28"/>
+                <w:szCs w:val="28"/>
+              </w:rPr>
+            </w:pPr>
+            <w:r>
+              <w:rPr>
+                <w:rFonts w:ascii="Times New Roman" w:hAnsi="Times New Roman"/>
+                <w:sz w:val="28"/>
+                <w:szCs w:val="28"/>
+              </w:rPr>
+              <w:t>17/03/2025-23/03/2025</w:t>
+            </w:r>
+          </w:p>
+        </w:tc>
+        <w:tc>
+          <w:tcPr>
+            <w:tcW w:w="4300" w:type="dxa"/>
+          </w:tcPr>
+          <w:p>
+            <w:pPr>
+              <w:rPr>
+                <w:rFonts w:ascii="Times New Roman" w:hAnsi="Times New Roman"/>
+                <w:sz w:val="28"/>
+                <w:szCs w:val="28"/>
+              </w:rPr>
+            </w:pPr>
+            <w:proofErr w:type="spellStart"/>
+            <w:r>
+              <w:rPr>
+                <w:rFonts w:ascii="Times New Roman" w:hAnsi="Times New Roman"/>
+                <w:sz w:val="28"/>
+                <w:szCs w:val="28"/>
+              </w:rPr>
+              <w:t>Lập</w:t>
+            </w:r>
+            <w:proofErr w:type="spellEnd"/>
+            <w:r>
+              <w:rPr>
+                <w:rFonts w:ascii="Times New Roman" w:hAnsi="Times New Roman"/>
+                <w:sz w:val="28"/>
+                <w:szCs w:val="28"/>
+              </w:rPr>
+              <w:t xml:space="preserve"> </w:t>
+            </w:r>
+            <w:proofErr w:type="spellStart"/>
+            <w:r>
+              <w:rPr>
+                <w:rFonts w:ascii="Times New Roman" w:hAnsi="Times New Roman"/>
+                <w:sz w:val="28"/>
+                <w:szCs w:val="28"/>
+              </w:rPr>
+              <w:t>danh</w:t>
+            </w:r>
+            <w:proofErr w:type="spellEnd"/>
+            <w:r>
+              <w:rPr>
+                <w:rFonts w:ascii="Times New Roman" w:hAnsi="Times New Roman"/>
+                <w:sz w:val="28"/>
+                <w:szCs w:val="28"/>
+              </w:rPr>
+              <w:t xml:space="preserve"> </w:t>
+            </w:r>
+            <w:proofErr w:type="spellStart"/>
+            <w:r>
+              <w:rPr>
+                <w:rFonts w:ascii="Times New Roman" w:hAnsi="Times New Roman"/>
+                <w:sz w:val="28"/>
+                <w:szCs w:val="28"/>
+              </w:rPr>
+              <w:t>sách</w:t>
+            </w:r>
+            <w:proofErr w:type="spellEnd"/>
+            <w:r>
+              <w:rPr>
+                <w:rFonts w:ascii="Times New Roman" w:hAnsi="Times New Roman"/>
+                <w:sz w:val="28"/>
+                <w:szCs w:val="28"/>
+              </w:rPr>
+              <w:t xml:space="preserve"> </w:t>
+            </w:r>
+            <w:proofErr w:type="spellStart"/>
+            <w:r>
+              <w:rPr>
+                <w:rFonts w:ascii="Times New Roman" w:hAnsi="Times New Roman"/>
+                <w:sz w:val="28"/>
+                <w:szCs w:val="28"/>
+              </w:rPr>
+              <w:t>các</w:t>
+            </w:r>
+            <w:proofErr w:type="spellEnd"/>
+            <w:r>
+              <w:rPr>
+                <w:rFonts w:ascii="Times New Roman" w:hAnsi="Times New Roman"/>
+                <w:sz w:val="28"/>
+                <w:szCs w:val="28"/>
+              </w:rPr>
+              <w:t xml:space="preserve"> </w:t>
+            </w:r>
+            <w:proofErr w:type="spellStart"/>
+            <w:r>
+              <w:rPr>
+                <w:rFonts w:ascii="Times New Roman" w:hAnsi="Times New Roman"/>
+                <w:sz w:val="28"/>
+                <w:szCs w:val="28"/>
+              </w:rPr>
+              <w:t>đề</w:t>
+            </w:r>
+            <w:proofErr w:type="spellEnd"/>
+            <w:r>
+              <w:rPr>
+                <w:rFonts w:ascii="Times New Roman" w:hAnsi="Times New Roman"/>
+                <w:sz w:val="28"/>
+                <w:szCs w:val="28"/>
+              </w:rPr>
+              <w:t xml:space="preserve"> </w:t>
+            </w:r>
+            <w:proofErr w:type="spellStart"/>
+            <w:r>
+              <w:rPr>
+                <w:rFonts w:ascii="Times New Roman" w:hAnsi="Times New Roman"/>
+                <w:sz w:val="28"/>
+                <w:szCs w:val="28"/>
+              </w:rPr>
+              <w:t>tài</w:t>
+            </w:r>
+            <w:proofErr w:type="spellEnd"/>
+            <w:r>
+              <w:rPr>
+                <w:rFonts w:ascii="Times New Roman" w:hAnsi="Times New Roman"/>
+                <w:sz w:val="28"/>
+                <w:szCs w:val="28"/>
+              </w:rPr>
+              <w:t xml:space="preserve"> </w:t>
+            </w:r>
+            <w:proofErr w:type="spellStart"/>
+            <w:r>
+              <w:rPr>
+                <w:rFonts w:ascii="Times New Roman" w:hAnsi="Times New Roman"/>
+                <w:sz w:val="28"/>
+                <w:szCs w:val="28"/>
+              </w:rPr>
+              <w:t>đồ</w:t>
+            </w:r>
+            <w:proofErr w:type="spellEnd"/>
+            <w:r>
+              <w:rPr>
+                <w:rFonts w:ascii="Times New Roman" w:hAnsi="Times New Roman"/>
+                <w:sz w:val="28"/>
+                <w:szCs w:val="28"/>
+              </w:rPr>
+              <w:t xml:space="preserve"> </w:t>
+            </w:r>
+            <w:proofErr w:type="spellStart"/>
+            <w:r>
+              <w:rPr>
+                <w:rFonts w:ascii="Times New Roman" w:hAnsi="Times New Roman"/>
+                <w:sz w:val="28"/>
+                <w:szCs w:val="28"/>
+              </w:rPr>
+              <w:t>án</w:t>
+            </w:r>
+            <w:proofErr w:type="spellEnd"/>
+            <w:r>
+              <w:rPr>
+                <w:rFonts w:ascii="Times New Roman" w:hAnsi="Times New Roman"/>
+                <w:sz w:val="28"/>
+                <w:szCs w:val="28"/>
+              </w:rPr>
+              <w:t xml:space="preserve">. </w:t>
+            </w:r>
+          </w:p>
+          <w:p>
+            <w:pPr>
+              <w:rPr>
+                <w:rFonts w:ascii="Times New Roman" w:hAnsi="Times New Roman"/>
+                <w:sz w:val="28"/>
+                <w:szCs w:val="28"/>
+              </w:rPr>
+            </w:pPr>
+            <w:proofErr w:type="spellStart"/>
+            <w:r>
+              <w:rPr>
+                <w:rFonts w:ascii="Times New Roman" w:hAnsi="Times New Roman"/>
+                <w:sz w:val="28"/>
+                <w:szCs w:val="28"/>
+              </w:rPr>
+              <w:t>Lựa</w:t>
+            </w:r>
+            <w:proofErr w:type="spellEnd"/>
+            <w:r>
+              <w:rPr>
+                <w:rFonts w:ascii="Times New Roman" w:hAnsi="Times New Roman"/>
+                <w:sz w:val="28"/>
+                <w:szCs w:val="28"/>
+              </w:rPr>
+              <w:t xml:space="preserve"> </w:t>
+            </w:r>
+            <w:proofErr w:type="spellStart"/>
+            <w:r>
+              <w:rPr>
+                <w:rFonts w:ascii="Times New Roman" w:hAnsi="Times New Roman"/>
+                <w:sz w:val="28"/>
+                <w:szCs w:val="28"/>
+              </w:rPr>
+              <w:t>chọn</w:t>
+            </w:r>
+            <w:proofErr w:type="spellEnd"/>
+            <w:r>
+              <w:rPr>
+                <w:rFonts w:ascii="Times New Roman" w:hAnsi="Times New Roman"/>
+                <w:sz w:val="28"/>
+                <w:szCs w:val="28"/>
+              </w:rPr>
+              <w:t xml:space="preserve"> </w:t>
+            </w:r>
+            <w:proofErr w:type="spellStart"/>
+            <w:r>
+              <w:rPr>
+                <w:rFonts w:ascii="Times New Roman" w:hAnsi="Times New Roman"/>
+                <w:sz w:val="28"/>
+                <w:szCs w:val="28"/>
+              </w:rPr>
+              <w:t>đề</w:t>
+            </w:r>
+            <w:proofErr w:type="spellEnd"/>
+            <w:r>
+              <w:rPr>
+                <w:rFonts w:ascii="Times New Roman" w:hAnsi="Times New Roman"/>
+                <w:sz w:val="28"/>
+                <w:szCs w:val="28"/>
+              </w:rPr>
+              <w:t xml:space="preserve"> </w:t>
+            </w:r>
+            <w:proofErr w:type="spellStart"/>
+            <w:r>
+              <w:rPr>
+                <w:rFonts w:ascii="Times New Roman" w:hAnsi="Times New Roman"/>
+                <w:sz w:val="28"/>
+                <w:szCs w:val="28"/>
+              </w:rPr>
+              <w:t>tài</w:t>
+            </w:r>
+            <w:proofErr w:type="spellEnd"/>
+            <w:r>
+              <w:rPr>
+                <w:rFonts w:ascii="Times New Roman" w:hAnsi="Times New Roman"/>
+                <w:sz w:val="28"/>
+                <w:szCs w:val="28"/>
+              </w:rPr>
+              <w:t xml:space="preserve"> </w:t>
+            </w:r>
+            <w:proofErr w:type="spellStart"/>
+            <w:r>
+              <w:rPr>
+                <w:rFonts w:ascii="Times New Roman" w:hAnsi="Times New Roman"/>
+                <w:sz w:val="28"/>
+                <w:szCs w:val="28"/>
+              </w:rPr>
+              <w:t>phù</w:t>
+            </w:r>
+            <w:proofErr w:type="spellEnd"/>
+            <w:r>
+              <w:rPr>
+                <w:rFonts w:ascii="Times New Roman" w:hAnsi="Times New Roman"/>
+                <w:sz w:val="28"/>
+                <w:szCs w:val="28"/>
+              </w:rPr>
+              <w:t xml:space="preserve"> </w:t>
+            </w:r>
+            <w:proofErr w:type="spellStart"/>
+            <w:r>
+              <w:rPr>
+                <w:rFonts w:ascii="Times New Roman" w:hAnsi="Times New Roman"/>
+                <w:sz w:val="28"/>
+                <w:szCs w:val="28"/>
+              </w:rPr>
+              <w:t>hợp</w:t>
+            </w:r>
+            <w:proofErr w:type="spellEnd"/>
+            <w:r>
+              <w:rPr>
+                <w:rFonts w:ascii="Times New Roman" w:hAnsi="Times New Roman"/>
+                <w:sz w:val="28"/>
+                <w:szCs w:val="28"/>
+              </w:rPr>
+              <w:t>.</w:t>
+            </w:r>
+          </w:p>
+        </w:tc>
+        <w:tc>
+          <w:tcPr>
+            <w:tcW w:w="2700" w:type="dxa"/>
+          </w:tcPr>
+          <w:p>
+            <w:pPr>
+              <w:rPr>
+                <w:rFonts w:ascii="Times New Roman" w:hAnsi="Times New Roman"/>
+                <w:sz w:val="28"/>
+                <w:szCs w:val="28"/>
+              </w:rPr>
+            </w:pPr>
+            <w:proofErr w:type="spellStart"/>
+            <w:r>
+              <w:rPr>
+                <w:rFonts w:ascii="Times New Roman" w:hAnsi="Times New Roman"/>
+                <w:sz w:val="28"/>
+                <w:szCs w:val="28"/>
+              </w:rPr>
+              <w:t>Lựa</w:t>
+            </w:r>
+            <w:proofErr w:type="spellEnd"/>
+            <w:r>
+              <w:rPr>
+                <w:rFonts w:ascii="Times New Roman" w:hAnsi="Times New Roman"/>
+                <w:sz w:val="28"/>
+                <w:szCs w:val="28"/>
+              </w:rPr>
+              <w:t xml:space="preserve"> </w:t>
+            </w:r>
+            <w:proofErr w:type="spellStart"/>
+            <w:r>
+              <w:rPr>
+                <w:rFonts w:ascii="Times New Roman" w:hAnsi="Times New Roman"/>
+                <w:sz w:val="28"/>
+                <w:szCs w:val="28"/>
+              </w:rPr>
+              <w:t>chọn</w:t>
+            </w:r>
+            <w:proofErr w:type="spellEnd"/>
+            <w:r>
+              <w:rPr>
+                <w:rFonts w:ascii="Times New Roman" w:hAnsi="Times New Roman"/>
+                <w:sz w:val="28"/>
+                <w:szCs w:val="28"/>
+              </w:rPr>
+              <w:t xml:space="preserve"> </w:t>
+            </w:r>
+            <w:proofErr w:type="spellStart"/>
+            <w:r>
+              <w:rPr>
+                <w:rFonts w:ascii="Times New Roman" w:hAnsi="Times New Roman"/>
+                <w:sz w:val="28"/>
+                <w:szCs w:val="28"/>
+              </w:rPr>
+              <w:t>được</w:t>
+            </w:r>
+            <w:proofErr w:type="spellEnd"/>
+            <w:r>
+              <w:rPr>
+                <w:rFonts w:ascii="Times New Roman" w:hAnsi="Times New Roman"/>
+                <w:sz w:val="28"/>
+                <w:szCs w:val="28"/>
+              </w:rPr>
+              <w:t xml:space="preserve"> </w:t>
+            </w:r>
+            <w:proofErr w:type="spellStart"/>
+            <w:r>
+              <w:rPr>
+                <w:rFonts w:ascii="Times New Roman" w:hAnsi="Times New Roman"/>
+                <w:sz w:val="28"/>
+                <w:szCs w:val="28"/>
+              </w:rPr>
+              <w:t>đề</w:t>
+            </w:r>
+            <w:proofErr w:type="spellEnd"/>
+            <w:r>
+              <w:rPr>
+                <w:rFonts w:ascii="Times New Roman" w:hAnsi="Times New Roman"/>
+                <w:sz w:val="28"/>
+                <w:szCs w:val="28"/>
+              </w:rPr>
+              <w:t xml:space="preserve"> </w:t>
+            </w:r>
+            <w:proofErr w:type="spellStart"/>
+            <w:r>
+              <w:rPr>
+                <w:rFonts w:ascii="Times New Roman" w:hAnsi="Times New Roman"/>
+                <w:sz w:val="28"/>
+                <w:szCs w:val="28"/>
+              </w:rPr>
+              <w:t>tài</w:t>
+            </w:r>
+            <w:proofErr w:type="spellEnd"/>
+            <w:r>
+              <w:rPr>
+                <w:rFonts w:ascii="Times New Roman" w:hAnsi="Times New Roman"/>
+                <w:sz w:val="28"/>
+                <w:szCs w:val="28"/>
+              </w:rPr>
+              <w:t xml:space="preserve"> </w:t>
+            </w:r>
+            <w:proofErr w:type="spellStart"/>
+            <w:r>
+              <w:rPr>
+                <w:rFonts w:ascii="Times New Roman" w:hAnsi="Times New Roman"/>
+                <w:sz w:val="28"/>
+                <w:szCs w:val="28"/>
+              </w:rPr>
+              <w:t>đồ</w:t>
+            </w:r>
+            <w:proofErr w:type="spellEnd"/>
+            <w:r>
+              <w:rPr>
+                <w:rFonts w:ascii="Times New Roman" w:hAnsi="Times New Roman"/>
+                <w:sz w:val="28"/>
+                <w:szCs w:val="28"/>
+              </w:rPr>
+              <w:t xml:space="preserve"> </w:t>
+            </w:r>
+            <w:proofErr w:type="spellStart"/>
+            <w:r>
+              <w:rPr>
+                <w:rFonts w:ascii="Times New Roman" w:hAnsi="Times New Roman"/>
+                <w:sz w:val="28"/>
+                <w:szCs w:val="28"/>
+              </w:rPr>
+              <w:t>án</w:t>
+            </w:r>
+            <w:proofErr w:type="spellEnd"/>
+            <w:r>
+              <w:rPr>
+                <w:rFonts w:ascii="Times New Roman" w:hAnsi="Times New Roman"/>
+                <w:sz w:val="28"/>
+                <w:szCs w:val="28"/>
+              </w:rPr>
+              <w:t>.</w:t>
+            </w:r>
+          </w:p>
+        </w:tc>
+      </w:tr>
+      <w:tr>
+        <w:tc>
+          <w:tcPr>
+            <w:tcW w:w="2265" w:type="dxa"/>
+          </w:tcPr>
+          <w:p>
+            <w:pPr>
+              <w:rPr>
+                <w:rFonts w:ascii="Times New Roman" w:hAnsi="Times New Roman"/>
+                <w:sz w:val="28"/>
+                <w:szCs w:val="28"/>
+              </w:rPr>
+            </w:pPr>
+            <w:r>
+              <w:rPr>
+                <w:rFonts w:ascii="Times New Roman" w:hAnsi="Times New Roman"/>
+                <w:sz w:val="28"/>
+                <w:szCs w:val="28"/>
+              </w:rPr>
+              <w:t>24/03/2025-30/03/2025</w:t>
+            </w:r>
+          </w:p>
+        </w:tc>
+        <w:tc>
+          <w:tcPr>
+            <w:tcW w:w="4300" w:type="dxa"/>
+          </w:tcPr>
+          <w:p>
+            <w:pPr>
+              <w:rPr>
+                <w:rFonts w:ascii="Times New Roman" w:hAnsi="Times New Roman"/>
+                <w:sz w:val="28"/>
+                <w:szCs w:val="28"/>
+              </w:rPr>
+            </w:pPr>
+            <w:proofErr w:type="spellStart"/>
+            <w:r>
+              <w:rPr>
+                <w:rFonts w:ascii="Times New Roman" w:hAnsi="Times New Roman"/>
+                <w:sz w:val="28"/>
+                <w:szCs w:val="28"/>
+              </w:rPr>
+              <w:t>Khảo</w:t>
+            </w:r>
+            <w:proofErr w:type="spellEnd"/>
+            <w:r>
+              <w:rPr>
+                <w:rFonts w:ascii="Times New Roman" w:hAnsi="Times New Roman"/>
+                <w:sz w:val="28"/>
+                <w:szCs w:val="28"/>
+              </w:rPr>
+              <w:t xml:space="preserve"> </w:t>
+            </w:r>
+            <w:proofErr w:type="spellStart"/>
+            <w:r>
+              <w:rPr>
+                <w:rFonts w:ascii="Times New Roman" w:hAnsi="Times New Roman"/>
+                <w:sz w:val="28"/>
+                <w:szCs w:val="28"/>
+              </w:rPr>
+              <w:t>sát</w:t>
+            </w:r>
+            <w:proofErr w:type="spellEnd"/>
+            <w:r>
+              <w:rPr>
+                <w:rFonts w:ascii="Times New Roman" w:hAnsi="Times New Roman"/>
+                <w:sz w:val="28"/>
+                <w:szCs w:val="28"/>
+              </w:rPr>
+              <w:t xml:space="preserve"> </w:t>
+            </w:r>
+            <w:proofErr w:type="spellStart"/>
+            <w:r>
+              <w:rPr>
+                <w:rFonts w:ascii="Times New Roman" w:hAnsi="Times New Roman"/>
+                <w:sz w:val="28"/>
+                <w:szCs w:val="28"/>
+              </w:rPr>
+              <w:t>các</w:t>
+            </w:r>
+            <w:proofErr w:type="spellEnd"/>
+            <w:r>
+              <w:rPr>
+                <w:rFonts w:ascii="Times New Roman" w:hAnsi="Times New Roman"/>
+                <w:sz w:val="28"/>
+                <w:szCs w:val="28"/>
+              </w:rPr>
+              <w:t xml:space="preserve"> </w:t>
+            </w:r>
+            <w:proofErr w:type="spellStart"/>
+            <w:r>
+              <w:rPr>
+                <w:rFonts w:ascii="Times New Roman" w:hAnsi="Times New Roman"/>
+                <w:sz w:val="28"/>
+                <w:szCs w:val="28"/>
+              </w:rPr>
+              <w:t>phần</w:t>
+            </w:r>
+            <w:proofErr w:type="spellEnd"/>
+            <w:r>
+              <w:rPr>
+                <w:rFonts w:ascii="Times New Roman" w:hAnsi="Times New Roman"/>
+                <w:sz w:val="28"/>
+                <w:szCs w:val="28"/>
+              </w:rPr>
+              <w:t xml:space="preserve"> </w:t>
+            </w:r>
+            <w:proofErr w:type="spellStart"/>
+            <w:r>
+              <w:rPr>
+                <w:rFonts w:ascii="Times New Roman" w:hAnsi="Times New Roman"/>
+                <w:sz w:val="28"/>
+                <w:szCs w:val="28"/>
+              </w:rPr>
+              <w:t>mềm</w:t>
+            </w:r>
+            <w:proofErr w:type="spellEnd"/>
+            <w:r>
+              <w:rPr>
+                <w:rFonts w:ascii="Times New Roman" w:hAnsi="Times New Roman"/>
+                <w:sz w:val="28"/>
+                <w:szCs w:val="28"/>
+              </w:rPr>
+              <w:t xml:space="preserve"> </w:t>
+            </w:r>
+            <w:proofErr w:type="spellStart"/>
+            <w:r>
+              <w:rPr>
+                <w:rFonts w:ascii="Times New Roman" w:hAnsi="Times New Roman"/>
+                <w:sz w:val="28"/>
+                <w:szCs w:val="28"/>
+              </w:rPr>
+              <w:t>phù</w:t>
+            </w:r>
+            <w:proofErr w:type="spellEnd"/>
+            <w:r>
+              <w:rPr>
+                <w:rFonts w:ascii="Times New Roman" w:hAnsi="Times New Roman"/>
+                <w:sz w:val="28"/>
+                <w:szCs w:val="28"/>
+              </w:rPr>
+              <w:t xml:space="preserve"> </w:t>
+            </w:r>
+            <w:proofErr w:type="spellStart"/>
+            <w:r>
+              <w:rPr>
+                <w:rFonts w:ascii="Times New Roman" w:hAnsi="Times New Roman"/>
+                <w:sz w:val="28"/>
+                <w:szCs w:val="28"/>
+              </w:rPr>
+              <w:t>hợp</w:t>
+            </w:r>
+            <w:proofErr w:type="spellEnd"/>
+            <w:r>
+              <w:rPr>
+                <w:rFonts w:ascii="Times New Roman" w:hAnsi="Times New Roman"/>
+                <w:sz w:val="28"/>
+                <w:szCs w:val="28"/>
+              </w:rPr>
+              <w:t xml:space="preserve"> </w:t>
+            </w:r>
+            <w:proofErr w:type="spellStart"/>
+            <w:r>
+              <w:rPr>
+                <w:rFonts w:ascii="Times New Roman" w:hAnsi="Times New Roman"/>
+                <w:sz w:val="28"/>
+                <w:szCs w:val="28"/>
+              </w:rPr>
+              <w:t>với</w:t>
+            </w:r>
+            <w:proofErr w:type="spellEnd"/>
+            <w:r>
+              <w:rPr>
+                <w:rFonts w:ascii="Times New Roman" w:hAnsi="Times New Roman"/>
+                <w:sz w:val="28"/>
+                <w:szCs w:val="28"/>
+              </w:rPr>
+              <w:t xml:space="preserve"> </w:t>
+            </w:r>
+            <w:proofErr w:type="spellStart"/>
+            <w:r>
+              <w:rPr>
+                <w:rFonts w:ascii="Times New Roman" w:hAnsi="Times New Roman"/>
+                <w:sz w:val="28"/>
+                <w:szCs w:val="28"/>
+              </w:rPr>
+              <w:t>dự</w:t>
+            </w:r>
+            <w:proofErr w:type="spellEnd"/>
+            <w:r>
+              <w:rPr>
+                <w:rFonts w:ascii="Times New Roman" w:hAnsi="Times New Roman"/>
+                <w:sz w:val="28"/>
+                <w:szCs w:val="28"/>
+              </w:rPr>
+              <w:t xml:space="preserve"> </w:t>
+            </w:r>
+            <w:proofErr w:type="spellStart"/>
+            <w:r>
+              <w:rPr>
+                <w:rFonts w:ascii="Times New Roman" w:hAnsi="Times New Roman"/>
+                <w:sz w:val="28"/>
+                <w:szCs w:val="28"/>
+              </w:rPr>
+              <w:t>án</w:t>
+            </w:r>
+            <w:proofErr w:type="spellEnd"/>
+            <w:r>
+              <w:rPr>
+                <w:rFonts w:ascii="Times New Roman" w:hAnsi="Times New Roman"/>
+                <w:sz w:val="28"/>
+                <w:szCs w:val="28"/>
+              </w:rPr>
+              <w:t>.</w:t>
+            </w:r>
+          </w:p>
+          <w:p>
+            <w:pPr>
+              <w:rPr>
+                <w:rFonts w:ascii="Times New Roman" w:hAnsi="Times New Roman"/>
+                <w:sz w:val="28"/>
+                <w:szCs w:val="28"/>
+              </w:rPr>
+            </w:pPr>
+            <w:proofErr w:type="spellStart"/>
+            <w:r>
+              <w:rPr>
+                <w:rFonts w:ascii="Times New Roman" w:hAnsi="Times New Roman"/>
+                <w:sz w:val="28"/>
+                <w:szCs w:val="28"/>
+              </w:rPr>
+              <w:t>Phân</w:t>
+            </w:r>
+            <w:proofErr w:type="spellEnd"/>
+            <w:r>
+              <w:rPr>
+                <w:rFonts w:ascii="Times New Roman" w:hAnsi="Times New Roman"/>
+                <w:sz w:val="28"/>
+                <w:szCs w:val="28"/>
+              </w:rPr>
+              <w:t xml:space="preserve"> </w:t>
+            </w:r>
+            <w:proofErr w:type="spellStart"/>
+            <w:r>
+              <w:rPr>
+                <w:rFonts w:ascii="Times New Roman" w:hAnsi="Times New Roman"/>
+                <w:sz w:val="28"/>
+                <w:szCs w:val="28"/>
+              </w:rPr>
+              <w:t>tích</w:t>
+            </w:r>
+            <w:proofErr w:type="spellEnd"/>
+            <w:r>
+              <w:rPr>
+                <w:rFonts w:ascii="Times New Roman" w:hAnsi="Times New Roman"/>
+                <w:sz w:val="28"/>
+                <w:szCs w:val="28"/>
+              </w:rPr>
+              <w:t xml:space="preserve"> </w:t>
+            </w:r>
+            <w:proofErr w:type="spellStart"/>
+            <w:r>
+              <w:rPr>
+                <w:rFonts w:ascii="Times New Roman" w:hAnsi="Times New Roman"/>
+                <w:sz w:val="28"/>
+                <w:szCs w:val="28"/>
+              </w:rPr>
+              <w:t>thiết</w:t>
+            </w:r>
+            <w:proofErr w:type="spellEnd"/>
+            <w:r>
+              <w:rPr>
+                <w:rFonts w:ascii="Times New Roman" w:hAnsi="Times New Roman"/>
+                <w:sz w:val="28"/>
+                <w:szCs w:val="28"/>
+              </w:rPr>
+              <w:t xml:space="preserve"> </w:t>
+            </w:r>
+            <w:proofErr w:type="spellStart"/>
+            <w:r>
+              <w:rPr>
+                <w:rFonts w:ascii="Times New Roman" w:hAnsi="Times New Roman"/>
+                <w:sz w:val="28"/>
+                <w:szCs w:val="28"/>
+              </w:rPr>
+              <w:t>kế</w:t>
+            </w:r>
+            <w:proofErr w:type="spellEnd"/>
+            <w:r>
+              <w:rPr>
+                <w:rFonts w:ascii="Times New Roman" w:hAnsi="Times New Roman"/>
+                <w:sz w:val="28"/>
+                <w:szCs w:val="28"/>
+              </w:rPr>
+              <w:t xml:space="preserve"> </w:t>
+            </w:r>
+            <w:proofErr w:type="spellStart"/>
+            <w:r>
+              <w:rPr>
+                <w:rFonts w:ascii="Times New Roman" w:hAnsi="Times New Roman"/>
+                <w:sz w:val="28"/>
+                <w:szCs w:val="28"/>
+              </w:rPr>
+              <w:t>cơ</w:t>
+            </w:r>
+            <w:proofErr w:type="spellEnd"/>
+            <w:r>
+              <w:rPr>
+                <w:rFonts w:ascii="Times New Roman" w:hAnsi="Times New Roman"/>
+                <w:sz w:val="28"/>
+                <w:szCs w:val="28"/>
+              </w:rPr>
+              <w:t xml:space="preserve"> </w:t>
+            </w:r>
+            <w:proofErr w:type="spellStart"/>
+            <w:r>
+              <w:rPr>
+                <w:rFonts w:ascii="Times New Roman" w:hAnsi="Times New Roman"/>
+                <w:sz w:val="28"/>
+                <w:szCs w:val="28"/>
+              </w:rPr>
+              <w:t>sở</w:t>
+            </w:r>
+            <w:proofErr w:type="spellEnd"/>
+            <w:r>
+              <w:rPr>
+                <w:rFonts w:ascii="Times New Roman" w:hAnsi="Times New Roman"/>
+                <w:sz w:val="28"/>
+                <w:szCs w:val="28"/>
+              </w:rPr>
+              <w:t xml:space="preserve"> </w:t>
+            </w:r>
+            <w:proofErr w:type="spellStart"/>
+            <w:r>
+              <w:rPr>
+                <w:rFonts w:ascii="Times New Roman" w:hAnsi="Times New Roman"/>
+                <w:sz w:val="28"/>
+                <w:szCs w:val="28"/>
+              </w:rPr>
+              <w:t>dữ</w:t>
+            </w:r>
+            <w:proofErr w:type="spellEnd"/>
+            <w:r>
+              <w:rPr>
+                <w:rFonts w:ascii="Times New Roman" w:hAnsi="Times New Roman"/>
+                <w:sz w:val="28"/>
+                <w:szCs w:val="28"/>
+              </w:rPr>
+              <w:t xml:space="preserve"> </w:t>
+            </w:r>
+            <w:proofErr w:type="spellStart"/>
+            <w:r>
+              <w:rPr>
+                <w:rFonts w:ascii="Times New Roman" w:hAnsi="Times New Roman"/>
+                <w:sz w:val="28"/>
+                <w:szCs w:val="28"/>
+              </w:rPr>
+              <w:t>liệu</w:t>
+            </w:r>
+            <w:proofErr w:type="spellEnd"/>
+            <w:r>
+              <w:rPr>
+                <w:rFonts w:ascii="Times New Roman" w:hAnsi="Times New Roman"/>
+                <w:sz w:val="28"/>
+                <w:szCs w:val="28"/>
+              </w:rPr>
+              <w:t xml:space="preserve">, </w:t>
+            </w:r>
+            <w:proofErr w:type="spellStart"/>
+            <w:r>
+              <w:rPr>
+                <w:rFonts w:ascii="Times New Roman" w:hAnsi="Times New Roman"/>
+                <w:sz w:val="28"/>
+                <w:szCs w:val="28"/>
+              </w:rPr>
+              <w:t>thiết</w:t>
+            </w:r>
+            <w:proofErr w:type="spellEnd"/>
+            <w:r>
+              <w:rPr>
+                <w:rFonts w:ascii="Times New Roman" w:hAnsi="Times New Roman"/>
+                <w:sz w:val="28"/>
+                <w:szCs w:val="28"/>
+              </w:rPr>
+              <w:t xml:space="preserve"> </w:t>
+            </w:r>
+            <w:proofErr w:type="spellStart"/>
+            <w:r>
+              <w:rPr>
+                <w:rFonts w:ascii="Times New Roman" w:hAnsi="Times New Roman"/>
+                <w:sz w:val="28"/>
+                <w:szCs w:val="28"/>
+              </w:rPr>
+              <w:t>kế</w:t>
+            </w:r>
+            <w:proofErr w:type="spellEnd"/>
+            <w:r>
+              <w:rPr>
+                <w:rFonts w:ascii="Times New Roman" w:hAnsi="Times New Roman"/>
+                <w:sz w:val="28"/>
+                <w:szCs w:val="28"/>
+              </w:rPr>
+              <w:t xml:space="preserve"> </w:t>
+            </w:r>
+            <w:proofErr w:type="spellStart"/>
+            <w:r>
+              <w:rPr>
+                <w:rFonts w:ascii="Times New Roman" w:hAnsi="Times New Roman"/>
+                <w:sz w:val="28"/>
+                <w:szCs w:val="28"/>
+              </w:rPr>
+              <w:t>giao</w:t>
+            </w:r>
+            <w:proofErr w:type="spellEnd"/>
+            <w:r>
+              <w:rPr>
+                <w:rFonts w:ascii="Times New Roman" w:hAnsi="Times New Roman"/>
+                <w:sz w:val="28"/>
+                <w:szCs w:val="28"/>
+              </w:rPr>
+              <w:t xml:space="preserve"> </w:t>
+            </w:r>
+            <w:proofErr w:type="spellStart"/>
+            <w:r>
+              <w:rPr>
+                <w:rFonts w:ascii="Times New Roman" w:hAnsi="Times New Roman"/>
+                <w:sz w:val="28"/>
+                <w:szCs w:val="28"/>
+              </w:rPr>
+              <w:t>diện</w:t>
+            </w:r>
+            <w:proofErr w:type="spellEnd"/>
+            <w:r>
+              <w:rPr>
+                <w:rFonts w:ascii="Times New Roman" w:hAnsi="Times New Roman"/>
+                <w:sz w:val="28"/>
+                <w:szCs w:val="28"/>
+              </w:rPr>
+              <w:t xml:space="preserve"> </w:t>
+            </w:r>
+            <w:proofErr w:type="spellStart"/>
+            <w:r>
+              <w:rPr>
+                <w:rFonts w:ascii="Times New Roman" w:hAnsi="Times New Roman"/>
+                <w:sz w:val="28"/>
+                <w:szCs w:val="28"/>
+              </w:rPr>
+              <w:t>phần</w:t>
+            </w:r>
+            <w:proofErr w:type="spellEnd"/>
+            <w:r>
+              <w:rPr>
+                <w:rFonts w:ascii="Times New Roman" w:hAnsi="Times New Roman"/>
+                <w:sz w:val="28"/>
+                <w:szCs w:val="28"/>
+              </w:rPr>
+              <w:t xml:space="preserve"> </w:t>
+            </w:r>
+            <w:proofErr w:type="spellStart"/>
+            <w:r>
+              <w:rPr>
+                <w:rFonts w:ascii="Times New Roman" w:hAnsi="Times New Roman"/>
+                <w:sz w:val="28"/>
+                <w:szCs w:val="28"/>
+              </w:rPr>
+              <w:t>mềm</w:t>
+            </w:r>
+            <w:proofErr w:type="spellEnd"/>
+            <w:r>
+              <w:rPr>
+                <w:rFonts w:ascii="Times New Roman" w:hAnsi="Times New Roman"/>
+                <w:sz w:val="28"/>
+                <w:szCs w:val="28"/>
+              </w:rPr>
+              <w:t>.</w:t>
+            </w:r>
+          </w:p>
+        </w:tc>
+        <w:tc>
+          <w:tcPr>
+            <w:tcW w:w="2700" w:type="dxa"/>
+          </w:tcPr>
+          <w:p>
+            <w:pPr>
+              <w:rPr>
+                <w:rFonts w:ascii="Times New Roman" w:hAnsi="Times New Roman"/>
+                <w:sz w:val="28"/>
+                <w:szCs w:val="28"/>
+              </w:rPr>
+            </w:pPr>
+            <w:proofErr w:type="spellStart"/>
+            <w:r>
+              <w:rPr>
+                <w:rFonts w:ascii="Times New Roman" w:hAnsi="Times New Roman"/>
+                <w:sz w:val="28"/>
+                <w:szCs w:val="28"/>
+              </w:rPr>
+              <w:t>Xây</w:t>
+            </w:r>
+            <w:proofErr w:type="spellEnd"/>
+            <w:r>
+              <w:rPr>
+                <w:rFonts w:ascii="Times New Roman" w:hAnsi="Times New Roman"/>
+                <w:sz w:val="28"/>
+                <w:szCs w:val="28"/>
+              </w:rPr>
+              <w:t xml:space="preserve"> </w:t>
+            </w:r>
+            <w:proofErr w:type="spellStart"/>
+            <w:r>
+              <w:rPr>
+                <w:rFonts w:ascii="Times New Roman" w:hAnsi="Times New Roman"/>
+                <w:sz w:val="28"/>
+                <w:szCs w:val="28"/>
+              </w:rPr>
+              <w:t>dựng</w:t>
+            </w:r>
+            <w:proofErr w:type="spellEnd"/>
+            <w:r>
+              <w:rPr>
+                <w:rFonts w:ascii="Times New Roman" w:hAnsi="Times New Roman"/>
+                <w:sz w:val="28"/>
+                <w:szCs w:val="28"/>
+              </w:rPr>
+              <w:t xml:space="preserve"> </w:t>
+            </w:r>
+            <w:proofErr w:type="spellStart"/>
+            <w:r>
+              <w:rPr>
+                <w:rFonts w:ascii="Times New Roman" w:hAnsi="Times New Roman"/>
+                <w:sz w:val="28"/>
+                <w:szCs w:val="28"/>
+              </w:rPr>
+              <w:t>bảng</w:t>
+            </w:r>
+            <w:proofErr w:type="spellEnd"/>
+            <w:r>
+              <w:rPr>
+                <w:rFonts w:ascii="Times New Roman" w:hAnsi="Times New Roman"/>
+                <w:sz w:val="28"/>
+                <w:szCs w:val="28"/>
+              </w:rPr>
+              <w:t xml:space="preserve"> </w:t>
+            </w:r>
+            <w:proofErr w:type="spellStart"/>
+            <w:r>
+              <w:rPr>
+                <w:rFonts w:ascii="Times New Roman" w:hAnsi="Times New Roman"/>
+                <w:sz w:val="28"/>
+                <w:szCs w:val="28"/>
+              </w:rPr>
+              <w:t>thiết</w:t>
+            </w:r>
+            <w:proofErr w:type="spellEnd"/>
+            <w:r>
+              <w:rPr>
+                <w:rFonts w:ascii="Times New Roman" w:hAnsi="Times New Roman"/>
+                <w:sz w:val="28"/>
+                <w:szCs w:val="28"/>
+              </w:rPr>
+              <w:t xml:space="preserve"> </w:t>
+            </w:r>
+            <w:proofErr w:type="spellStart"/>
+            <w:r>
+              <w:rPr>
+                <w:rFonts w:ascii="Times New Roman" w:hAnsi="Times New Roman"/>
+                <w:sz w:val="28"/>
+                <w:szCs w:val="28"/>
+              </w:rPr>
+              <w:t>kế</w:t>
+            </w:r>
+            <w:proofErr w:type="spellEnd"/>
+            <w:r>
+              <w:rPr>
+                <w:rFonts w:ascii="Times New Roman" w:hAnsi="Times New Roman"/>
+                <w:sz w:val="28"/>
+                <w:szCs w:val="28"/>
+              </w:rPr>
+              <w:t xml:space="preserve"> </w:t>
+            </w:r>
+            <w:proofErr w:type="spellStart"/>
+            <w:r>
+              <w:rPr>
+                <w:rFonts w:ascii="Times New Roman" w:hAnsi="Times New Roman"/>
+                <w:sz w:val="28"/>
+                <w:szCs w:val="28"/>
+              </w:rPr>
+              <w:t>dữ</w:t>
+            </w:r>
+            <w:proofErr w:type="spellEnd"/>
+            <w:r>
+              <w:rPr>
+                <w:rFonts w:ascii="Times New Roman" w:hAnsi="Times New Roman"/>
+                <w:sz w:val="28"/>
+                <w:szCs w:val="28"/>
+              </w:rPr>
+              <w:t xml:space="preserve"> </w:t>
+            </w:r>
+            <w:proofErr w:type="spellStart"/>
+            <w:r>
+              <w:rPr>
+                <w:rFonts w:ascii="Times New Roman" w:hAnsi="Times New Roman"/>
+                <w:sz w:val="28"/>
+                <w:szCs w:val="28"/>
+              </w:rPr>
+              <w:t>liệu</w:t>
+            </w:r>
+            <w:proofErr w:type="spellEnd"/>
+            <w:r>
+              <w:rPr>
+                <w:rFonts w:ascii="Times New Roman" w:hAnsi="Times New Roman"/>
+                <w:sz w:val="28"/>
+                <w:szCs w:val="28"/>
+              </w:rPr>
+              <w:t xml:space="preserve"> </w:t>
+            </w:r>
+            <w:proofErr w:type="spellStart"/>
+            <w:r>
+              <w:rPr>
+                <w:rFonts w:ascii="Times New Roman" w:hAnsi="Times New Roman"/>
+                <w:sz w:val="28"/>
+                <w:szCs w:val="28"/>
+              </w:rPr>
+              <w:t>mức</w:t>
+            </w:r>
+            <w:proofErr w:type="spellEnd"/>
+            <w:r>
+              <w:rPr>
+                <w:rFonts w:ascii="Times New Roman" w:hAnsi="Times New Roman"/>
+                <w:sz w:val="28"/>
+                <w:szCs w:val="28"/>
+              </w:rPr>
+              <w:t xml:space="preserve"> logic, </w:t>
+            </w:r>
+            <w:proofErr w:type="spellStart"/>
+            <w:r>
+              <w:rPr>
+                <w:rFonts w:ascii="Times New Roman" w:hAnsi="Times New Roman"/>
+                <w:sz w:val="28"/>
+                <w:szCs w:val="28"/>
+              </w:rPr>
+              <w:t>tài</w:t>
+            </w:r>
+            <w:proofErr w:type="spellEnd"/>
+            <w:r>
+              <w:rPr>
+                <w:rFonts w:ascii="Times New Roman" w:hAnsi="Times New Roman"/>
+                <w:sz w:val="28"/>
+                <w:szCs w:val="28"/>
+              </w:rPr>
+              <w:t xml:space="preserve"> </w:t>
+            </w:r>
+            <w:proofErr w:type="spellStart"/>
+            <w:r>
+              <w:rPr>
+                <w:rFonts w:ascii="Times New Roman" w:hAnsi="Times New Roman"/>
+                <w:sz w:val="28"/>
+                <w:szCs w:val="28"/>
+              </w:rPr>
+              <w:t>liệu</w:t>
+            </w:r>
+            <w:proofErr w:type="spellEnd"/>
+            <w:r>
+              <w:rPr>
+                <w:rFonts w:ascii="Times New Roman" w:hAnsi="Times New Roman"/>
+                <w:sz w:val="28"/>
+                <w:szCs w:val="28"/>
+              </w:rPr>
+              <w:t xml:space="preserve"> </w:t>
+            </w:r>
+            <w:proofErr w:type="spellStart"/>
+            <w:r>
+              <w:rPr>
+                <w:rFonts w:ascii="Times New Roman" w:hAnsi="Times New Roman"/>
+                <w:sz w:val="28"/>
+                <w:szCs w:val="28"/>
+              </w:rPr>
+              <w:t>khảo</w:t>
+            </w:r>
+            <w:proofErr w:type="spellEnd"/>
+            <w:r>
+              <w:rPr>
+                <w:rFonts w:ascii="Times New Roman" w:hAnsi="Times New Roman"/>
+                <w:sz w:val="28"/>
+                <w:szCs w:val="28"/>
+              </w:rPr>
+              <w:t xml:space="preserve"> </w:t>
+            </w:r>
+            <w:proofErr w:type="spellStart"/>
+            <w:r>
+              <w:rPr>
+                <w:rFonts w:ascii="Times New Roman" w:hAnsi="Times New Roman"/>
+                <w:sz w:val="28"/>
+                <w:szCs w:val="28"/>
+              </w:rPr>
+              <w:t>sát</w:t>
+            </w:r>
+            <w:proofErr w:type="spellEnd"/>
+            <w:r>
+              <w:rPr>
+                <w:rFonts w:ascii="Times New Roman" w:hAnsi="Times New Roman"/>
+                <w:sz w:val="28"/>
+                <w:szCs w:val="28"/>
+              </w:rPr>
+              <w:t xml:space="preserve"> </w:t>
+            </w:r>
+            <w:proofErr w:type="spellStart"/>
+            <w:r>
+              <w:rPr>
+                <w:rFonts w:ascii="Times New Roman" w:hAnsi="Times New Roman"/>
+                <w:sz w:val="28"/>
+                <w:szCs w:val="28"/>
+              </w:rPr>
+              <w:t>các</w:t>
+            </w:r>
+            <w:proofErr w:type="spellEnd"/>
+            <w:r>
+              <w:rPr>
+                <w:rFonts w:ascii="Times New Roman" w:hAnsi="Times New Roman"/>
+                <w:sz w:val="28"/>
+                <w:szCs w:val="28"/>
+              </w:rPr>
+              <w:t xml:space="preserve"> </w:t>
+            </w:r>
+            <w:proofErr w:type="spellStart"/>
+            <w:r>
+              <w:rPr>
+                <w:rFonts w:ascii="Times New Roman" w:hAnsi="Times New Roman"/>
+                <w:sz w:val="28"/>
+                <w:szCs w:val="28"/>
+              </w:rPr>
+              <w:t>chức</w:t>
+            </w:r>
+            <w:proofErr w:type="spellEnd"/>
+            <w:r>
+              <w:rPr>
+                <w:rFonts w:ascii="Times New Roman" w:hAnsi="Times New Roman"/>
+                <w:sz w:val="28"/>
+                <w:szCs w:val="28"/>
+              </w:rPr>
+              <w:t xml:space="preserve"> </w:t>
+            </w:r>
+            <w:proofErr w:type="spellStart"/>
+            <w:r>
+              <w:rPr>
+                <w:rFonts w:ascii="Times New Roman" w:hAnsi="Times New Roman"/>
+                <w:sz w:val="28"/>
+                <w:szCs w:val="28"/>
+              </w:rPr>
+              <w:t>năng</w:t>
+            </w:r>
+            <w:proofErr w:type="spellEnd"/>
+            <w:r>
+              <w:rPr>
+                <w:rFonts w:ascii="Times New Roman" w:hAnsi="Times New Roman"/>
+                <w:sz w:val="28"/>
+                <w:szCs w:val="28"/>
+              </w:rPr>
+              <w:t>.</w:t>
+            </w:r>
+          </w:p>
+        </w:tc>
+      </w:tr>
+      <w:tr>
+        <w:tc>
+          <w:tcPr>
+            <w:tcW w:w="2265" w:type="dxa"/>
+          </w:tcPr>
+          <w:p>
+            <w:pPr>
+              <w:rPr>
+                <w:rFonts w:ascii="Times New Roman" w:hAnsi="Times New Roman"/>
+                <w:sz w:val="28"/>
+                <w:szCs w:val="28"/>
+              </w:rPr>
+            </w:pPr>
+            <w:r>
+              <w:rPr>
+                <w:rFonts w:ascii="Times New Roman" w:hAnsi="Times New Roman"/>
+                <w:sz w:val="28"/>
+                <w:szCs w:val="28"/>
+              </w:rPr>
+              <w:t>31/03/2025-06/04/2025</w:t>
+            </w:r>
+          </w:p>
+        </w:tc>
+        <w:tc>
+          <w:tcPr>
+            <w:tcW w:w="4300" w:type="dxa"/>
+          </w:tcPr>
+          <w:p>
+            <w:pPr>
+              <w:rPr>
+                <w:rFonts w:ascii="Times New Roman" w:hAnsi="Times New Roman"/>
+                <w:sz w:val="28"/>
+                <w:szCs w:val="28"/>
+              </w:rPr>
+            </w:pPr>
+            <w:proofErr w:type="spellStart"/>
+            <w:r>
+              <w:rPr>
+                <w:rFonts w:ascii="Times New Roman" w:hAnsi="Times New Roman"/>
+                <w:sz w:val="28"/>
+                <w:szCs w:val="28"/>
+              </w:rPr>
+              <w:t>Ôn</w:t>
+            </w:r>
+            <w:proofErr w:type="spellEnd"/>
+            <w:r>
+              <w:rPr>
+                <w:rFonts w:ascii="Times New Roman" w:hAnsi="Times New Roman"/>
+                <w:sz w:val="28"/>
+                <w:szCs w:val="28"/>
+              </w:rPr>
+              <w:t xml:space="preserve"> </w:t>
+            </w:r>
+            <w:proofErr w:type="spellStart"/>
+            <w:r>
+              <w:rPr>
+                <w:rFonts w:ascii="Times New Roman" w:hAnsi="Times New Roman"/>
+                <w:sz w:val="28"/>
+                <w:szCs w:val="28"/>
+              </w:rPr>
+              <w:t>tập</w:t>
+            </w:r>
+            <w:proofErr w:type="spellEnd"/>
+            <w:r>
+              <w:rPr>
+                <w:rFonts w:ascii="Times New Roman" w:hAnsi="Times New Roman"/>
+                <w:sz w:val="28"/>
+                <w:szCs w:val="28"/>
+              </w:rPr>
+              <w:t xml:space="preserve"> </w:t>
+            </w:r>
+            <w:proofErr w:type="spellStart"/>
+            <w:r>
+              <w:rPr>
+                <w:rFonts w:ascii="Times New Roman" w:hAnsi="Times New Roman"/>
+                <w:sz w:val="28"/>
+                <w:szCs w:val="28"/>
+              </w:rPr>
+              <w:t>và</w:t>
+            </w:r>
+            <w:proofErr w:type="spellEnd"/>
+            <w:r>
+              <w:rPr>
+                <w:rFonts w:ascii="Times New Roman" w:hAnsi="Times New Roman"/>
+                <w:sz w:val="28"/>
+                <w:szCs w:val="28"/>
+              </w:rPr>
+              <w:t xml:space="preserve"> </w:t>
+            </w:r>
+            <w:proofErr w:type="spellStart"/>
+            <w:r>
+              <w:rPr>
+                <w:rFonts w:ascii="Times New Roman" w:hAnsi="Times New Roman"/>
+                <w:sz w:val="28"/>
+                <w:szCs w:val="28"/>
+              </w:rPr>
+              <w:t>củng</w:t>
+            </w:r>
+            <w:proofErr w:type="spellEnd"/>
+            <w:r>
+              <w:rPr>
+                <w:rFonts w:ascii="Times New Roman" w:hAnsi="Times New Roman"/>
+                <w:sz w:val="28"/>
+                <w:szCs w:val="28"/>
+              </w:rPr>
+              <w:t xml:space="preserve"> </w:t>
+            </w:r>
+            <w:proofErr w:type="spellStart"/>
+            <w:r>
+              <w:rPr>
+                <w:rFonts w:ascii="Times New Roman" w:hAnsi="Times New Roman"/>
+                <w:sz w:val="28"/>
+                <w:szCs w:val="28"/>
+              </w:rPr>
+              <w:t>cố</w:t>
+            </w:r>
+            <w:proofErr w:type="spellEnd"/>
+            <w:r>
+              <w:rPr>
+                <w:rFonts w:ascii="Times New Roman" w:hAnsi="Times New Roman"/>
+                <w:sz w:val="28"/>
+                <w:szCs w:val="28"/>
+              </w:rPr>
+              <w:t xml:space="preserve"> </w:t>
+            </w:r>
+            <w:proofErr w:type="spellStart"/>
+            <w:r>
+              <w:rPr>
+                <w:rFonts w:ascii="Times New Roman" w:hAnsi="Times New Roman"/>
+                <w:sz w:val="28"/>
+                <w:szCs w:val="28"/>
+              </w:rPr>
+              <w:t>kiến</w:t>
+            </w:r>
+            <w:proofErr w:type="spellEnd"/>
+            <w:r>
+              <w:rPr>
+                <w:rFonts w:ascii="Times New Roman" w:hAnsi="Times New Roman"/>
+                <w:sz w:val="28"/>
+                <w:szCs w:val="28"/>
+              </w:rPr>
+              <w:t xml:space="preserve"> </w:t>
+            </w:r>
+            <w:proofErr w:type="spellStart"/>
+            <w:r>
+              <w:rPr>
+                <w:rFonts w:ascii="Times New Roman" w:hAnsi="Times New Roman"/>
+                <w:sz w:val="28"/>
+                <w:szCs w:val="28"/>
+              </w:rPr>
+              <w:t>thức</w:t>
+            </w:r>
+            <w:proofErr w:type="spellEnd"/>
+            <w:r>
+              <w:rPr>
+                <w:rFonts w:ascii="Times New Roman" w:hAnsi="Times New Roman"/>
+                <w:sz w:val="28"/>
+                <w:szCs w:val="28"/>
+              </w:rPr>
+              <w:t xml:space="preserve"> </w:t>
+            </w:r>
+            <w:proofErr w:type="spellStart"/>
+            <w:r>
+              <w:rPr>
+                <w:rFonts w:ascii="Times New Roman" w:hAnsi="Times New Roman"/>
+                <w:sz w:val="28"/>
+                <w:szCs w:val="28"/>
+              </w:rPr>
+              <w:t>về</w:t>
+            </w:r>
+            <w:proofErr w:type="spellEnd"/>
+            <w:r>
+              <w:rPr>
+                <w:rFonts w:ascii="Times New Roman" w:hAnsi="Times New Roman"/>
+                <w:sz w:val="28"/>
+                <w:szCs w:val="28"/>
+              </w:rPr>
+              <w:t xml:space="preserve"> </w:t>
+            </w:r>
+            <w:proofErr w:type="spellStart"/>
+            <w:r>
+              <w:rPr>
+                <w:rFonts w:ascii="Times New Roman" w:hAnsi="Times New Roman"/>
+                <w:sz w:val="28"/>
+                <w:szCs w:val="28"/>
+              </w:rPr>
+              <w:t>lập</w:t>
+            </w:r>
+            <w:proofErr w:type="spellEnd"/>
+            <w:r>
+              <w:rPr>
+                <w:rFonts w:ascii="Times New Roman" w:hAnsi="Times New Roman"/>
+                <w:sz w:val="28"/>
+                <w:szCs w:val="28"/>
+              </w:rPr>
+              <w:t xml:space="preserve"> </w:t>
+            </w:r>
+            <w:proofErr w:type="spellStart"/>
+            <w:r>
+              <w:rPr>
+                <w:rFonts w:ascii="Times New Roman" w:hAnsi="Times New Roman"/>
+                <w:sz w:val="28"/>
+                <w:szCs w:val="28"/>
+              </w:rPr>
+              <w:t>trình</w:t>
+            </w:r>
+            <w:proofErr w:type="spellEnd"/>
+            <w:r>
+              <w:rPr>
+                <w:rFonts w:ascii="Times New Roman" w:hAnsi="Times New Roman"/>
+                <w:sz w:val="28"/>
+                <w:szCs w:val="28"/>
+              </w:rPr>
+              <w:t xml:space="preserve"> Android. </w:t>
+            </w:r>
+            <w:proofErr w:type="spellStart"/>
+            <w:r>
+              <w:rPr>
+                <w:rFonts w:ascii="Times New Roman" w:hAnsi="Times New Roman"/>
+                <w:sz w:val="28"/>
+                <w:szCs w:val="28"/>
+              </w:rPr>
+              <w:t>Tài</w:t>
+            </w:r>
+            <w:proofErr w:type="spellEnd"/>
+            <w:r>
+              <w:rPr>
+                <w:rFonts w:ascii="Times New Roman" w:hAnsi="Times New Roman"/>
+                <w:sz w:val="28"/>
+                <w:szCs w:val="28"/>
+              </w:rPr>
+              <w:t xml:space="preserve"> </w:t>
+            </w:r>
+            <w:proofErr w:type="spellStart"/>
+            <w:r>
+              <w:rPr>
+                <w:rFonts w:ascii="Times New Roman" w:hAnsi="Times New Roman"/>
+                <w:sz w:val="28"/>
+                <w:szCs w:val="28"/>
+              </w:rPr>
+              <w:t>liệu</w:t>
+            </w:r>
+            <w:proofErr w:type="spellEnd"/>
+            <w:r>
+              <w:rPr>
+                <w:rFonts w:ascii="Times New Roman" w:hAnsi="Times New Roman"/>
+                <w:sz w:val="28"/>
+                <w:szCs w:val="28"/>
+              </w:rPr>
+              <w:t xml:space="preserve"> </w:t>
+            </w:r>
+            <w:proofErr w:type="spellStart"/>
+            <w:r>
+              <w:rPr>
+                <w:rFonts w:ascii="Times New Roman" w:hAnsi="Times New Roman"/>
+                <w:sz w:val="28"/>
+                <w:szCs w:val="28"/>
+              </w:rPr>
+              <w:t>tham</w:t>
+            </w:r>
+            <w:proofErr w:type="spellEnd"/>
+            <w:r>
+              <w:rPr>
+                <w:rFonts w:ascii="Times New Roman" w:hAnsi="Times New Roman"/>
+                <w:sz w:val="28"/>
+                <w:szCs w:val="28"/>
+              </w:rPr>
+              <w:t xml:space="preserve"> </w:t>
+            </w:r>
+            <w:proofErr w:type="spellStart"/>
+            <w:r>
+              <w:rPr>
+                <w:rFonts w:ascii="Times New Roman" w:hAnsi="Times New Roman"/>
+                <w:sz w:val="28"/>
+                <w:szCs w:val="28"/>
+              </w:rPr>
+              <w:t>khảo</w:t>
+            </w:r>
+            <w:proofErr w:type="spellEnd"/>
+            <w:r>
+              <w:rPr>
+                <w:rFonts w:ascii="Times New Roman" w:hAnsi="Times New Roman"/>
+                <w:sz w:val="28"/>
+                <w:szCs w:val="28"/>
+              </w:rPr>
+              <w:t>: Hea</w:t>
+            </w:r>
+            <w:bookmarkStart w:id="0" w:name="_GoBack"/>
+            <w:bookmarkEnd w:id="0"/>
+            <w:r>
+              <w:rPr>
+                <w:rFonts w:ascii="Times New Roman" w:hAnsi="Times New Roman"/>
+                <w:sz w:val="28"/>
+                <w:szCs w:val="28"/>
+              </w:rPr>
+              <w:t>d First Android Development</w:t>
+            </w:r>
+          </w:p>
+        </w:tc>
+        <w:tc>
+          <w:tcPr>
+            <w:tcW w:w="2700" w:type="dxa"/>
+          </w:tcPr>
+          <w:p>
+            <w:pPr>
+              <w:rPr>
+                <w:rFonts w:ascii="Times New Roman" w:hAnsi="Times New Roman"/>
+                <w:sz w:val="28"/>
+                <w:szCs w:val="28"/>
+              </w:rPr>
+            </w:pPr>
+            <w:proofErr w:type="spellStart"/>
+            <w:r>
+              <w:rPr>
+                <w:rFonts w:ascii="Times New Roman" w:hAnsi="Times New Roman"/>
+                <w:sz w:val="28"/>
+                <w:szCs w:val="28"/>
+              </w:rPr>
+              <w:t>Củng</w:t>
+            </w:r>
+            <w:proofErr w:type="spellEnd"/>
+            <w:r>
+              <w:rPr>
+                <w:rFonts w:ascii="Times New Roman" w:hAnsi="Times New Roman"/>
+                <w:sz w:val="28"/>
+                <w:szCs w:val="28"/>
+              </w:rPr>
+              <w:t xml:space="preserve"> </w:t>
+            </w:r>
+            <w:proofErr w:type="spellStart"/>
+            <w:r>
+              <w:rPr>
+                <w:rFonts w:ascii="Times New Roman" w:hAnsi="Times New Roman"/>
+                <w:sz w:val="28"/>
+                <w:szCs w:val="28"/>
+              </w:rPr>
+              <w:t>cố</w:t>
+            </w:r>
+            <w:proofErr w:type="spellEnd"/>
+            <w:r>
+              <w:rPr>
+                <w:rFonts w:ascii="Times New Roman" w:hAnsi="Times New Roman"/>
+                <w:sz w:val="28"/>
+                <w:szCs w:val="28"/>
+              </w:rPr>
+              <w:t xml:space="preserve"> </w:t>
+            </w:r>
+            <w:proofErr w:type="spellStart"/>
+            <w:r>
+              <w:rPr>
+                <w:rFonts w:ascii="Times New Roman" w:hAnsi="Times New Roman"/>
+                <w:sz w:val="28"/>
+                <w:szCs w:val="28"/>
+              </w:rPr>
+              <w:t>và</w:t>
+            </w:r>
+            <w:proofErr w:type="spellEnd"/>
+            <w:r>
+              <w:rPr>
+                <w:rFonts w:ascii="Times New Roman" w:hAnsi="Times New Roman"/>
+                <w:sz w:val="28"/>
+                <w:szCs w:val="28"/>
+              </w:rPr>
+              <w:t xml:space="preserve"> </w:t>
+            </w:r>
+            <w:proofErr w:type="spellStart"/>
+            <w:r>
+              <w:rPr>
+                <w:rFonts w:ascii="Times New Roman" w:hAnsi="Times New Roman"/>
+                <w:sz w:val="28"/>
+                <w:szCs w:val="28"/>
+              </w:rPr>
+              <w:t>ôn</w:t>
+            </w:r>
+            <w:proofErr w:type="spellEnd"/>
+            <w:r>
+              <w:rPr>
+                <w:rFonts w:ascii="Times New Roman" w:hAnsi="Times New Roman"/>
+                <w:sz w:val="28"/>
+                <w:szCs w:val="28"/>
+              </w:rPr>
+              <w:t xml:space="preserve"> </w:t>
+            </w:r>
+            <w:proofErr w:type="spellStart"/>
+            <w:r>
+              <w:rPr>
+                <w:rFonts w:ascii="Times New Roman" w:hAnsi="Times New Roman"/>
+                <w:sz w:val="28"/>
+                <w:szCs w:val="28"/>
+              </w:rPr>
+              <w:t>tập</w:t>
+            </w:r>
+            <w:proofErr w:type="spellEnd"/>
+            <w:r>
+              <w:rPr>
+                <w:rFonts w:ascii="Times New Roman" w:hAnsi="Times New Roman"/>
+                <w:sz w:val="28"/>
+                <w:szCs w:val="28"/>
+              </w:rPr>
+              <w:t xml:space="preserve"> </w:t>
+            </w:r>
+            <w:proofErr w:type="spellStart"/>
+            <w:r>
+              <w:rPr>
+                <w:rFonts w:ascii="Times New Roman" w:hAnsi="Times New Roman"/>
+                <w:sz w:val="28"/>
+                <w:szCs w:val="28"/>
+              </w:rPr>
+              <w:t>lại</w:t>
+            </w:r>
+            <w:proofErr w:type="spellEnd"/>
+            <w:r>
+              <w:rPr>
+                <w:rFonts w:ascii="Times New Roman" w:hAnsi="Times New Roman"/>
+                <w:sz w:val="28"/>
+                <w:szCs w:val="28"/>
+              </w:rPr>
+              <w:t xml:space="preserve"> </w:t>
+            </w:r>
+            <w:proofErr w:type="spellStart"/>
+            <w:r>
+              <w:rPr>
+                <w:rFonts w:ascii="Times New Roman" w:hAnsi="Times New Roman"/>
+                <w:sz w:val="28"/>
+                <w:szCs w:val="28"/>
+              </w:rPr>
+              <w:t>các</w:t>
+            </w:r>
+            <w:proofErr w:type="spellEnd"/>
+            <w:r>
+              <w:rPr>
+                <w:rFonts w:ascii="Times New Roman" w:hAnsi="Times New Roman"/>
+                <w:sz w:val="28"/>
+                <w:szCs w:val="28"/>
+              </w:rPr>
+              <w:t xml:space="preserve"> </w:t>
+            </w:r>
+            <w:proofErr w:type="spellStart"/>
+            <w:r>
+              <w:rPr>
+                <w:rFonts w:ascii="Times New Roman" w:hAnsi="Times New Roman"/>
+                <w:sz w:val="28"/>
+                <w:szCs w:val="28"/>
+              </w:rPr>
+              <w:t>kiến</w:t>
+            </w:r>
+            <w:proofErr w:type="spellEnd"/>
+            <w:r>
+              <w:rPr>
+                <w:rFonts w:ascii="Times New Roman" w:hAnsi="Times New Roman"/>
+                <w:sz w:val="28"/>
+                <w:szCs w:val="28"/>
+              </w:rPr>
+              <w:t xml:space="preserve"> </w:t>
+            </w:r>
+            <w:proofErr w:type="spellStart"/>
+            <w:r>
+              <w:rPr>
+                <w:rFonts w:ascii="Times New Roman" w:hAnsi="Times New Roman"/>
+                <w:sz w:val="28"/>
+                <w:szCs w:val="28"/>
+              </w:rPr>
+              <w:t>thức</w:t>
+            </w:r>
+            <w:proofErr w:type="spellEnd"/>
+            <w:r>
+              <w:rPr>
+                <w:rFonts w:ascii="Times New Roman" w:hAnsi="Times New Roman"/>
+                <w:sz w:val="28"/>
+                <w:szCs w:val="28"/>
+              </w:rPr>
+              <w:t xml:space="preserve"> </w:t>
+            </w:r>
+            <w:proofErr w:type="spellStart"/>
+            <w:r>
+              <w:rPr>
+                <w:rFonts w:ascii="Times New Roman" w:hAnsi="Times New Roman"/>
+                <w:sz w:val="28"/>
+                <w:szCs w:val="28"/>
+              </w:rPr>
+              <w:t>cơ</w:t>
+            </w:r>
+            <w:proofErr w:type="spellEnd"/>
+            <w:r>
+              <w:rPr>
+                <w:rFonts w:ascii="Times New Roman" w:hAnsi="Times New Roman"/>
+                <w:sz w:val="28"/>
+                <w:szCs w:val="28"/>
+              </w:rPr>
+              <w:t xml:space="preserve"> </w:t>
+            </w:r>
+            <w:proofErr w:type="spellStart"/>
+            <w:r>
+              <w:rPr>
+                <w:rFonts w:ascii="Times New Roman" w:hAnsi="Times New Roman"/>
+                <w:sz w:val="28"/>
+                <w:szCs w:val="28"/>
+              </w:rPr>
+              <w:t>bản</w:t>
+            </w:r>
+            <w:proofErr w:type="spellEnd"/>
+            <w:r>
+              <w:rPr>
+                <w:rFonts w:ascii="Times New Roman" w:hAnsi="Times New Roman"/>
+                <w:sz w:val="28"/>
+                <w:szCs w:val="28"/>
+              </w:rPr>
+              <w:t xml:space="preserve"> </w:t>
+            </w:r>
+            <w:proofErr w:type="spellStart"/>
+            <w:r>
+              <w:rPr>
+                <w:rFonts w:ascii="Times New Roman" w:hAnsi="Times New Roman"/>
+                <w:sz w:val="28"/>
+                <w:szCs w:val="28"/>
+              </w:rPr>
+              <w:t>về</w:t>
+            </w:r>
+            <w:proofErr w:type="spellEnd"/>
+            <w:r>
+              <w:rPr>
+                <w:rFonts w:ascii="Times New Roman" w:hAnsi="Times New Roman"/>
+                <w:sz w:val="28"/>
+                <w:szCs w:val="28"/>
+              </w:rPr>
+              <w:t xml:space="preserve"> </w:t>
+            </w:r>
+            <w:proofErr w:type="spellStart"/>
+            <w:r>
+              <w:rPr>
+                <w:rFonts w:ascii="Times New Roman" w:hAnsi="Times New Roman"/>
+                <w:sz w:val="28"/>
+                <w:szCs w:val="28"/>
+              </w:rPr>
+              <w:t>lập</w:t>
+            </w:r>
+            <w:proofErr w:type="spellEnd"/>
+            <w:r>
+              <w:rPr>
+                <w:rFonts w:ascii="Times New Roman" w:hAnsi="Times New Roman"/>
+                <w:sz w:val="28"/>
+                <w:szCs w:val="28"/>
+              </w:rPr>
+              <w:t xml:space="preserve"> </w:t>
+            </w:r>
+            <w:proofErr w:type="spellStart"/>
+            <w:r>
+              <w:rPr>
+                <w:rFonts w:ascii="Times New Roman" w:hAnsi="Times New Roman"/>
+                <w:sz w:val="28"/>
+                <w:szCs w:val="28"/>
+              </w:rPr>
+              <w:t>trình</w:t>
+            </w:r>
+            <w:proofErr w:type="spellEnd"/>
+            <w:r>
+              <w:rPr>
+                <w:rFonts w:ascii="Times New Roman" w:hAnsi="Times New Roman"/>
+                <w:sz w:val="28"/>
+                <w:szCs w:val="28"/>
+              </w:rPr>
+              <w:t xml:space="preserve"> Android: Activity, Fragment, Component, SQLite, Services…</w:t>
+            </w:r>
+          </w:p>
+        </w:tc>
+      </w:tr>
+      <w:tr>
+        <w:tc>
+          <w:tcPr>
+            <w:tcW w:w="2265" w:type="dxa"/>
+          </w:tcPr>
+          <w:p>
+            <w:pPr>
+              <w:rPr>
+                <w:rFonts w:ascii="Times New Roman" w:hAnsi="Times New Roman"/>
+                <w:sz w:val="28"/>
+                <w:szCs w:val="28"/>
+              </w:rPr>
+            </w:pPr>
+            <w:r>
+              <w:rPr>
+                <w:rFonts w:ascii="Times New Roman" w:hAnsi="Times New Roman"/>
+                <w:sz w:val="28"/>
+                <w:szCs w:val="28"/>
+              </w:rPr>
+              <w:t>07/04/2025-13/04/2025</w:t>
+            </w:r>
+          </w:p>
+        </w:tc>
+        <w:tc>
+          <w:tcPr>
+            <w:tcW w:w="4300" w:type="dxa"/>
+          </w:tcPr>
+          <w:p>
+            <w:pPr>
+              <w:rPr>
+                <w:rFonts w:ascii="Times New Roman" w:hAnsi="Times New Roman"/>
+                <w:sz w:val="28"/>
+                <w:szCs w:val="28"/>
+              </w:rPr>
+            </w:pPr>
+            <w:r>
+              <w:rPr>
+                <w:rFonts w:ascii="Times New Roman" w:hAnsi="Times New Roman"/>
+                <w:sz w:val="28"/>
+                <w:szCs w:val="28"/>
+              </w:rPr>
+              <w:t xml:space="preserve">Code </w:t>
+            </w:r>
+            <w:proofErr w:type="spellStart"/>
+            <w:r>
+              <w:rPr>
+                <w:rFonts w:ascii="Times New Roman" w:hAnsi="Times New Roman"/>
+                <w:sz w:val="28"/>
+                <w:szCs w:val="28"/>
+              </w:rPr>
+              <w:t>giao</w:t>
+            </w:r>
+            <w:proofErr w:type="spellEnd"/>
+            <w:r>
+              <w:rPr>
+                <w:rFonts w:ascii="Times New Roman" w:hAnsi="Times New Roman"/>
+                <w:sz w:val="28"/>
+                <w:szCs w:val="28"/>
+              </w:rPr>
+              <w:t xml:space="preserve"> </w:t>
+            </w:r>
+            <w:proofErr w:type="spellStart"/>
+            <w:r>
+              <w:rPr>
+                <w:rFonts w:ascii="Times New Roman" w:hAnsi="Times New Roman"/>
+                <w:sz w:val="28"/>
+                <w:szCs w:val="28"/>
+              </w:rPr>
+              <w:t>diện</w:t>
+            </w:r>
+            <w:proofErr w:type="spellEnd"/>
+            <w:r>
+              <w:rPr>
+                <w:rFonts w:ascii="Times New Roman" w:hAnsi="Times New Roman"/>
+                <w:sz w:val="28"/>
+                <w:szCs w:val="28"/>
+              </w:rPr>
+              <w:t xml:space="preserve"> </w:t>
+            </w:r>
+            <w:proofErr w:type="spellStart"/>
+            <w:r>
+              <w:rPr>
+                <w:rFonts w:ascii="Times New Roman" w:hAnsi="Times New Roman"/>
+                <w:sz w:val="28"/>
+                <w:szCs w:val="28"/>
+              </w:rPr>
+              <w:t>cơ</w:t>
+            </w:r>
+            <w:proofErr w:type="spellEnd"/>
+            <w:r>
+              <w:rPr>
+                <w:rFonts w:ascii="Times New Roman" w:hAnsi="Times New Roman"/>
+                <w:sz w:val="28"/>
+                <w:szCs w:val="28"/>
+              </w:rPr>
+              <w:t xml:space="preserve"> </w:t>
+            </w:r>
+            <w:proofErr w:type="spellStart"/>
+            <w:r>
+              <w:rPr>
+                <w:rFonts w:ascii="Times New Roman" w:hAnsi="Times New Roman"/>
+                <w:sz w:val="28"/>
+                <w:szCs w:val="28"/>
+              </w:rPr>
+              <w:t>bản</w:t>
+            </w:r>
+            <w:proofErr w:type="spellEnd"/>
+            <w:r>
+              <w:rPr>
+                <w:rFonts w:ascii="Times New Roman" w:hAnsi="Times New Roman"/>
+                <w:sz w:val="28"/>
+                <w:szCs w:val="28"/>
+              </w:rPr>
+              <w:t xml:space="preserve"> </w:t>
+            </w:r>
+            <w:proofErr w:type="spellStart"/>
+            <w:r>
+              <w:rPr>
+                <w:rFonts w:ascii="Times New Roman" w:hAnsi="Times New Roman"/>
+                <w:sz w:val="28"/>
+                <w:szCs w:val="28"/>
+              </w:rPr>
+              <w:t>phần</w:t>
+            </w:r>
+            <w:proofErr w:type="spellEnd"/>
+            <w:r>
+              <w:rPr>
+                <w:rFonts w:ascii="Times New Roman" w:hAnsi="Times New Roman"/>
+                <w:sz w:val="28"/>
+                <w:szCs w:val="28"/>
+              </w:rPr>
+              <w:t xml:space="preserve"> logic </w:t>
+            </w:r>
+            <w:proofErr w:type="spellStart"/>
+            <w:r>
+              <w:rPr>
+                <w:rFonts w:ascii="Times New Roman" w:hAnsi="Times New Roman"/>
+                <w:sz w:val="28"/>
+                <w:szCs w:val="28"/>
+              </w:rPr>
+              <w:t>của</w:t>
+            </w:r>
+            <w:proofErr w:type="spellEnd"/>
+            <w:r>
+              <w:rPr>
+                <w:rFonts w:ascii="Times New Roman" w:hAnsi="Times New Roman"/>
+                <w:sz w:val="28"/>
+                <w:szCs w:val="28"/>
+              </w:rPr>
+              <w:t xml:space="preserve"> </w:t>
+            </w:r>
+            <w:proofErr w:type="spellStart"/>
+            <w:r>
+              <w:rPr>
+                <w:rFonts w:ascii="Times New Roman" w:hAnsi="Times New Roman"/>
+                <w:sz w:val="28"/>
+                <w:szCs w:val="28"/>
+              </w:rPr>
+              <w:t>dự</w:t>
+            </w:r>
+            <w:proofErr w:type="spellEnd"/>
+            <w:r>
+              <w:rPr>
+                <w:rFonts w:ascii="Times New Roman" w:hAnsi="Times New Roman"/>
+                <w:sz w:val="28"/>
+                <w:szCs w:val="28"/>
+              </w:rPr>
+              <w:t xml:space="preserve"> </w:t>
+            </w:r>
+            <w:proofErr w:type="spellStart"/>
+            <w:r>
+              <w:rPr>
+                <w:rFonts w:ascii="Times New Roman" w:hAnsi="Times New Roman"/>
+                <w:sz w:val="28"/>
+                <w:szCs w:val="28"/>
+              </w:rPr>
+              <w:t>án</w:t>
+            </w:r>
+            <w:proofErr w:type="spellEnd"/>
+            <w:r>
+              <w:rPr>
+                <w:rFonts w:ascii="Times New Roman" w:hAnsi="Times New Roman"/>
+                <w:sz w:val="28"/>
+                <w:szCs w:val="28"/>
+              </w:rPr>
+              <w:t xml:space="preserve">: </w:t>
+            </w:r>
+            <w:proofErr w:type="spellStart"/>
+            <w:r>
+              <w:rPr>
+                <w:rFonts w:ascii="Times New Roman" w:hAnsi="Times New Roman"/>
+                <w:sz w:val="28"/>
+                <w:szCs w:val="28"/>
+              </w:rPr>
+              <w:t>Giao</w:t>
+            </w:r>
+            <w:proofErr w:type="spellEnd"/>
+            <w:r>
+              <w:rPr>
+                <w:rFonts w:ascii="Times New Roman" w:hAnsi="Times New Roman"/>
+                <w:sz w:val="28"/>
+                <w:szCs w:val="28"/>
+              </w:rPr>
+              <w:t xml:space="preserve"> </w:t>
+            </w:r>
+            <w:proofErr w:type="spellStart"/>
+            <w:r>
+              <w:rPr>
+                <w:rFonts w:ascii="Times New Roman" w:hAnsi="Times New Roman"/>
+                <w:sz w:val="28"/>
+                <w:szCs w:val="28"/>
+              </w:rPr>
+              <w:t>diện</w:t>
+            </w:r>
+            <w:proofErr w:type="spellEnd"/>
+            <w:r>
+              <w:rPr>
+                <w:rFonts w:ascii="Times New Roman" w:hAnsi="Times New Roman"/>
+                <w:sz w:val="28"/>
+                <w:szCs w:val="28"/>
+              </w:rPr>
+              <w:t xml:space="preserve"> set </w:t>
+            </w:r>
+            <w:proofErr w:type="spellStart"/>
+            <w:r>
+              <w:rPr>
+                <w:rFonts w:ascii="Times New Roman" w:hAnsi="Times New Roman"/>
+                <w:sz w:val="28"/>
+                <w:szCs w:val="28"/>
+              </w:rPr>
+              <w:t>thẻ</w:t>
+            </w:r>
+            <w:proofErr w:type="spellEnd"/>
+            <w:r>
+              <w:rPr>
+                <w:rFonts w:ascii="Times New Roman" w:hAnsi="Times New Roman"/>
+                <w:sz w:val="28"/>
+                <w:szCs w:val="28"/>
+              </w:rPr>
+              <w:t xml:space="preserve"> </w:t>
+            </w:r>
+            <w:proofErr w:type="spellStart"/>
+            <w:r>
+              <w:rPr>
+                <w:rFonts w:ascii="Times New Roman" w:hAnsi="Times New Roman"/>
+                <w:sz w:val="28"/>
+                <w:szCs w:val="28"/>
+              </w:rPr>
+              <w:t>nhớ</w:t>
+            </w:r>
+            <w:proofErr w:type="spellEnd"/>
+            <w:r>
+              <w:rPr>
+                <w:rFonts w:ascii="Times New Roman" w:hAnsi="Times New Roman"/>
+                <w:sz w:val="28"/>
+                <w:szCs w:val="28"/>
+              </w:rPr>
+              <w:t xml:space="preserve">, </w:t>
+            </w:r>
+            <w:proofErr w:type="spellStart"/>
+            <w:r>
+              <w:rPr>
+                <w:rFonts w:ascii="Times New Roman" w:hAnsi="Times New Roman"/>
+                <w:sz w:val="28"/>
+                <w:szCs w:val="28"/>
+              </w:rPr>
+              <w:t>thêm</w:t>
+            </w:r>
+            <w:proofErr w:type="spellEnd"/>
+            <w:r>
+              <w:rPr>
+                <w:rFonts w:ascii="Times New Roman" w:hAnsi="Times New Roman"/>
+                <w:sz w:val="28"/>
+                <w:szCs w:val="28"/>
+              </w:rPr>
+              <w:t xml:space="preserve"> set </w:t>
+            </w:r>
+            <w:proofErr w:type="spellStart"/>
+            <w:r>
+              <w:rPr>
+                <w:rFonts w:ascii="Times New Roman" w:hAnsi="Times New Roman"/>
+                <w:sz w:val="28"/>
+                <w:szCs w:val="28"/>
+              </w:rPr>
+              <w:t>thẻ</w:t>
+            </w:r>
+            <w:proofErr w:type="spellEnd"/>
+            <w:r>
+              <w:rPr>
+                <w:rFonts w:ascii="Times New Roman" w:hAnsi="Times New Roman"/>
+                <w:sz w:val="28"/>
+                <w:szCs w:val="28"/>
+              </w:rPr>
+              <w:t xml:space="preserve"> </w:t>
+            </w:r>
+            <w:proofErr w:type="spellStart"/>
+            <w:r>
+              <w:rPr>
+                <w:rFonts w:ascii="Times New Roman" w:hAnsi="Times New Roman"/>
+                <w:sz w:val="28"/>
+                <w:szCs w:val="28"/>
+              </w:rPr>
+              <w:t>nhớ</w:t>
+            </w:r>
+            <w:proofErr w:type="spellEnd"/>
+            <w:r>
+              <w:rPr>
+                <w:rFonts w:ascii="Times New Roman" w:hAnsi="Times New Roman"/>
+                <w:sz w:val="28"/>
+                <w:szCs w:val="28"/>
+              </w:rPr>
+              <w:t xml:space="preserve">, navigation drawer, toolbar, </w:t>
+            </w:r>
+            <w:proofErr w:type="spellStart"/>
+            <w:r>
+              <w:rPr>
+                <w:rFonts w:ascii="Times New Roman" w:hAnsi="Times New Roman"/>
+                <w:sz w:val="28"/>
+                <w:szCs w:val="28"/>
+              </w:rPr>
+              <w:t>thêm</w:t>
+            </w:r>
+            <w:proofErr w:type="spellEnd"/>
+            <w:r>
+              <w:rPr>
+                <w:rFonts w:ascii="Times New Roman" w:hAnsi="Times New Roman"/>
+                <w:sz w:val="28"/>
+                <w:szCs w:val="28"/>
+              </w:rPr>
+              <w:t xml:space="preserve"> </w:t>
+            </w:r>
+            <w:proofErr w:type="spellStart"/>
+            <w:r>
+              <w:rPr>
+                <w:rFonts w:ascii="Times New Roman" w:hAnsi="Times New Roman"/>
+                <w:sz w:val="28"/>
+                <w:szCs w:val="28"/>
+              </w:rPr>
+              <w:t>thẻ</w:t>
+            </w:r>
+            <w:proofErr w:type="spellEnd"/>
+            <w:r>
+              <w:rPr>
+                <w:rFonts w:ascii="Times New Roman" w:hAnsi="Times New Roman"/>
+                <w:sz w:val="28"/>
+                <w:szCs w:val="28"/>
+              </w:rPr>
+              <w:t xml:space="preserve"> </w:t>
+            </w:r>
+            <w:proofErr w:type="spellStart"/>
+            <w:r>
+              <w:rPr>
+                <w:rFonts w:ascii="Times New Roman" w:hAnsi="Times New Roman"/>
+                <w:sz w:val="28"/>
+                <w:szCs w:val="28"/>
+              </w:rPr>
+              <w:t>nhớ</w:t>
+            </w:r>
+            <w:proofErr w:type="spellEnd"/>
+            <w:r>
+              <w:rPr>
+                <w:rFonts w:ascii="Times New Roman" w:hAnsi="Times New Roman"/>
+                <w:sz w:val="28"/>
+                <w:szCs w:val="28"/>
+              </w:rPr>
+              <w:t>, database (</w:t>
+            </w:r>
+            <w:proofErr w:type="spellStart"/>
+            <w:r>
+              <w:rPr>
+                <w:rFonts w:ascii="Times New Roman" w:hAnsi="Times New Roman"/>
+                <w:sz w:val="28"/>
+                <w:szCs w:val="28"/>
+              </w:rPr>
+              <w:t>SQLiteHelper</w:t>
+            </w:r>
+            <w:proofErr w:type="spellEnd"/>
+            <w:r>
+              <w:rPr>
+                <w:rFonts w:ascii="Times New Roman" w:hAnsi="Times New Roman"/>
+                <w:sz w:val="28"/>
+                <w:szCs w:val="28"/>
+              </w:rPr>
+              <w:t>)</w:t>
+            </w:r>
+          </w:p>
+        </w:tc>
+        <w:tc>
+          <w:tcPr>
+            <w:tcW w:w="2700" w:type="dxa"/>
+          </w:tcPr>
+          <w:p>
+            <w:pPr>
+              <w:rPr>
+                <w:rFonts w:ascii="Times New Roman" w:hAnsi="Times New Roman"/>
+                <w:sz w:val="28"/>
+                <w:szCs w:val="28"/>
+              </w:rPr>
+            </w:pPr>
+            <w:proofErr w:type="spellStart"/>
+            <w:r>
+              <w:rPr>
+                <w:rFonts w:ascii="Times New Roman" w:hAnsi="Times New Roman"/>
+                <w:sz w:val="28"/>
+                <w:szCs w:val="28"/>
+              </w:rPr>
+              <w:t>Hoàn</w:t>
+            </w:r>
+            <w:proofErr w:type="spellEnd"/>
+            <w:r>
+              <w:rPr>
+                <w:rFonts w:ascii="Times New Roman" w:hAnsi="Times New Roman"/>
+                <w:sz w:val="28"/>
+                <w:szCs w:val="28"/>
+              </w:rPr>
+              <w:t xml:space="preserve"> </w:t>
+            </w:r>
+            <w:proofErr w:type="spellStart"/>
+            <w:r>
+              <w:rPr>
+                <w:rFonts w:ascii="Times New Roman" w:hAnsi="Times New Roman"/>
+                <w:sz w:val="28"/>
+                <w:szCs w:val="28"/>
+              </w:rPr>
+              <w:t>thành</w:t>
+            </w:r>
+            <w:proofErr w:type="spellEnd"/>
+          </w:p>
+        </w:tc>
+      </w:tr>
+    </w:tbl>
+    <w:p>
+      <w:pPr>
+        <w:rPr>
+          <w:rFonts w:ascii="Times New Roman" w:hAnsi="Times New Roman"/>
+          <w:sz w:val="28"/>
+          <w:szCs w:val="28"/>
+        </w:rPr>
+      </w:pPr>
+    </w:p>
+    <w:p/>
+    <w:p/>
+    <w:p/>
+    <w:p/>
+    <w:p/>
+    <w:p/>
+    <w:p/>
+    <w:p/>
+    <w:p/>
+    <w:p/>
+    <w:p/>
+    <w:p/>
+    <w:p/>
+    <w:p/>
+    <w:p/>
+    <w:p/>
+    <w:p/>
+    <w:p/>
+    <w:p/>
+    <w:p/>
+    <w:p/>
+    <w:p/>
+    <w:p/>
+    <w:p/>
+    <w:p/>
+    <w:p/>
+    <w:p/>
+    <w:p/>
+    <w:p/>
+    <w:p/>
+    <w:p/>
+    <w:p/>
+    <w:p/>
+    <w:p/>
+    <w:p/>
+    <w:p/>
+    <w:p/>
     <w:p/>
     <w:sectPr>
       <w:pgSz w:w="11907" w:h="16840" w:code="9"/>
@@ -1207,8 +4548,8 @@
 </file>
 
 <file path=word/numbering.xml><?xml version="1.0" encoding="utf-8"?>
-<w:numbering xmlns:wpc="http://schemas.microsoft.com/office/word/2010/wordprocessingCanvas" xmlns:cx="http://schemas.microsoft.com/office/drawing/2014/chartex" xmlns:cx1="http://schemas.microsoft.com/office/drawing/2015/9/8/chartex" xmlns:cx2="http://schemas.microsoft.com/office/drawing/2015/10/21/chartex" xmlns:cx3="http://schemas.microsoft.com/office/drawing/2016/5/9/chartex" xmlns:cx4="http://schemas.microsoft.com/office/drawing/2016/5/10/chartex" xmlns:cx5="http://schemas.microsoft.com/office/drawing/2016/5/11/chartex" xmlns:cx6="http://schemas.microsoft.com/office/drawing/2016/5/12/chartex" xmlns:cx7="http://schemas.microsoft.com/office/drawing/2016/5/13/chartex" xmlns:cx8="http://schemas.microsoft.com/office/drawing/2016/5/14/chartex" xmlns:mc="http://schemas.openxmlformats.org/markup-compatibility/2006" xmlns:aink="http://schemas.microsoft.com/office/drawing/2016/ink" xmlns:am3d="http://schemas.microsoft.com/office/drawing/2017/model3d" xmlns:o="urn:schemas-microsoft-com:office:office" xmlns:oel="http://schemas.microsoft.com/office/2019/extlst" xmlns:r="http://schemas.openxmlformats.org/officeDocument/2006/relationships" xmlns:m="http://schemas.openxmlformats.org/officeDocument/2006/math" xmlns:v="urn:schemas-microsoft-com:vml" xmlns:wp14="http://schemas.microsoft.com/office/word/2010/wordprocessingDrawing" xmlns:wp="http://schemas.openxmlformats.org/drawingml/2006/wordprocessingDrawing" xmlns:w10="urn:schemas-microsoft-com:office:word" xmlns:w="http://schemas.openxmlformats.org/wordprocessingml/2006/main" xmlns:w14="http://schemas.microsoft.com/office/word/2010/wordml" xmlns:w15="http://schemas.microsoft.com/office/word/2012/wordml" xmlns:w16cex="http://schemas.microsoft.com/office/word/2018/wordml/cex" xmlns:w16cid="http://schemas.microsoft.com/office/word/2016/wordml/cid" xmlns:w16="http://schemas.microsoft.com/office/word/2018/wordml" xmlns:w16du="http://schemas.microsoft.com/office/word/2023/wordml/word16du" xmlns:w16sdtdh="http://schemas.microsoft.com/office/word/2020/wordml/sdtdatahash" xmlns:w16sdtfl="http://schemas.microsoft.com/office/word/2024/wordml/sdtformatlock" xmlns:w16se="http://schemas.microsoft.com/office/word/2015/wordml/symex" xmlns:wpg="http://schemas.microsoft.com/office/word/2010/wordprocessingGroup" xmlns:wpi="http://schemas.microsoft.com/office/word/2010/wordprocessingInk" xmlns:wne="http://schemas.microsoft.com/office/word/2006/wordml" xmlns:wps="http://schemas.microsoft.com/office/word/2010/wordprocessingShape" mc:Ignorable="w14 w15 w16se w16cid w16 w16cex w16sdtdh w16sdtfl w16du wp14">
-  <w:abstractNum w:abstractNumId="0" w15:restartNumberingAfterBreak="0">
+<w:numbering xmlns:wpc="http://schemas.microsoft.com/office/word/2010/wordprocessingCanvas" xmlns:mc="http://schemas.openxmlformats.org/markup-compatibility/2006" xmlns:o="urn:schemas-microsoft-com:office:office" xmlns:r="http://schemas.openxmlformats.org/officeDocument/2006/relationships" xmlns:m="http://schemas.openxmlformats.org/officeDocument/2006/math" xmlns:v="urn:schemas-microsoft-com:vml" xmlns:wp14="http://schemas.microsoft.com/office/word/2010/wordprocessingDrawing" xmlns:wp="http://schemas.openxmlformats.org/drawingml/2006/wordprocessingDrawing" xmlns:w10="urn:schemas-microsoft-com:office:word" xmlns:w="http://schemas.openxmlformats.org/wordprocessingml/2006/main" xmlns:w14="http://schemas.microsoft.com/office/word/2010/wordml" xmlns:w15="http://schemas.microsoft.com/office/word/2012/wordml" xmlns:wpg="http://schemas.microsoft.com/office/word/2010/wordprocessingGroup" xmlns:wpi="http://schemas.microsoft.com/office/word/2010/wordprocessingInk" xmlns:wne="http://schemas.microsoft.com/office/word/2006/wordml" xmlns:wps="http://schemas.microsoft.com/office/word/2010/wordprocessingShape" mc:Ignorable="w14 w15 wp14">
+  <w:abstractNum w:abstractNumId="0">
     <w:nsid w:val="628B3D1C"/>
     <w:multiLevelType w:val="hybridMultilevel"/>
     <w:tmpl w:val="B2F2A512"/>
@@ -1320,14 +4661,14 @@
       </w:rPr>
     </w:lvl>
   </w:abstractNum>
-  <w:num w:numId="1" w16cid:durableId="1146429981">
+  <w:num w:numId="1">
     <w:abstractNumId w:val="0"/>
   </w:num>
 </w:numbering>
 </file>
 
 <file path=word/styles.xml><?xml version="1.0" encoding="utf-8"?>
-<w:styles xmlns:mc="http://schemas.openxmlformats.org/markup-compatibility/2006" xmlns:r="http://schemas.openxmlformats.org/officeDocument/2006/relationships" xmlns:w="http://schemas.openxmlformats.org/wordprocessingml/2006/main" xmlns:w14="http://schemas.microsoft.com/office/word/2010/wordml" xmlns:w15="http://schemas.microsoft.com/office/word/2012/wordml" xmlns:w16cex="http://schemas.microsoft.com/office/word/2018/wordml/cex" xmlns:w16cid="http://schemas.microsoft.com/office/word/2016/wordml/cid" xmlns:w16="http://schemas.microsoft.com/office/word/2018/wordml" xmlns:w16du="http://schemas.microsoft.com/office/word/2023/wordml/word16du" xmlns:w16sdtdh="http://schemas.microsoft.com/office/word/2020/wordml/sdtdatahash" xmlns:w16sdtfl="http://schemas.microsoft.com/office/word/2024/wordml/sdtformatlock" xmlns:w16se="http://schemas.microsoft.com/office/word/2015/wordml/symex" mc:Ignorable="w14 w15 w16se w16cid w16 w16cex w16sdtdh w16sdtfl w16du">
+<w:styles xmlns:mc="http://schemas.openxmlformats.org/markup-compatibility/2006" xmlns:r="http://schemas.openxmlformats.org/officeDocument/2006/relationships" xmlns:w="http://schemas.openxmlformats.org/wordprocessingml/2006/main" xmlns:w14="http://schemas.microsoft.com/office/word/2010/wordml" xmlns:w15="http://schemas.microsoft.com/office/word/2012/wordml" mc:Ignorable="w14 w15">
   <w:docDefaults>
     <w:rPrDefault>
       <w:rPr>
@@ -1343,7 +4684,7 @@
       </w:pPr>
     </w:pPrDefault>
   </w:docDefaults>
-  <w:latentStyles w:defLockedState="0" w:defUIPriority="99" w:defSemiHidden="0" w:defUnhideWhenUsed="0" w:defQFormat="0" w:count="376">
+  <w:latentStyles w:defLockedState="0" w:defUIPriority="99" w:defSemiHidden="0" w:defUnhideWhenUsed="0" w:defQFormat="0" w:count="371">
     <w:lsdException w:name="Normal" w:uiPriority="0" w:qFormat="1"/>
     <w:lsdException w:name="heading 1" w:uiPriority="9" w:qFormat="1"/>
     <w:lsdException w:name="heading 2" w:semiHidden="1" w:uiPriority="9" w:unhideWhenUsed="1" w:qFormat="1"/>
@@ -1715,11 +5056,6 @@
     <w:lsdException w:name="List Table 5 Dark Accent 6" w:uiPriority="50"/>
     <w:lsdException w:name="List Table 6 Colorful Accent 6" w:uiPriority="51"/>
     <w:lsdException w:name="List Table 7 Colorful Accent 6" w:uiPriority="52"/>
-    <w:lsdException w:name="Mention" w:semiHidden="1" w:unhideWhenUsed="1"/>
-    <w:lsdException w:name="Smart Hyperlink" w:semiHidden="1" w:unhideWhenUsed="1"/>
-    <w:lsdException w:name="Hashtag" w:semiHidden="1" w:unhideWhenUsed="1"/>
-    <w:lsdException w:name="Unresolved Mention" w:semiHidden="1" w:unhideWhenUsed="1"/>
-    <w:lsdException w:name="Smart Link" w:semiHidden="1" w:unhideWhenUsed="1"/>
   </w:latentStyles>
   <w:style w:type="paragraph" w:default="1" w:styleId="Normal">
     <w:name w:val="Normal"/>
@@ -1913,8 +5249,11 @@
     <w:tblPr>
       <w:tblStyleRowBandSize w:val="1"/>
       <w:tblStyleColBandSize w:val="1"/>
+      <w:tblInd w:w="0" w:type="dxa"/>
       <w:tblCellMar>
+        <w:top w:w="0" w:type="dxa"/>
         <w:left w:w="115" w:type="dxa"/>
+        <w:bottom w:w="0" w:type="dxa"/>
         <w:right w:w="115" w:type="dxa"/>
       </w:tblCellMar>
     </w:tblPr>
@@ -1924,8 +5263,11 @@
     <w:tblPr>
       <w:tblStyleRowBandSize w:val="1"/>
       <w:tblStyleColBandSize w:val="1"/>
+      <w:tblInd w:w="0" w:type="dxa"/>
       <w:tblCellMar>
+        <w:top w:w="0" w:type="dxa"/>
         <w:left w:w="115" w:type="dxa"/>
+        <w:bottom w:w="0" w:type="dxa"/>
         <w:right w:w="115" w:type="dxa"/>
       </w:tblCellMar>
     </w:tblPr>
@@ -1940,6 +5282,32 @@
       <w:ind w:left="720"/>
       <w:contextualSpacing/>
     </w:pPr>
+  </w:style>
+  <w:style w:type="table" w:styleId="TableGrid">
+    <w:name w:val="Table Grid"/>
+    <w:basedOn w:val="TableNormal"/>
+    <w:uiPriority w:val="39"/>
+    <w:rsid w:val="00BA31C2"/>
+    <w:pPr>
+      <w:spacing w:after="0" w:line="240" w:lineRule="auto"/>
+    </w:pPr>
+    <w:tblPr>
+      <w:tblInd w:w="0" w:type="dxa"/>
+      <w:tblBorders>
+        <w:top w:val="single" w:sz="4" w:space="0" w:color="auto"/>
+        <w:left w:val="single" w:sz="4" w:space="0" w:color="auto"/>
+        <w:bottom w:val="single" w:sz="4" w:space="0" w:color="auto"/>
+        <w:right w:val="single" w:sz="4" w:space="0" w:color="auto"/>
+        <w:insideH w:val="single" w:sz="4" w:space="0" w:color="auto"/>
+        <w:insideV w:val="single" w:sz="4" w:space="0" w:color="auto"/>
+      </w:tblBorders>
+      <w:tblCellMar>
+        <w:top w:w="0" w:type="dxa"/>
+        <w:left w:w="108" w:type="dxa"/>
+        <w:bottom w:w="0" w:type="dxa"/>
+        <w:right w:w="108" w:type="dxa"/>
+      </w:tblCellMar>
+    </w:tblPr>
   </w:style>
 </w:styles>
 </file>

</xml_diff>

<commit_message>
Update: deploy app to AWS cloud server
</commit_message>
<xml_diff>
--- a/Document/Phiếu giao đề tài_K16_Nguyễn Trung Nghĩa_2021601003.docx
+++ b/Document/Phiếu giao đề tài_K16_Nguyễn Trung Nghĩa_2021601003.docx
@@ -1,6 +1,6 @@
 
 <file path=word/document.xml><?xml version="1.0" encoding="utf-8"?>
-<w:document xmlns:wpc="http://schemas.microsoft.com/office/word/2010/wordprocessingCanvas" xmlns:cx="http://schemas.microsoft.com/office/drawing/2014/chartex" xmlns:mc="http://schemas.openxmlformats.org/markup-compatibility/2006" xmlns:o="urn:schemas-microsoft-com:office:office" xmlns:r="http://schemas.openxmlformats.org/officeDocument/2006/relationships" xmlns:m="http://schemas.openxmlformats.org/officeDocument/2006/math" xmlns:v="urn:schemas-microsoft-com:vml" xmlns:wp14="http://schemas.microsoft.com/office/word/2010/wordprocessingDrawing" xmlns:wp="http://schemas.openxmlformats.org/drawingml/2006/wordprocessingDrawing" xmlns:w10="urn:schemas-microsoft-com:office:word" xmlns:w="http://schemas.openxmlformats.org/wordprocessingml/2006/main" xmlns:w14="http://schemas.microsoft.com/office/word/2010/wordml" xmlns:w15="http://schemas.microsoft.com/office/word/2012/wordml" xmlns:w16se="http://schemas.microsoft.com/office/word/2015/wordml/symex" xmlns:wpg="http://schemas.microsoft.com/office/word/2010/wordprocessingGroup" xmlns:wpi="http://schemas.microsoft.com/office/word/2010/wordprocessingInk" xmlns:wne="http://schemas.microsoft.com/office/word/2006/wordml" xmlns:wps="http://schemas.microsoft.com/office/word/2010/wordprocessingShape" mc:Ignorable="w14 w15 w16se wp14">
+<w:document xmlns:wpc="http://schemas.microsoft.com/office/word/2010/wordprocessingCanvas" xmlns:mc="http://schemas.openxmlformats.org/markup-compatibility/2006" xmlns:o="urn:schemas-microsoft-com:office:office" xmlns:r="http://schemas.openxmlformats.org/officeDocument/2006/relationships" xmlns:m="http://schemas.openxmlformats.org/officeDocument/2006/math" xmlns:v="urn:schemas-microsoft-com:vml" xmlns:wp14="http://schemas.microsoft.com/office/word/2010/wordprocessingDrawing" xmlns:wp="http://schemas.openxmlformats.org/drawingml/2006/wordprocessingDrawing" xmlns:w10="urn:schemas-microsoft-com:office:word" xmlns:w="http://schemas.openxmlformats.org/wordprocessingml/2006/main" xmlns:w14="http://schemas.microsoft.com/office/word/2010/wordml" xmlns:w15="http://schemas.microsoft.com/office/word/2012/wordml" xmlns:wpg="http://schemas.microsoft.com/office/word/2010/wordprocessingGroup" xmlns:wpi="http://schemas.microsoft.com/office/word/2010/wordprocessingInk" xmlns:wne="http://schemas.microsoft.com/office/word/2006/wordml" xmlns:wps="http://schemas.microsoft.com/office/word/2010/wordprocessingShape" mc:Ignorable="w14 w15 wp14">
   <w:body>
     <w:tbl>
       <w:tblPr>
@@ -142,7 +142,7 @@
                     </wp:anchor>
                   </w:drawing>
                 </mc:Choice>
-                <mc:Fallback xmlns:w16sdtfl="http://schemas.microsoft.com/office/word/2024/wordml/sdtformatlock" xmlns:w16sdtdh="http://schemas.microsoft.com/office/word/2020/wordml/sdtdatahash" xmlns:w16du="http://schemas.microsoft.com/office/word/2023/wordml/word16du" xmlns:w16="http://schemas.microsoft.com/office/word/2018/wordml" xmlns:w16cid="http://schemas.microsoft.com/office/word/2016/wordml/cid" xmlns:w16cex="http://schemas.microsoft.com/office/word/2018/wordml/cex" xmlns:oel="http://schemas.microsoft.com/office/2019/extlst" xmlns:am3d="http://schemas.microsoft.com/office/drawing/2017/model3d" xmlns:aink="http://schemas.microsoft.com/office/drawing/2016/ink" xmlns:cx8="http://schemas.microsoft.com/office/drawing/2016/5/14/chartex" xmlns:cx7="http://schemas.microsoft.com/office/drawing/2016/5/13/chartex" xmlns:cx6="http://schemas.microsoft.com/office/drawing/2016/5/12/chartex" xmlns:cx5="http://schemas.microsoft.com/office/drawing/2016/5/11/chartex" xmlns:cx4="http://schemas.microsoft.com/office/drawing/2016/5/10/chartex" xmlns:cx3="http://schemas.microsoft.com/office/drawing/2016/5/9/chartex" xmlns:cx2="http://schemas.microsoft.com/office/drawing/2015/10/21/chartex" xmlns:cx1="http://schemas.microsoft.com/office/drawing/2015/9/8/chartex">
+                <mc:Fallback xmlns:cx="http://schemas.microsoft.com/office/drawing/2014/chartex" xmlns:w16se="http://schemas.microsoft.com/office/word/2015/wordml/symex" xmlns:w16sdtfl="http://schemas.microsoft.com/office/word/2024/wordml/sdtformatlock" xmlns:w16sdtdh="http://schemas.microsoft.com/office/word/2020/wordml/sdtdatahash" xmlns:w16du="http://schemas.microsoft.com/office/word/2023/wordml/word16du" xmlns:w16="http://schemas.microsoft.com/office/word/2018/wordml" xmlns:w16cid="http://schemas.microsoft.com/office/word/2016/wordml/cid" xmlns:w16cex="http://schemas.microsoft.com/office/word/2018/wordml/cex" xmlns:oel="http://schemas.microsoft.com/office/2019/extlst" xmlns:am3d="http://schemas.microsoft.com/office/drawing/2017/model3d" xmlns:aink="http://schemas.microsoft.com/office/drawing/2016/ink" xmlns:cx8="http://schemas.microsoft.com/office/drawing/2016/5/14/chartex" xmlns:cx7="http://schemas.microsoft.com/office/drawing/2016/5/13/chartex" xmlns:cx6="http://schemas.microsoft.com/office/drawing/2016/5/12/chartex" xmlns:cx5="http://schemas.microsoft.com/office/drawing/2016/5/11/chartex" xmlns:cx4="http://schemas.microsoft.com/office/drawing/2016/5/10/chartex" xmlns:cx3="http://schemas.microsoft.com/office/drawing/2016/5/9/chartex" xmlns:cx2="http://schemas.microsoft.com/office/drawing/2015/10/21/chartex" xmlns:cx1="http://schemas.microsoft.com/office/drawing/2015/9/8/chartex">
                   <w:pict>
                     <v:line w14:anchorId="692D4AB2" id="Straight Connector 5" o:spid="_x0000_s1026" style="position:absolute;z-index:251659264;visibility:visible;mso-wrap-style:square;mso-width-percent:0;mso-height-percent:0;mso-wrap-distance-left:9pt;mso-wrap-distance-top:-3e-5mm;mso-wrap-distance-right:9pt;mso-wrap-distance-bottom:-3e-5mm;mso-position-horizontal:absolute;mso-position-horizontal-relative:text;mso-position-vertical:absolute;mso-position-vertical-relative:text;mso-width-percent:0;mso-height-percent:0;mso-width-relative:page;mso-height-relative:page" from="50.75pt,1.7pt" to="180.65pt,1.7pt" o:gfxdata="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"/>
                   </w:pict>
@@ -392,7 +392,7 @@
                     </wp:anchor>
                   </w:drawing>
                 </mc:Choice>
-                <mc:Fallback xmlns:w16sdtfl="http://schemas.microsoft.com/office/word/2024/wordml/sdtformatlock" xmlns:w16sdtdh="http://schemas.microsoft.com/office/word/2020/wordml/sdtdatahash" xmlns:w16du="http://schemas.microsoft.com/office/word/2023/wordml/word16du" xmlns:w16="http://schemas.microsoft.com/office/word/2018/wordml" xmlns:w16cid="http://schemas.microsoft.com/office/word/2016/wordml/cid" xmlns:w16cex="http://schemas.microsoft.com/office/word/2018/wordml/cex" xmlns:oel="http://schemas.microsoft.com/office/2019/extlst" xmlns:am3d="http://schemas.microsoft.com/office/drawing/2017/model3d" xmlns:aink="http://schemas.microsoft.com/office/drawing/2016/ink" xmlns:cx8="http://schemas.microsoft.com/office/drawing/2016/5/14/chartex" xmlns:cx7="http://schemas.microsoft.com/office/drawing/2016/5/13/chartex" xmlns:cx6="http://schemas.microsoft.com/office/drawing/2016/5/12/chartex" xmlns:cx5="http://schemas.microsoft.com/office/drawing/2016/5/11/chartex" xmlns:cx4="http://schemas.microsoft.com/office/drawing/2016/5/10/chartex" xmlns:cx3="http://schemas.microsoft.com/office/drawing/2016/5/9/chartex" xmlns:cx2="http://schemas.microsoft.com/office/drawing/2015/10/21/chartex" xmlns:cx1="http://schemas.microsoft.com/office/drawing/2015/9/8/chartex">
+                <mc:Fallback xmlns:cx="http://schemas.microsoft.com/office/drawing/2014/chartex" xmlns:w16se="http://schemas.microsoft.com/office/word/2015/wordml/symex" xmlns:w16sdtfl="http://schemas.microsoft.com/office/word/2024/wordml/sdtformatlock" xmlns:w16sdtdh="http://schemas.microsoft.com/office/word/2020/wordml/sdtdatahash" xmlns:w16du="http://schemas.microsoft.com/office/word/2023/wordml/word16du" xmlns:w16="http://schemas.microsoft.com/office/word/2018/wordml" xmlns:w16cid="http://schemas.microsoft.com/office/word/2016/wordml/cid" xmlns:w16cex="http://schemas.microsoft.com/office/word/2018/wordml/cex" xmlns:oel="http://schemas.microsoft.com/office/2019/extlst" xmlns:am3d="http://schemas.microsoft.com/office/drawing/2017/model3d" xmlns:aink="http://schemas.microsoft.com/office/drawing/2016/ink" xmlns:cx8="http://schemas.microsoft.com/office/drawing/2016/5/14/chartex" xmlns:cx7="http://schemas.microsoft.com/office/drawing/2016/5/13/chartex" xmlns:cx6="http://schemas.microsoft.com/office/drawing/2016/5/12/chartex" xmlns:cx5="http://schemas.microsoft.com/office/drawing/2016/5/11/chartex" xmlns:cx4="http://schemas.microsoft.com/office/drawing/2016/5/10/chartex" xmlns:cx3="http://schemas.microsoft.com/office/drawing/2016/5/9/chartex" xmlns:cx2="http://schemas.microsoft.com/office/drawing/2015/10/21/chartex" xmlns:cx1="http://schemas.microsoft.com/office/drawing/2015/9/8/chartex">
                   <w:pict>
                     <v:shapetype w14:anchorId="4E45F977" id="_x0000_t32" coordsize="21600,21600" o:spt="32" o:oned="t" path="m,l21600,21600e" filled="f">
                       <v:path arrowok="t" fillok="f" o:connecttype="none"/>
@@ -1372,19 +1372,7 @@
           <w:szCs w:val="28"/>
           <w:lang w:val="vi-VN"/>
         </w:rPr>
-        <w:t>, đánh giá và kiểm tra, chat box với hệ thống. Web quản t</w:t>
-      </w:r>
-      <w:bookmarkStart w:id="0" w:name="_GoBack"/>
-      <w:bookmarkEnd w:id="0"/>
-      <w:r>
-        <w:rPr>
-          <w:rFonts w:ascii="Times New Roman" w:eastAsia="Times New Roman" w:hAnsi="Times New Roman"/>
-          <w:color w:val="000000" w:themeColor="text1"/>
-          <w:sz w:val="28"/>
-          <w:szCs w:val="28"/>
-          <w:lang w:val="vi-VN"/>
-        </w:rPr>
-        <w:t>rị với các chức năng quản lý như hỗ trợ quản lý người dùng, thẻ nhớ, khóa học, vv…</w:t>
+        <w:t>, đánh giá và kiểm tra, chat box với hệ thống. Web quản trị với các chức năng quản lý như hỗ trợ quản lý người dùng, thẻ nhớ, khóa học, vv…</w:t>
       </w:r>
     </w:p>
     <w:p>
@@ -2096,9 +2084,9 @@
         <w:tblLook w:val="04A0" w:firstRow="1" w:lastRow="0" w:firstColumn="1" w:lastColumn="0" w:noHBand="0" w:noVBand="1"/>
       </w:tblPr>
       <w:tblGrid>
-        <w:gridCol w:w="2265"/>
-        <w:gridCol w:w="4300"/>
-        <w:gridCol w:w="2700"/>
+        <w:gridCol w:w="2135"/>
+        <w:gridCol w:w="3857"/>
+        <w:gridCol w:w="3273"/>
       </w:tblGrid>
       <w:tr>
         <w:tc>
@@ -5253,6 +5241,935 @@
                 <w:szCs w:val="28"/>
               </w:rPr>
             </w:pPr>
+            <w:proofErr w:type="spellStart"/>
+            <w:r>
+              <w:rPr>
+                <w:rFonts w:ascii="Times New Roman" w:hAnsi="Times New Roman"/>
+                <w:sz w:val="28"/>
+                <w:szCs w:val="28"/>
+              </w:rPr>
+              <w:t>Hoàn</w:t>
+            </w:r>
+            <w:proofErr w:type="spellEnd"/>
+            <w:r>
+              <w:rPr>
+                <w:rFonts w:ascii="Times New Roman" w:hAnsi="Times New Roman"/>
+                <w:sz w:val="28"/>
+                <w:szCs w:val="28"/>
+              </w:rPr>
+              <w:t xml:space="preserve"> </w:t>
+            </w:r>
+            <w:proofErr w:type="spellStart"/>
+            <w:r>
+              <w:rPr>
+                <w:rFonts w:ascii="Times New Roman" w:hAnsi="Times New Roman"/>
+                <w:sz w:val="28"/>
+                <w:szCs w:val="28"/>
+              </w:rPr>
+              <w:t>thành</w:t>
+            </w:r>
+            <w:proofErr w:type="spellEnd"/>
+          </w:p>
+        </w:tc>
+      </w:tr>
+      <w:tr>
+        <w:tc>
+          <w:tcPr>
+            <w:tcW w:w="2265" w:type="dxa"/>
+          </w:tcPr>
+          <w:p>
+            <w:pPr>
+              <w:rPr>
+                <w:rFonts w:ascii="Times New Roman" w:hAnsi="Times New Roman"/>
+                <w:sz w:val="28"/>
+                <w:szCs w:val="28"/>
+              </w:rPr>
+            </w:pPr>
+            <w:r>
+              <w:rPr>
+                <w:rFonts w:ascii="Times New Roman" w:hAnsi="Times New Roman"/>
+                <w:sz w:val="28"/>
+                <w:szCs w:val="28"/>
+              </w:rPr>
+              <w:t>21/04/2025-</w:t>
+            </w:r>
+          </w:p>
+          <w:p>
+            <w:pPr>
+              <w:rPr>
+                <w:rFonts w:ascii="Times New Roman" w:hAnsi="Times New Roman"/>
+                <w:sz w:val="28"/>
+                <w:szCs w:val="28"/>
+              </w:rPr>
+            </w:pPr>
+            <w:r>
+              <w:rPr>
+                <w:rFonts w:ascii="Times New Roman" w:hAnsi="Times New Roman"/>
+                <w:sz w:val="28"/>
+                <w:szCs w:val="28"/>
+              </w:rPr>
+              <w:t>27/04/2025</w:t>
+            </w:r>
+          </w:p>
+        </w:tc>
+        <w:tc>
+          <w:tcPr>
+            <w:tcW w:w="4300" w:type="dxa"/>
+          </w:tcPr>
+          <w:p>
+            <w:pPr>
+              <w:rPr>
+                <w:rFonts w:ascii="Times New Roman" w:hAnsi="Times New Roman"/>
+                <w:sz w:val="28"/>
+                <w:szCs w:val="28"/>
+              </w:rPr>
+            </w:pPr>
+            <w:proofErr w:type="spellStart"/>
+            <w:r>
+              <w:rPr>
+                <w:rFonts w:ascii="Times New Roman" w:hAnsi="Times New Roman"/>
+                <w:sz w:val="28"/>
+                <w:szCs w:val="28"/>
+              </w:rPr>
+              <w:t>Xây</w:t>
+            </w:r>
+            <w:proofErr w:type="spellEnd"/>
+            <w:r>
+              <w:rPr>
+                <w:rFonts w:ascii="Times New Roman" w:hAnsi="Times New Roman"/>
+                <w:sz w:val="28"/>
+                <w:szCs w:val="28"/>
+              </w:rPr>
+              <w:t xml:space="preserve"> </w:t>
+            </w:r>
+            <w:proofErr w:type="spellStart"/>
+            <w:r>
+              <w:rPr>
+                <w:rFonts w:ascii="Times New Roman" w:hAnsi="Times New Roman"/>
+                <w:sz w:val="28"/>
+                <w:szCs w:val="28"/>
+              </w:rPr>
+              <w:t>dựng</w:t>
+            </w:r>
+            <w:proofErr w:type="spellEnd"/>
+            <w:r>
+              <w:rPr>
+                <w:rFonts w:ascii="Times New Roman" w:hAnsi="Times New Roman"/>
+                <w:sz w:val="28"/>
+                <w:szCs w:val="28"/>
+              </w:rPr>
+              <w:t xml:space="preserve"> web app </w:t>
+            </w:r>
+            <w:proofErr w:type="spellStart"/>
+            <w:r>
+              <w:rPr>
+                <w:rFonts w:ascii="Times New Roman" w:hAnsi="Times New Roman"/>
+                <w:sz w:val="28"/>
+                <w:szCs w:val="28"/>
+              </w:rPr>
+              <w:t>quản</w:t>
+            </w:r>
+            <w:proofErr w:type="spellEnd"/>
+            <w:r>
+              <w:rPr>
+                <w:rFonts w:ascii="Times New Roman" w:hAnsi="Times New Roman"/>
+                <w:sz w:val="28"/>
+                <w:szCs w:val="28"/>
+              </w:rPr>
+              <w:t xml:space="preserve"> </w:t>
+            </w:r>
+            <w:proofErr w:type="spellStart"/>
+            <w:r>
+              <w:rPr>
+                <w:rFonts w:ascii="Times New Roman" w:hAnsi="Times New Roman"/>
+                <w:sz w:val="28"/>
+                <w:szCs w:val="28"/>
+              </w:rPr>
+              <w:t>lý</w:t>
+            </w:r>
+            <w:proofErr w:type="spellEnd"/>
+            <w:r>
+              <w:rPr>
+                <w:rFonts w:ascii="Times New Roman" w:hAnsi="Times New Roman"/>
+                <w:sz w:val="28"/>
+                <w:szCs w:val="28"/>
+              </w:rPr>
+              <w:t xml:space="preserve"> </w:t>
+            </w:r>
+            <w:proofErr w:type="spellStart"/>
+            <w:r>
+              <w:rPr>
+                <w:rFonts w:ascii="Times New Roman" w:hAnsi="Times New Roman"/>
+                <w:sz w:val="28"/>
+                <w:szCs w:val="28"/>
+              </w:rPr>
+              <w:t>dữ</w:t>
+            </w:r>
+            <w:proofErr w:type="spellEnd"/>
+            <w:r>
+              <w:rPr>
+                <w:rFonts w:ascii="Times New Roman" w:hAnsi="Times New Roman"/>
+                <w:sz w:val="28"/>
+                <w:szCs w:val="28"/>
+              </w:rPr>
+              <w:t xml:space="preserve"> </w:t>
+            </w:r>
+            <w:proofErr w:type="spellStart"/>
+            <w:r>
+              <w:rPr>
+                <w:rFonts w:ascii="Times New Roman" w:hAnsi="Times New Roman"/>
+                <w:sz w:val="28"/>
+                <w:szCs w:val="28"/>
+              </w:rPr>
+              <w:t>liệu</w:t>
+            </w:r>
+            <w:proofErr w:type="spellEnd"/>
+            <w:r>
+              <w:rPr>
+                <w:rFonts w:ascii="Times New Roman" w:hAnsi="Times New Roman"/>
+                <w:sz w:val="28"/>
+                <w:szCs w:val="28"/>
+              </w:rPr>
+              <w:t xml:space="preserve"> </w:t>
+            </w:r>
+            <w:proofErr w:type="spellStart"/>
+            <w:r>
+              <w:rPr>
+                <w:rFonts w:ascii="Times New Roman" w:hAnsi="Times New Roman"/>
+                <w:sz w:val="28"/>
+                <w:szCs w:val="28"/>
+              </w:rPr>
+              <w:t>bằng</w:t>
+            </w:r>
+            <w:proofErr w:type="spellEnd"/>
+            <w:r>
+              <w:rPr>
+                <w:rFonts w:ascii="Times New Roman" w:hAnsi="Times New Roman"/>
+                <w:sz w:val="28"/>
+                <w:szCs w:val="28"/>
+              </w:rPr>
+              <w:t xml:space="preserve"> Spring Boot: Spring JPA, Spring Security, REST API, MySQL connector, </w:t>
+            </w:r>
+            <w:proofErr w:type="spellStart"/>
+            <w:r>
+              <w:rPr>
+                <w:rFonts w:ascii="Times New Roman" w:hAnsi="Times New Roman"/>
+                <w:sz w:val="28"/>
+                <w:szCs w:val="28"/>
+              </w:rPr>
+              <w:t>Thymleaf</w:t>
+            </w:r>
+            <w:proofErr w:type="spellEnd"/>
+            <w:r>
+              <w:rPr>
+                <w:rFonts w:ascii="Times New Roman" w:hAnsi="Times New Roman"/>
+                <w:sz w:val="28"/>
+                <w:szCs w:val="28"/>
+              </w:rPr>
+              <w:t>, Bootstrap.</w:t>
+            </w:r>
+          </w:p>
+          <w:p>
+            <w:pPr>
+              <w:rPr>
+                <w:rFonts w:ascii="Times New Roman" w:hAnsi="Times New Roman"/>
+                <w:sz w:val="28"/>
+                <w:szCs w:val="28"/>
+              </w:rPr>
+            </w:pPr>
+            <w:proofErr w:type="spellStart"/>
+            <w:r>
+              <w:rPr>
+                <w:rFonts w:ascii="Times New Roman" w:hAnsi="Times New Roman"/>
+                <w:sz w:val="28"/>
+                <w:szCs w:val="28"/>
+              </w:rPr>
+              <w:t>Tạo</w:t>
+            </w:r>
+            <w:proofErr w:type="spellEnd"/>
+            <w:r>
+              <w:rPr>
+                <w:rFonts w:ascii="Times New Roman" w:hAnsi="Times New Roman"/>
+                <w:sz w:val="28"/>
+                <w:szCs w:val="28"/>
+              </w:rPr>
+              <w:t xml:space="preserve"> </w:t>
+            </w:r>
+            <w:proofErr w:type="spellStart"/>
+            <w:r>
+              <w:rPr>
+                <w:rFonts w:ascii="Times New Roman" w:hAnsi="Times New Roman"/>
+                <w:sz w:val="28"/>
+                <w:szCs w:val="28"/>
+              </w:rPr>
+              <w:t>các</w:t>
+            </w:r>
+            <w:proofErr w:type="spellEnd"/>
+            <w:r>
+              <w:rPr>
+                <w:rFonts w:ascii="Times New Roman" w:hAnsi="Times New Roman"/>
+                <w:sz w:val="28"/>
+                <w:szCs w:val="28"/>
+              </w:rPr>
+              <w:t xml:space="preserve"> </w:t>
+            </w:r>
+            <w:proofErr w:type="spellStart"/>
+            <w:r>
+              <w:rPr>
+                <w:rFonts w:ascii="Times New Roman" w:hAnsi="Times New Roman"/>
+                <w:sz w:val="28"/>
+                <w:szCs w:val="28"/>
+              </w:rPr>
+              <w:t>thành</w:t>
+            </w:r>
+            <w:proofErr w:type="spellEnd"/>
+            <w:r>
+              <w:rPr>
+                <w:rFonts w:ascii="Times New Roman" w:hAnsi="Times New Roman"/>
+                <w:sz w:val="28"/>
+                <w:szCs w:val="28"/>
+              </w:rPr>
+              <w:t xml:space="preserve"> </w:t>
+            </w:r>
+            <w:proofErr w:type="spellStart"/>
+            <w:r>
+              <w:rPr>
+                <w:rFonts w:ascii="Times New Roman" w:hAnsi="Times New Roman"/>
+                <w:sz w:val="28"/>
+                <w:szCs w:val="28"/>
+              </w:rPr>
+              <w:t>phần</w:t>
+            </w:r>
+            <w:proofErr w:type="spellEnd"/>
+            <w:r>
+              <w:rPr>
+                <w:rFonts w:ascii="Times New Roman" w:hAnsi="Times New Roman"/>
+                <w:sz w:val="28"/>
+                <w:szCs w:val="28"/>
+              </w:rPr>
+              <w:t xml:space="preserve"> </w:t>
+            </w:r>
+            <w:proofErr w:type="spellStart"/>
+            <w:r>
+              <w:rPr>
+                <w:rFonts w:ascii="Times New Roman" w:hAnsi="Times New Roman"/>
+                <w:sz w:val="28"/>
+                <w:szCs w:val="28"/>
+              </w:rPr>
+              <w:t>cơ</w:t>
+            </w:r>
+            <w:proofErr w:type="spellEnd"/>
+            <w:r>
+              <w:rPr>
+                <w:rFonts w:ascii="Times New Roman" w:hAnsi="Times New Roman"/>
+                <w:sz w:val="28"/>
+                <w:szCs w:val="28"/>
+              </w:rPr>
+              <w:t xml:space="preserve"> </w:t>
+            </w:r>
+            <w:proofErr w:type="spellStart"/>
+            <w:r>
+              <w:rPr>
+                <w:rFonts w:ascii="Times New Roman" w:hAnsi="Times New Roman"/>
+                <w:sz w:val="28"/>
+                <w:szCs w:val="28"/>
+              </w:rPr>
+              <w:t>bản</w:t>
+            </w:r>
+            <w:proofErr w:type="spellEnd"/>
+            <w:r>
+              <w:rPr>
+                <w:rFonts w:ascii="Times New Roman" w:hAnsi="Times New Roman"/>
+                <w:sz w:val="28"/>
+                <w:szCs w:val="28"/>
+              </w:rPr>
+              <w:t xml:space="preserve"> </w:t>
+            </w:r>
+            <w:proofErr w:type="spellStart"/>
+            <w:r>
+              <w:rPr>
+                <w:rFonts w:ascii="Times New Roman" w:hAnsi="Times New Roman"/>
+                <w:sz w:val="28"/>
+                <w:szCs w:val="28"/>
+              </w:rPr>
+              <w:t>phía</w:t>
+            </w:r>
+            <w:proofErr w:type="spellEnd"/>
+            <w:r>
+              <w:rPr>
+                <w:rFonts w:ascii="Times New Roman" w:hAnsi="Times New Roman"/>
+                <w:sz w:val="28"/>
+                <w:szCs w:val="28"/>
+              </w:rPr>
+              <w:t xml:space="preserve"> backend: entity, DTO, data repository, REST </w:t>
+            </w:r>
+            <w:proofErr w:type="spellStart"/>
+            <w:r>
+              <w:rPr>
+                <w:rFonts w:ascii="Times New Roman" w:hAnsi="Times New Roman"/>
+                <w:sz w:val="28"/>
+                <w:szCs w:val="28"/>
+              </w:rPr>
+              <w:t>api</w:t>
+            </w:r>
+            <w:proofErr w:type="spellEnd"/>
+            <w:r>
+              <w:rPr>
+                <w:rFonts w:ascii="Times New Roman" w:hAnsi="Times New Roman"/>
+                <w:sz w:val="28"/>
+                <w:szCs w:val="28"/>
+              </w:rPr>
+              <w:t xml:space="preserve">, consuming, web </w:t>
+            </w:r>
+            <w:proofErr w:type="spellStart"/>
+            <w:r>
+              <w:rPr>
+                <w:rFonts w:ascii="Times New Roman" w:hAnsi="Times New Roman"/>
+                <w:sz w:val="28"/>
+                <w:szCs w:val="28"/>
+              </w:rPr>
+              <w:t>controller</w:t>
+            </w:r>
+            <w:proofErr w:type="gramStart"/>
+            <w:r>
+              <w:rPr>
+                <w:rFonts w:ascii="Times New Roman" w:hAnsi="Times New Roman"/>
+                <w:sz w:val="28"/>
+                <w:szCs w:val="28"/>
+              </w:rPr>
+              <w:t>,API</w:t>
+            </w:r>
+            <w:proofErr w:type="spellEnd"/>
+            <w:proofErr w:type="gramEnd"/>
+            <w:r>
+              <w:rPr>
+                <w:rFonts w:ascii="Times New Roman" w:hAnsi="Times New Roman"/>
+                <w:sz w:val="28"/>
+                <w:szCs w:val="28"/>
+              </w:rPr>
+              <w:t xml:space="preserve"> services, layout templates.</w:t>
+            </w:r>
+          </w:p>
+          <w:p>
+            <w:pPr>
+              <w:rPr>
+                <w:rFonts w:ascii="Times New Roman" w:hAnsi="Times New Roman"/>
+                <w:sz w:val="28"/>
+                <w:szCs w:val="28"/>
+              </w:rPr>
+            </w:pPr>
+            <w:proofErr w:type="spellStart"/>
+            <w:r>
+              <w:rPr>
+                <w:rFonts w:ascii="Times New Roman" w:hAnsi="Times New Roman"/>
+                <w:sz w:val="28"/>
+                <w:szCs w:val="28"/>
+              </w:rPr>
+              <w:t>Tạo</w:t>
+            </w:r>
+            <w:proofErr w:type="spellEnd"/>
+            <w:r>
+              <w:rPr>
+                <w:rFonts w:ascii="Times New Roman" w:hAnsi="Times New Roman"/>
+                <w:sz w:val="28"/>
+                <w:szCs w:val="28"/>
+              </w:rPr>
+              <w:t xml:space="preserve"> database cloud server </w:t>
+            </w:r>
+            <w:proofErr w:type="spellStart"/>
+            <w:r>
+              <w:rPr>
+                <w:rFonts w:ascii="Times New Roman" w:hAnsi="Times New Roman"/>
+                <w:sz w:val="28"/>
+                <w:szCs w:val="28"/>
+              </w:rPr>
+              <w:t>để</w:t>
+            </w:r>
+            <w:proofErr w:type="spellEnd"/>
+            <w:r>
+              <w:rPr>
+                <w:rFonts w:ascii="Times New Roman" w:hAnsi="Times New Roman"/>
+                <w:sz w:val="28"/>
+                <w:szCs w:val="28"/>
+              </w:rPr>
+              <w:t xml:space="preserve"> </w:t>
+            </w:r>
+            <w:proofErr w:type="spellStart"/>
+            <w:r>
+              <w:rPr>
+                <w:rFonts w:ascii="Times New Roman" w:hAnsi="Times New Roman"/>
+                <w:sz w:val="28"/>
+                <w:szCs w:val="28"/>
+              </w:rPr>
+              <w:t>quản</w:t>
+            </w:r>
+            <w:proofErr w:type="spellEnd"/>
+            <w:r>
+              <w:rPr>
+                <w:rFonts w:ascii="Times New Roman" w:hAnsi="Times New Roman"/>
+                <w:sz w:val="28"/>
+                <w:szCs w:val="28"/>
+              </w:rPr>
+              <w:t xml:space="preserve"> </w:t>
+            </w:r>
+            <w:proofErr w:type="spellStart"/>
+            <w:r>
+              <w:rPr>
+                <w:rFonts w:ascii="Times New Roman" w:hAnsi="Times New Roman"/>
+                <w:sz w:val="28"/>
+                <w:szCs w:val="28"/>
+              </w:rPr>
+              <w:t>lý</w:t>
+            </w:r>
+            <w:proofErr w:type="spellEnd"/>
+            <w:r>
+              <w:rPr>
+                <w:rFonts w:ascii="Times New Roman" w:hAnsi="Times New Roman"/>
+                <w:sz w:val="28"/>
+                <w:szCs w:val="28"/>
+              </w:rPr>
+              <w:t xml:space="preserve"> </w:t>
+            </w:r>
+            <w:proofErr w:type="spellStart"/>
+            <w:r>
+              <w:rPr>
+                <w:rFonts w:ascii="Times New Roman" w:hAnsi="Times New Roman"/>
+                <w:sz w:val="28"/>
+                <w:szCs w:val="28"/>
+              </w:rPr>
+              <w:t>dữ</w:t>
+            </w:r>
+            <w:proofErr w:type="spellEnd"/>
+            <w:r>
+              <w:rPr>
+                <w:rFonts w:ascii="Times New Roman" w:hAnsi="Times New Roman"/>
+                <w:sz w:val="28"/>
+                <w:szCs w:val="28"/>
+              </w:rPr>
+              <w:t xml:space="preserve"> </w:t>
+            </w:r>
+            <w:proofErr w:type="spellStart"/>
+            <w:r>
+              <w:rPr>
+                <w:rFonts w:ascii="Times New Roman" w:hAnsi="Times New Roman"/>
+                <w:sz w:val="28"/>
+                <w:szCs w:val="28"/>
+              </w:rPr>
+              <w:t>liệu</w:t>
+            </w:r>
+            <w:proofErr w:type="spellEnd"/>
+            <w:r>
+              <w:rPr>
+                <w:rFonts w:ascii="Times New Roman" w:hAnsi="Times New Roman"/>
+                <w:sz w:val="28"/>
+                <w:szCs w:val="28"/>
+              </w:rPr>
+              <w:t xml:space="preserve"> </w:t>
+            </w:r>
+            <w:proofErr w:type="spellStart"/>
+            <w:r>
+              <w:rPr>
+                <w:rFonts w:ascii="Times New Roman" w:hAnsi="Times New Roman"/>
+                <w:sz w:val="28"/>
+                <w:szCs w:val="28"/>
+              </w:rPr>
+              <w:t>với</w:t>
+            </w:r>
+            <w:proofErr w:type="spellEnd"/>
+            <w:r>
+              <w:rPr>
+                <w:rFonts w:ascii="Times New Roman" w:hAnsi="Times New Roman"/>
+                <w:sz w:val="28"/>
+                <w:szCs w:val="28"/>
+              </w:rPr>
+              <w:t xml:space="preserve"> MySQL.</w:t>
+            </w:r>
+          </w:p>
+          <w:p>
+            <w:pPr>
+              <w:rPr>
+                <w:rFonts w:ascii="Times New Roman" w:hAnsi="Times New Roman"/>
+                <w:sz w:val="28"/>
+                <w:szCs w:val="28"/>
+              </w:rPr>
+            </w:pPr>
+            <w:r>
+              <w:rPr>
+                <w:rFonts w:ascii="Times New Roman" w:hAnsi="Times New Roman"/>
+                <w:sz w:val="28"/>
+                <w:szCs w:val="28"/>
+              </w:rPr>
+              <w:lastRenderedPageBreak/>
+              <w:t xml:space="preserve">Deploy app </w:t>
+            </w:r>
+            <w:proofErr w:type="spellStart"/>
+            <w:r>
+              <w:rPr>
+                <w:rFonts w:ascii="Times New Roman" w:hAnsi="Times New Roman"/>
+                <w:sz w:val="28"/>
+                <w:szCs w:val="28"/>
+              </w:rPr>
+              <w:t>lên</w:t>
+            </w:r>
+            <w:proofErr w:type="spellEnd"/>
+            <w:r>
+              <w:rPr>
+                <w:rFonts w:ascii="Times New Roman" w:hAnsi="Times New Roman"/>
+                <w:sz w:val="28"/>
+                <w:szCs w:val="28"/>
+              </w:rPr>
+              <w:t xml:space="preserve"> AWS Cloud Server </w:t>
+            </w:r>
+            <w:proofErr w:type="spellStart"/>
+            <w:r>
+              <w:rPr>
+                <w:rFonts w:ascii="Times New Roman" w:hAnsi="Times New Roman"/>
+                <w:sz w:val="28"/>
+                <w:szCs w:val="28"/>
+              </w:rPr>
+              <w:t>để</w:t>
+            </w:r>
+            <w:proofErr w:type="spellEnd"/>
+            <w:r>
+              <w:rPr>
+                <w:rFonts w:ascii="Times New Roman" w:hAnsi="Times New Roman"/>
+                <w:sz w:val="28"/>
+                <w:szCs w:val="28"/>
+              </w:rPr>
+              <w:t xml:space="preserve"> test </w:t>
+            </w:r>
+            <w:proofErr w:type="spellStart"/>
+            <w:r>
+              <w:rPr>
+                <w:rFonts w:ascii="Times New Roman" w:hAnsi="Times New Roman"/>
+                <w:sz w:val="28"/>
+                <w:szCs w:val="28"/>
+              </w:rPr>
+              <w:t>trên</w:t>
+            </w:r>
+            <w:proofErr w:type="spellEnd"/>
+            <w:r>
+              <w:rPr>
+                <w:rFonts w:ascii="Times New Roman" w:hAnsi="Times New Roman"/>
+                <w:sz w:val="28"/>
+                <w:szCs w:val="28"/>
+              </w:rPr>
+              <w:t xml:space="preserve"> </w:t>
+            </w:r>
+            <w:proofErr w:type="spellStart"/>
+            <w:r>
+              <w:rPr>
+                <w:rFonts w:ascii="Times New Roman" w:hAnsi="Times New Roman"/>
+                <w:sz w:val="28"/>
+                <w:szCs w:val="28"/>
+              </w:rPr>
+              <w:t>môi</w:t>
+            </w:r>
+            <w:proofErr w:type="spellEnd"/>
+            <w:r>
+              <w:rPr>
+                <w:rFonts w:ascii="Times New Roman" w:hAnsi="Times New Roman"/>
+                <w:sz w:val="28"/>
+                <w:szCs w:val="28"/>
+              </w:rPr>
+              <w:t xml:space="preserve"> </w:t>
+            </w:r>
+            <w:proofErr w:type="spellStart"/>
+            <w:r>
+              <w:rPr>
+                <w:rFonts w:ascii="Times New Roman" w:hAnsi="Times New Roman"/>
+                <w:sz w:val="28"/>
+                <w:szCs w:val="28"/>
+              </w:rPr>
+              <w:t>trường</w:t>
+            </w:r>
+            <w:proofErr w:type="spellEnd"/>
+            <w:r>
+              <w:rPr>
+                <w:rFonts w:ascii="Times New Roman" w:hAnsi="Times New Roman"/>
+                <w:sz w:val="28"/>
+                <w:szCs w:val="28"/>
+              </w:rPr>
+              <w:t xml:space="preserve"> production.</w:t>
+            </w:r>
+          </w:p>
+          <w:p>
+            <w:pPr>
+              <w:rPr>
+                <w:rFonts w:ascii="Times New Roman" w:hAnsi="Times New Roman"/>
+                <w:sz w:val="28"/>
+                <w:szCs w:val="28"/>
+              </w:rPr>
+            </w:pPr>
+            <w:proofErr w:type="spellStart"/>
+            <w:r>
+              <w:rPr>
+                <w:rFonts w:ascii="Times New Roman" w:hAnsi="Times New Roman"/>
+                <w:sz w:val="28"/>
+                <w:szCs w:val="28"/>
+              </w:rPr>
+              <w:t>Sử</w:t>
+            </w:r>
+            <w:proofErr w:type="spellEnd"/>
+            <w:r>
+              <w:rPr>
+                <w:rFonts w:ascii="Times New Roman" w:hAnsi="Times New Roman"/>
+                <w:sz w:val="28"/>
+                <w:szCs w:val="28"/>
+              </w:rPr>
+              <w:t xml:space="preserve"> </w:t>
+            </w:r>
+            <w:proofErr w:type="spellStart"/>
+            <w:r>
+              <w:rPr>
+                <w:rFonts w:ascii="Times New Roman" w:hAnsi="Times New Roman"/>
+                <w:sz w:val="28"/>
+                <w:szCs w:val="28"/>
+              </w:rPr>
+              <w:t>dụng</w:t>
+            </w:r>
+            <w:proofErr w:type="spellEnd"/>
+            <w:r>
+              <w:rPr>
+                <w:rFonts w:ascii="Times New Roman" w:hAnsi="Times New Roman"/>
+                <w:sz w:val="28"/>
+                <w:szCs w:val="28"/>
+              </w:rPr>
+              <w:t xml:space="preserve"> </w:t>
+            </w:r>
+            <w:proofErr w:type="spellStart"/>
+            <w:r>
+              <w:rPr>
+                <w:rFonts w:ascii="Times New Roman" w:hAnsi="Times New Roman"/>
+                <w:sz w:val="28"/>
+                <w:szCs w:val="28"/>
+              </w:rPr>
+              <w:t>các</w:t>
+            </w:r>
+            <w:proofErr w:type="spellEnd"/>
+            <w:r>
+              <w:rPr>
+                <w:rFonts w:ascii="Times New Roman" w:hAnsi="Times New Roman"/>
+                <w:sz w:val="28"/>
+                <w:szCs w:val="28"/>
+              </w:rPr>
+              <w:t xml:space="preserve"> API </w:t>
+            </w:r>
+            <w:proofErr w:type="spellStart"/>
+            <w:r>
+              <w:rPr>
+                <w:rFonts w:ascii="Times New Roman" w:hAnsi="Times New Roman"/>
+                <w:sz w:val="28"/>
+                <w:szCs w:val="28"/>
+              </w:rPr>
+              <w:t>đã</w:t>
+            </w:r>
+            <w:proofErr w:type="spellEnd"/>
+            <w:r>
+              <w:rPr>
+                <w:rFonts w:ascii="Times New Roman" w:hAnsi="Times New Roman"/>
+                <w:sz w:val="28"/>
+                <w:szCs w:val="28"/>
+              </w:rPr>
+              <w:t xml:space="preserve"> </w:t>
+            </w:r>
+            <w:proofErr w:type="spellStart"/>
+            <w:r>
+              <w:rPr>
+                <w:rFonts w:ascii="Times New Roman" w:hAnsi="Times New Roman"/>
+                <w:sz w:val="28"/>
+                <w:szCs w:val="28"/>
+              </w:rPr>
+              <w:t>tạ</w:t>
+            </w:r>
+            <w:r>
+              <w:rPr>
+                <w:rFonts w:ascii="Times New Roman" w:hAnsi="Times New Roman"/>
+                <w:sz w:val="28"/>
+                <w:szCs w:val="28"/>
+              </w:rPr>
+              <w:t>o</w:t>
+            </w:r>
+            <w:proofErr w:type="spellEnd"/>
+            <w:r>
+              <w:rPr>
+                <w:rFonts w:ascii="Times New Roman" w:hAnsi="Times New Roman"/>
+                <w:sz w:val="28"/>
+                <w:szCs w:val="28"/>
+              </w:rPr>
+              <w:t xml:space="preserve"> </w:t>
+            </w:r>
+            <w:proofErr w:type="spellStart"/>
+            <w:r>
+              <w:rPr>
+                <w:rFonts w:ascii="Times New Roman" w:hAnsi="Times New Roman"/>
+                <w:sz w:val="28"/>
+                <w:szCs w:val="28"/>
+              </w:rPr>
+              <w:t>trong</w:t>
+            </w:r>
+            <w:proofErr w:type="spellEnd"/>
+            <w:r>
+              <w:rPr>
+                <w:rFonts w:ascii="Times New Roman" w:hAnsi="Times New Roman"/>
+                <w:sz w:val="28"/>
+                <w:szCs w:val="28"/>
+              </w:rPr>
+              <w:t xml:space="preserve"> </w:t>
+            </w:r>
+            <w:proofErr w:type="spellStart"/>
+            <w:r>
+              <w:rPr>
+                <w:rFonts w:ascii="Times New Roman" w:hAnsi="Times New Roman"/>
+                <w:sz w:val="28"/>
+                <w:szCs w:val="28"/>
+              </w:rPr>
+              <w:t>ứng</w:t>
+            </w:r>
+            <w:proofErr w:type="spellEnd"/>
+            <w:r>
+              <w:rPr>
+                <w:rFonts w:ascii="Times New Roman" w:hAnsi="Times New Roman"/>
+                <w:sz w:val="28"/>
+                <w:szCs w:val="28"/>
+              </w:rPr>
+              <w:t xml:space="preserve"> </w:t>
+            </w:r>
+            <w:proofErr w:type="spellStart"/>
+            <w:r>
+              <w:rPr>
+                <w:rFonts w:ascii="Times New Roman" w:hAnsi="Times New Roman"/>
+                <w:sz w:val="28"/>
+                <w:szCs w:val="28"/>
+              </w:rPr>
+              <w:t>dụng</w:t>
+            </w:r>
+            <w:proofErr w:type="spellEnd"/>
+            <w:r>
+              <w:rPr>
+                <w:rFonts w:ascii="Times New Roman" w:hAnsi="Times New Roman"/>
+                <w:sz w:val="28"/>
+                <w:szCs w:val="28"/>
+              </w:rPr>
+              <w:t xml:space="preserve"> Android.</w:t>
+            </w:r>
+          </w:p>
+        </w:tc>
+        <w:tc>
+          <w:tcPr>
+            <w:tcW w:w="2700" w:type="dxa"/>
+          </w:tcPr>
+          <w:p>
+            <w:pPr>
+              <w:rPr>
+                <w:rFonts w:ascii="Times New Roman" w:hAnsi="Times New Roman"/>
+                <w:sz w:val="28"/>
+                <w:szCs w:val="28"/>
+              </w:rPr>
+            </w:pPr>
+            <w:proofErr w:type="spellStart"/>
+            <w:r>
+              <w:rPr>
+                <w:rFonts w:ascii="Times New Roman" w:hAnsi="Times New Roman"/>
+                <w:sz w:val="28"/>
+                <w:szCs w:val="28"/>
+              </w:rPr>
+              <w:lastRenderedPageBreak/>
+              <w:t>Hoàn</w:t>
+            </w:r>
+            <w:proofErr w:type="spellEnd"/>
+            <w:r>
+              <w:rPr>
+                <w:rFonts w:ascii="Times New Roman" w:hAnsi="Times New Roman"/>
+                <w:sz w:val="28"/>
+                <w:szCs w:val="28"/>
+              </w:rPr>
+              <w:t xml:space="preserve"> </w:t>
+            </w:r>
+            <w:proofErr w:type="spellStart"/>
+            <w:r>
+              <w:rPr>
+                <w:rFonts w:ascii="Times New Roman" w:hAnsi="Times New Roman"/>
+                <w:sz w:val="28"/>
+                <w:szCs w:val="28"/>
+              </w:rPr>
+              <w:t>thành</w:t>
+            </w:r>
+            <w:proofErr w:type="spellEnd"/>
+          </w:p>
+          <w:p>
+            <w:pPr>
+              <w:rPr>
+                <w:rFonts w:ascii="Times New Roman" w:hAnsi="Times New Roman"/>
+                <w:sz w:val="28"/>
+                <w:szCs w:val="28"/>
+              </w:rPr>
+            </w:pPr>
+            <w:proofErr w:type="spellStart"/>
+            <w:r>
+              <w:rPr>
+                <w:rFonts w:ascii="Times New Roman" w:hAnsi="Times New Roman"/>
+                <w:sz w:val="28"/>
+                <w:szCs w:val="28"/>
+              </w:rPr>
+              <w:t>Trang</w:t>
+            </w:r>
+            <w:proofErr w:type="spellEnd"/>
+            <w:r>
+              <w:rPr>
+                <w:rFonts w:ascii="Times New Roman" w:hAnsi="Times New Roman"/>
+                <w:sz w:val="28"/>
+                <w:szCs w:val="28"/>
+              </w:rPr>
+              <w:t xml:space="preserve"> admin:</w:t>
+            </w:r>
+          </w:p>
+          <w:p>
+            <w:pPr>
+              <w:rPr>
+                <w:rFonts w:ascii="Times New Roman" w:hAnsi="Times New Roman"/>
+                <w:sz w:val="28"/>
+                <w:szCs w:val="28"/>
+              </w:rPr>
+            </w:pPr>
+            <w:hyperlink r:id="rId6" w:history="1">
+              <w:r>
+                <w:rPr>
+                  <w:rStyle w:val="Hyperlink"/>
+                  <w:rFonts w:ascii="Times New Roman" w:hAnsi="Times New Roman"/>
+                  <w:sz w:val="28"/>
+                  <w:szCs w:val="28"/>
+                </w:rPr>
+                <w:t>http://54.250.147.206:8080</w:t>
+              </w:r>
+            </w:hyperlink>
+          </w:p>
+          <w:p>
+            <w:pPr>
+              <w:rPr>
+                <w:rFonts w:ascii="Times New Roman" w:hAnsi="Times New Roman"/>
+                <w:sz w:val="28"/>
+                <w:szCs w:val="28"/>
+              </w:rPr>
+            </w:pPr>
+            <w:r>
+              <w:rPr>
+                <w:rFonts w:ascii="Times New Roman" w:hAnsi="Times New Roman"/>
+                <w:sz w:val="28"/>
+                <w:szCs w:val="28"/>
+              </w:rPr>
+              <w:t>user: 3, pass</w:t>
+            </w:r>
+            <w:bookmarkStart w:id="0" w:name="_GoBack"/>
+            <w:bookmarkEnd w:id="0"/>
+            <w:r>
+              <w:rPr>
+                <w:rFonts w:ascii="Times New Roman" w:hAnsi="Times New Roman"/>
+                <w:sz w:val="28"/>
+                <w:szCs w:val="28"/>
+              </w:rPr>
+              <w:t>word: 2</w:t>
+            </w:r>
           </w:p>
         </w:tc>
       </w:tr>
@@ -5315,8 +6232,8 @@
 </file>
 
 <file path=word/numbering.xml><?xml version="1.0" encoding="utf-8"?>
-<w:numbering xmlns:wpc="http://schemas.microsoft.com/office/word/2010/wordprocessingCanvas" xmlns:cx="http://schemas.microsoft.com/office/drawing/2014/chartex" xmlns:mc="http://schemas.openxmlformats.org/markup-compatibility/2006" xmlns:o="urn:schemas-microsoft-com:office:office" xmlns:r="http://schemas.openxmlformats.org/officeDocument/2006/relationships" xmlns:m="http://schemas.openxmlformats.org/officeDocument/2006/math" xmlns:v="urn:schemas-microsoft-com:vml" xmlns:wp14="http://schemas.microsoft.com/office/word/2010/wordprocessingDrawing" xmlns:wp="http://schemas.openxmlformats.org/drawingml/2006/wordprocessingDrawing" xmlns:w10="urn:schemas-microsoft-com:office:word" xmlns:w="http://schemas.openxmlformats.org/wordprocessingml/2006/main" xmlns:w14="http://schemas.microsoft.com/office/word/2010/wordml" xmlns:w15="http://schemas.microsoft.com/office/word/2012/wordml" xmlns:w16se="http://schemas.microsoft.com/office/word/2015/wordml/symex" xmlns:wpg="http://schemas.microsoft.com/office/word/2010/wordprocessingGroup" xmlns:wpi="http://schemas.microsoft.com/office/word/2010/wordprocessingInk" xmlns:wne="http://schemas.microsoft.com/office/word/2006/wordml" xmlns:wps="http://schemas.microsoft.com/office/word/2010/wordprocessingShape" mc:Ignorable="w14 w15 w16se wp14">
-  <w:abstractNum w:abstractNumId="0" w15:restartNumberingAfterBreak="0">
+<w:numbering xmlns:wpc="http://schemas.microsoft.com/office/word/2010/wordprocessingCanvas" xmlns:mc="http://schemas.openxmlformats.org/markup-compatibility/2006" xmlns:o="urn:schemas-microsoft-com:office:office" xmlns:r="http://schemas.openxmlformats.org/officeDocument/2006/relationships" xmlns:m="http://schemas.openxmlformats.org/officeDocument/2006/math" xmlns:v="urn:schemas-microsoft-com:vml" xmlns:wp14="http://schemas.microsoft.com/office/word/2010/wordprocessingDrawing" xmlns:wp="http://schemas.openxmlformats.org/drawingml/2006/wordprocessingDrawing" xmlns:w10="urn:schemas-microsoft-com:office:word" xmlns:w="http://schemas.openxmlformats.org/wordprocessingml/2006/main" xmlns:w14="http://schemas.microsoft.com/office/word/2010/wordml" xmlns:w15="http://schemas.microsoft.com/office/word/2012/wordml" xmlns:wpg="http://schemas.microsoft.com/office/word/2010/wordprocessingGroup" xmlns:wpi="http://schemas.microsoft.com/office/word/2010/wordprocessingInk" xmlns:wne="http://schemas.microsoft.com/office/word/2006/wordml" xmlns:wps="http://schemas.microsoft.com/office/word/2010/wordprocessingShape" mc:Ignorable="w14 w15 wp14">
+  <w:abstractNum w:abstractNumId="0">
     <w:nsid w:val="628B3D1C"/>
     <w:multiLevelType w:val="hybridMultilevel"/>
     <w:tmpl w:val="B2F2A512"/>
@@ -5435,7 +6352,7 @@
 </file>
 
 <file path=word/styles.xml><?xml version="1.0" encoding="utf-8"?>
-<w:styles xmlns:mc="http://schemas.openxmlformats.org/markup-compatibility/2006" xmlns:r="http://schemas.openxmlformats.org/officeDocument/2006/relationships" xmlns:w="http://schemas.openxmlformats.org/wordprocessingml/2006/main" xmlns:w14="http://schemas.microsoft.com/office/word/2010/wordml" xmlns:w15="http://schemas.microsoft.com/office/word/2012/wordml" xmlns:w16se="http://schemas.microsoft.com/office/word/2015/wordml/symex" mc:Ignorable="w14 w15 w16se">
+<w:styles xmlns:mc="http://schemas.openxmlformats.org/markup-compatibility/2006" xmlns:r="http://schemas.openxmlformats.org/officeDocument/2006/relationships" xmlns:w="http://schemas.openxmlformats.org/wordprocessingml/2006/main" xmlns:w14="http://schemas.microsoft.com/office/word/2010/wordml" xmlns:w15="http://schemas.microsoft.com/office/word/2012/wordml" mc:Ignorable="w14 w15">
   <w:docDefaults>
     <w:rPrDefault>
       <w:rPr>
@@ -6016,8 +6933,11 @@
     <w:tblPr>
       <w:tblStyleRowBandSize w:val="1"/>
       <w:tblStyleColBandSize w:val="1"/>
+      <w:tblInd w:w="0" w:type="dxa"/>
       <w:tblCellMar>
+        <w:top w:w="0" w:type="dxa"/>
         <w:left w:w="115" w:type="dxa"/>
+        <w:bottom w:w="0" w:type="dxa"/>
         <w:right w:w="115" w:type="dxa"/>
       </w:tblCellMar>
     </w:tblPr>
@@ -6027,8 +6947,11 @@
     <w:tblPr>
       <w:tblStyleRowBandSize w:val="1"/>
       <w:tblStyleColBandSize w:val="1"/>
+      <w:tblInd w:w="0" w:type="dxa"/>
       <w:tblCellMar>
+        <w:top w:w="0" w:type="dxa"/>
         <w:left w:w="115" w:type="dxa"/>
+        <w:bottom w:w="0" w:type="dxa"/>
         <w:right w:w="115" w:type="dxa"/>
       </w:tblCellMar>
     </w:tblPr>
@@ -6053,6 +6976,7 @@
       <w:spacing w:after="0" w:line="240" w:lineRule="auto"/>
     </w:pPr>
     <w:tblPr>
+      <w:tblInd w:w="0" w:type="dxa"/>
       <w:tblBorders>
         <w:top w:val="single" w:sz="4" w:space="0" w:color="auto"/>
         <w:left w:val="single" w:sz="4" w:space="0" w:color="auto"/>
@@ -6061,7 +6985,24 @@
         <w:insideH w:val="single" w:sz="4" w:space="0" w:color="auto"/>
         <w:insideV w:val="single" w:sz="4" w:space="0" w:color="auto"/>
       </w:tblBorders>
+      <w:tblCellMar>
+        <w:top w:w="0" w:type="dxa"/>
+        <w:left w:w="108" w:type="dxa"/>
+        <w:bottom w:w="0" w:type="dxa"/>
+        <w:right w:w="108" w:type="dxa"/>
+      </w:tblCellMar>
     </w:tblPr>
+  </w:style>
+  <w:style w:type="character" w:styleId="Hyperlink">
+    <w:name w:val="Hyperlink"/>
+    <w:basedOn w:val="DefaultParagraphFont"/>
+    <w:uiPriority w:val="99"/>
+    <w:unhideWhenUsed/>
+    <w:rsid w:val="0086787E"/>
+    <w:rPr>
+      <w:color w:val="0563C1" w:themeColor="hyperlink"/>
+      <w:u w:val="single"/>
+    </w:rPr>
   </w:style>
 </w:styles>
 </file>

</xml_diff>